<commit_message>
feat(telegram): native gpt-oss streaming (sendRichMessageDraft), outreach formatting parity, modern sendPoll, checklist polish
</commit_message>
<xml_diff>
--- a/docs/Eukara_Architecture_Proposed_vs_Current.docx
+++ b/docs/Eukara_Architecture_Proposed_vs_Current.docx
@@ -63,7 +63,7 @@
     </w:p>
     <w:tbl>
       <w:tblPr>
-        <w:tblW w:type="dxa" w:w="10080"/>
+        <w:tblW w:type="dxa" w:w="14400"/>
         <w:tblBorders>
           <w:top w:val="single" w:color="auto" w:sz="4"/>
           <w:left w:val="single" w:color="auto" w:sz="4"/>
@@ -74,13 +74,13 @@
         </w:tblBorders>
       </w:tblPr>
       <w:tblGrid>
-        <w:gridCol w:w="2520"/>
-        <w:gridCol w:w="7560"/>
+        <w:gridCol w:w="3500"/>
+        <w:gridCol w:w="10900"/>
       </w:tblGrid>
       <w:tr>
         <w:tc>
           <w:tcPr>
-            <w:tcW w:type="dxa" w:w="2520"/>
+            <w:tcW w:type="dxa" w:w="3500"/>
             <w:tcBorders>
               <w:top w:val="single" w:color="CFCFCF" w:sz="2"/>
               <w:left w:val="single" w:color="CFCFCF" w:sz="2"/>
@@ -114,7 +114,7 @@
         </w:tc>
         <w:tc>
           <w:tcPr>
-            <w:tcW w:type="dxa" w:w="7560"/>
+            <w:tcW w:type="dxa" w:w="10900"/>
             <w:tcBorders>
               <w:top w:val="single" w:color="CFCFCF" w:sz="2"/>
               <w:left w:val="single" w:color="CFCFCF" w:sz="2"/>
@@ -147,7 +147,7 @@
       <w:tr>
         <w:tc>
           <w:tcPr>
-            <w:tcW w:type="dxa" w:w="2520"/>
+            <w:tcW w:type="dxa" w:w="3500"/>
             <w:tcBorders>
               <w:top w:val="single" w:color="CFCFCF" w:sz="2"/>
               <w:left w:val="single" w:color="CFCFCF" w:sz="2"/>
@@ -181,7 +181,7 @@
         </w:tc>
         <w:tc>
           <w:tcPr>
-            <w:tcW w:type="dxa" w:w="7560"/>
+            <w:tcW w:type="dxa" w:w="10900"/>
             <w:tcBorders>
               <w:top w:val="single" w:color="CFCFCF" w:sz="2"/>
               <w:left w:val="single" w:color="CFCFCF" w:sz="2"/>
@@ -214,7 +214,7 @@
       <w:tr>
         <w:tc>
           <w:tcPr>
-            <w:tcW w:type="dxa" w:w="2520"/>
+            <w:tcW w:type="dxa" w:w="3500"/>
             <w:tcBorders>
               <w:top w:val="single" w:color="CFCFCF" w:sz="2"/>
               <w:left w:val="single" w:color="CFCFCF" w:sz="2"/>
@@ -248,7 +248,7 @@
         </w:tc>
         <w:tc>
           <w:tcPr>
-            <w:tcW w:type="dxa" w:w="7560"/>
+            <w:tcW w:type="dxa" w:w="10900"/>
             <w:tcBorders>
               <w:top w:val="single" w:color="CFCFCF" w:sz="2"/>
               <w:left w:val="single" w:color="CFCFCF" w:sz="2"/>
@@ -281,7 +281,7 @@
       <w:tr>
         <w:tc>
           <w:tcPr>
-            <w:tcW w:type="dxa" w:w="2520"/>
+            <w:tcW w:type="dxa" w:w="3500"/>
             <w:tcBorders>
               <w:top w:val="single" w:color="CFCFCF" w:sz="2"/>
               <w:left w:val="single" w:color="CFCFCF" w:sz="2"/>
@@ -315,7 +315,7 @@
         </w:tc>
         <w:tc>
           <w:tcPr>
-            <w:tcW w:type="dxa" w:w="7560"/>
+            <w:tcW w:type="dxa" w:w="10900"/>
             <w:tcBorders>
               <w:top w:val="single" w:color="CFCFCF" w:sz="2"/>
               <w:left w:val="single" w:color="CFCFCF" w:sz="2"/>
@@ -373,7 +373,7 @@
     </w:p>
     <w:tbl>
       <w:tblPr>
-        <w:tblW w:type="dxa" w:w="10080"/>
+        <w:tblW w:type="dxa" w:w="14400"/>
         <w:tblBorders>
           <w:top w:val="single" w:color="auto" w:sz="4"/>
           <w:left w:val="single" w:color="auto" w:sz="4"/>
@@ -384,16 +384,16 @@
         </w:tblBorders>
       </w:tblPr>
       <w:tblGrid>
-        <w:gridCol w:w="2520"/>
-        <w:gridCol w:w="1890"/>
-        <w:gridCol w:w="1890"/>
-        <w:gridCol w:w="1890"/>
-        <w:gridCol w:w="1890"/>
+        <w:gridCol w:w="3780"/>
+        <w:gridCol w:w="2655"/>
+        <w:gridCol w:w="2655"/>
+        <w:gridCol w:w="2655"/>
+        <w:gridCol w:w="2655"/>
       </w:tblGrid>
       <w:tr>
         <w:tc>
           <w:tcPr>
-            <w:tcW w:type="dxa" w:w="2520"/>
+            <w:tcW w:type="dxa" w:w="3780"/>
             <w:tcBorders>
               <w:top w:val="single" w:color="CFCFCF" w:sz="2"/>
               <w:left w:val="single" w:color="CFCFCF" w:sz="2"/>
@@ -428,7 +428,7 @@
         </w:tc>
         <w:tc>
           <w:tcPr>
-            <w:tcW w:type="dxa" w:w="1890"/>
+            <w:tcW w:type="dxa" w:w="2655"/>
             <w:tcBorders>
               <w:top w:val="single" w:color="CFCFCF" w:sz="2"/>
               <w:left w:val="single" w:color="CFCFCF" w:sz="2"/>
@@ -463,7 +463,7 @@
         </w:tc>
         <w:tc>
           <w:tcPr>
-            <w:tcW w:type="dxa" w:w="1890"/>
+            <w:tcW w:type="dxa" w:w="2655"/>
             <w:tcBorders>
               <w:top w:val="single" w:color="CFCFCF" w:sz="2"/>
               <w:left w:val="single" w:color="CFCFCF" w:sz="2"/>
@@ -498,7 +498,7 @@
         </w:tc>
         <w:tc>
           <w:tcPr>
-            <w:tcW w:type="dxa" w:w="1890"/>
+            <w:tcW w:type="dxa" w:w="2655"/>
             <w:tcBorders>
               <w:top w:val="single" w:color="CFCFCF" w:sz="2"/>
               <w:left w:val="single" w:color="CFCFCF" w:sz="2"/>
@@ -533,7 +533,7 @@
         </w:tc>
         <w:tc>
           <w:tcPr>
-            <w:tcW w:type="dxa" w:w="1890"/>
+            <w:tcW w:type="dxa" w:w="2655"/>
             <w:tcBorders>
               <w:top w:val="single" w:color="CFCFCF" w:sz="2"/>
               <w:left w:val="single" w:color="CFCFCF" w:sz="2"/>
@@ -570,7 +570,7 @@
       <w:tr>
         <w:tc>
           <w:tcPr>
-            <w:tcW w:type="dxa" w:w="2520"/>
+            <w:tcW w:type="dxa" w:w="3780"/>
             <w:tcBorders>
               <w:top w:val="single" w:color="CFCFCF" w:sz="2"/>
               <w:left w:val="single" w:color="CFCFCF" w:sz="2"/>
@@ -604,7 +604,7 @@
         </w:tc>
         <w:tc>
           <w:tcPr>
-            <w:tcW w:type="dxa" w:w="1890"/>
+            <w:tcW w:type="dxa" w:w="2655"/>
             <w:tcBorders>
               <w:top w:val="single" w:color="CFCFCF" w:sz="2"/>
               <w:left w:val="single" w:color="CFCFCF" w:sz="2"/>
@@ -639,7 +639,7 @@
         </w:tc>
         <w:tc>
           <w:tcPr>
-            <w:tcW w:type="dxa" w:w="1890"/>
+            <w:tcW w:type="dxa" w:w="2655"/>
             <w:tcBorders>
               <w:top w:val="single" w:color="CFCFCF" w:sz="2"/>
               <w:left w:val="single" w:color="CFCFCF" w:sz="2"/>
@@ -674,7 +674,7 @@
         </w:tc>
         <w:tc>
           <w:tcPr>
-            <w:tcW w:type="dxa" w:w="1890"/>
+            <w:tcW w:type="dxa" w:w="2655"/>
             <w:tcBorders>
               <w:top w:val="single" w:color="CFCFCF" w:sz="2"/>
               <w:left w:val="single" w:color="CFCFCF" w:sz="2"/>
@@ -709,7 +709,7 @@
         </w:tc>
         <w:tc>
           <w:tcPr>
-            <w:tcW w:type="dxa" w:w="1890"/>
+            <w:tcW w:type="dxa" w:w="2655"/>
             <w:tcBorders>
               <w:top w:val="single" w:color="CFCFCF" w:sz="2"/>
               <w:left w:val="single" w:color="CFCFCF" w:sz="2"/>
@@ -766,7 +766,7 @@
     </w:p>
     <w:tbl>
       <w:tblPr>
-        <w:tblW w:type="dxa" w:w="10080"/>
+        <w:tblW w:type="dxa" w:w="14400"/>
         <w:tblBorders>
           <w:top w:val="single" w:color="auto" w:sz="4"/>
           <w:left w:val="single" w:color="auto" w:sz="4"/>
@@ -777,10 +777,12 @@
         </w:tblBorders>
       </w:tblPr>
       <w:tblGrid>
-        <w:gridCol w:w="1440"/>
-        <w:gridCol w:w="2820"/>
-        <w:gridCol w:w="4220"/>
-        <w:gridCol w:w="1600"/>
+        <w:gridCol w:w="1450"/>
+        <w:gridCol w:w="1700"/>
+        <w:gridCol w:w="2050"/>
+        <w:gridCol w:w="2450"/>
+        <w:gridCol w:w="5350"/>
+        <w:gridCol w:w="1400"/>
       </w:tblGrid>
       <w:tr>
         <w:trPr>
@@ -788,7 +790,7 @@
         </w:trPr>
         <w:tc>
           <w:tcPr>
-            <w:tcW w:type="dxa" w:w="1440"/>
+            <w:tcW w:type="dxa" w:w="1450"/>
             <w:tcBorders>
               <w:top w:val="single" w:color="CFCFCF" w:sz="2"/>
               <w:left w:val="single" w:color="CFCFCF" w:sz="2"/>
@@ -823,7 +825,7 @@
         </w:tc>
         <w:tc>
           <w:tcPr>
-            <w:tcW w:type="dxa" w:w="2820"/>
+            <w:tcW w:type="dxa" w:w="1700"/>
             <w:tcBorders>
               <w:top w:val="single" w:color="CFCFCF" w:sz="2"/>
               <w:left w:val="single" w:color="CFCFCF" w:sz="2"/>
@@ -852,13 +854,13 @@
                 <w:sz w:val="20"/>
                 <w:szCs w:val="20"/>
               </w:rPr>
-              <w:t xml:space="preserve">Proposed design</w:t>
-            </w:r>
-          </w:p>
-        </w:tc>
-        <w:tc>
-          <w:tcPr>
-            <w:tcW w:type="dxa" w:w="4220"/>
+              <w:t xml:space="preserve">Proposed model(s)</w:t>
+            </w:r>
+          </w:p>
+        </w:tc>
+        <w:tc>
+          <w:tcPr>
+            <w:tcW w:type="dxa" w:w="2050"/>
             <w:tcBorders>
               <w:top w:val="single" w:color="CFCFCF" w:sz="2"/>
               <w:left w:val="single" w:color="CFCFCF" w:sz="2"/>
@@ -887,13 +889,13 @@
                 <w:sz w:val="20"/>
                 <w:szCs w:val="20"/>
               </w:rPr>
-              <w:t xml:space="preserve">Current reality (verified in code)</w:t>
-            </w:r>
-          </w:p>
-        </w:tc>
-        <w:tc>
-          <w:tcPr>
-            <w:tcW w:type="dxa" w:w="1600"/>
+              <w:t xml:space="preserve">Current model(s)</w:t>
+            </w:r>
+          </w:p>
+        </w:tc>
+        <w:tc>
+          <w:tcPr>
+            <w:tcW w:type="dxa" w:w="2450"/>
             <w:tcBorders>
               <w:top w:val="single" w:color="CFCFCF" w:sz="2"/>
               <w:left w:val="single" w:color="CFCFCF" w:sz="2"/>
@@ -922,6 +924,76 @@
                 <w:sz w:val="20"/>
                 <w:szCs w:val="20"/>
               </w:rPr>
+              <w:t xml:space="preserve">Recommended (Cloudflare, Jul 2026)</w:t>
+            </w:r>
+          </w:p>
+        </w:tc>
+        <w:tc>
+          <w:tcPr>
+            <w:tcW w:type="dxa" w:w="5350"/>
+            <w:tcBorders>
+              <w:top w:val="single" w:color="CFCFCF" w:sz="2"/>
+              <w:left w:val="single" w:color="CFCFCF" w:sz="2"/>
+              <w:bottom w:val="single" w:color="CFCFCF" w:sz="2"/>
+              <w:right w:val="single" w:color="CFCFCF" w:sz="2"/>
+            </w:tcBorders>
+            <w:shd w:fill="1F3864" w:val="clear"/>
+            <w:tcMar>
+              <w:top w:type="dxa" w:w="100"/>
+              <w:left w:type="dxa" w:w="140"/>
+              <w:bottom w:type="dxa" w:w="100"/>
+              <w:right w:type="dxa" w:w="140"/>
+            </w:tcMar>
+            <w:vAlign w:val="top"/>
+          </w:tcPr>
+          <w:p>
+            <w:pPr>
+              <w:spacing w:after="60" w:before="0"/>
+            </w:pPr>
+            <w:r>
+              <w:rPr>
+                <w:rFonts w:ascii="Arial" w:cs="Arial" w:eastAsia="Arial" w:hAnsi="Arial"/>
+                <w:b/>
+                <w:bCs/>
+                <w:color w:val="FFFFFF"/>
+                <w:sz w:val="20"/>
+                <w:szCs w:val="20"/>
+              </w:rPr>
+              <w:t xml:space="preserve">Notes — mechanism &amp; citations</w:t>
+            </w:r>
+          </w:p>
+        </w:tc>
+        <w:tc>
+          <w:tcPr>
+            <w:tcW w:type="dxa" w:w="1400"/>
+            <w:tcBorders>
+              <w:top w:val="single" w:color="CFCFCF" w:sz="2"/>
+              <w:left w:val="single" w:color="CFCFCF" w:sz="2"/>
+              <w:bottom w:val="single" w:color="CFCFCF" w:sz="2"/>
+              <w:right w:val="single" w:color="CFCFCF" w:sz="2"/>
+            </w:tcBorders>
+            <w:shd w:fill="1F3864" w:val="clear"/>
+            <w:tcMar>
+              <w:top w:type="dxa" w:w="100"/>
+              <w:left w:type="dxa" w:w="140"/>
+              <w:bottom w:type="dxa" w:w="100"/>
+              <w:right w:type="dxa" w:w="140"/>
+            </w:tcMar>
+            <w:vAlign w:val="top"/>
+          </w:tcPr>
+          <w:p>
+            <w:pPr>
+              <w:spacing w:after="60" w:before="0"/>
+            </w:pPr>
+            <w:r>
+              <w:rPr>
+                <w:rFonts w:ascii="Arial" w:cs="Arial" w:eastAsia="Arial" w:hAnsi="Arial"/>
+                <w:b/>
+                <w:bCs/>
+                <w:color w:val="FFFFFF"/>
+                <w:sz w:val="20"/>
+                <w:szCs w:val="20"/>
+              </w:rPr>
               <w:t xml:space="preserve">Status</w:t>
             </w:r>
           </w:p>
@@ -930,7 +1002,7 @@
       <w:tr>
         <w:tc>
           <w:tcPr>
-            <w:tcW w:type="dxa" w:w="1440"/>
+            <w:tcW w:type="dxa" w:w="1450"/>
             <w:tcBorders>
               <w:top w:val="single" w:color="CFCFCF" w:sz="2"/>
               <w:left w:val="single" w:color="CFCFCF" w:sz="2"/>
@@ -965,21 +1037,137 @@
         </w:tc>
         <w:tc>
           <w:tcPr>
-            <w:tcW w:type="dxa" w:w="2820"/>
-            <w:tcBorders>
-              <w:top w:val="single" w:color="CFCFCF" w:sz="2"/>
-              <w:left w:val="single" w:color="CFCFCF" w:sz="2"/>
-              <w:bottom w:val="single" w:color="CFCFCF" w:sz="2"/>
-              <w:right w:val="single" w:color="CFCFCF" w:sz="2"/>
-            </w:tcBorders>
-            <w:tcMar>
-              <w:top w:type="dxa" w:w="100"/>
-              <w:left w:type="dxa" w:w="140"/>
-              <w:bottom w:type="dxa" w:w="100"/>
-              <w:right w:type="dxa" w:w="140"/>
-            </w:tcMar>
-            <w:vAlign w:val="top"/>
-          </w:tcPr>
+            <w:tcW w:type="dxa" w:w="1700"/>
+            <w:tcBorders>
+              <w:top w:val="single" w:color="CFCFCF" w:sz="2"/>
+              <w:left w:val="single" w:color="CFCFCF" w:sz="2"/>
+              <w:bottom w:val="single" w:color="CFCFCF" w:sz="2"/>
+              <w:right w:val="single" w:color="CFCFCF" w:sz="2"/>
+            </w:tcBorders>
+            <w:shd w:fill="F7F2E8" w:val="clear"/>
+            <w:tcMar>
+              <w:top w:type="dxa" w:w="100"/>
+              <w:left w:type="dxa" w:w="140"/>
+              <w:bottom w:type="dxa" w:w="100"/>
+              <w:right w:type="dxa" w:w="140"/>
+            </w:tcMar>
+            <w:vAlign w:val="top"/>
+          </w:tcPr>
+          <w:p>
+            <w:pPr>
+              <w:spacing w:after="60" w:before="0"/>
+            </w:pPr>
+            <w:r>
+              <w:rPr>
+                <w:rFonts w:ascii="Arial" w:cs="Arial" w:eastAsia="Arial" w:hAnsi="Arial"/>
+                <w:i/>
+                <w:iCs/>
+                <w:sz w:val="17"/>
+                <w:szCs w:val="17"/>
+              </w:rPr>
+              <w:t xml:space="preserve">Not specified — proposal calls for no LLM here (“handled natively via database lookup queries and code”).</w:t>
+            </w:r>
+          </w:p>
+        </w:tc>
+        <w:tc>
+          <w:tcPr>
+            <w:tcW w:type="dxa" w:w="2050"/>
+            <w:tcBorders>
+              <w:top w:val="single" w:color="CFCFCF" w:sz="2"/>
+              <w:left w:val="single" w:color="CFCFCF" w:sz="2"/>
+              <w:bottom w:val="single" w:color="CFCFCF" w:sz="2"/>
+              <w:right w:val="single" w:color="CFCFCF" w:sz="2"/>
+            </w:tcBorders>
+            <w:shd w:fill="EAF1F8" w:val="clear"/>
+            <w:tcMar>
+              <w:top w:type="dxa" w:w="100"/>
+              <w:left w:type="dxa" w:w="140"/>
+              <w:bottom w:type="dxa" w:w="100"/>
+              <w:right w:type="dxa" w:w="140"/>
+            </w:tcMar>
+            <w:vAlign w:val="top"/>
+          </w:tcPr>
+          <w:p>
+            <w:pPr>
+              <w:spacing w:after="60" w:before="0"/>
+            </w:pPr>
+            <w:r>
+              <w:rPr>
+                <w:rFonts w:ascii="Arial" w:cs="Arial" w:eastAsia="Arial" w:hAnsi="Arial"/>
+                <w:i/>
+                <w:iCs/>
+                <w:sz w:val="17"/>
+                <w:szCs w:val="17"/>
+              </w:rPr>
+              <w:t xml:space="preserve">None — plain KV read, no model call.</w:t>
+            </w:r>
+          </w:p>
+        </w:tc>
+        <w:tc>
+          <w:tcPr>
+            <w:tcW w:type="dxa" w:w="2450"/>
+            <w:tcBorders>
+              <w:top w:val="single" w:color="CFCFCF" w:sz="2"/>
+              <w:left w:val="single" w:color="CFCFCF" w:sz="2"/>
+              <w:bottom w:val="single" w:color="CFCFCF" w:sz="2"/>
+              <w:right w:val="single" w:color="CFCFCF" w:sz="2"/>
+            </w:tcBorders>
+            <w:shd w:fill="E3F0DE" w:val="clear"/>
+            <w:tcMar>
+              <w:top w:type="dxa" w:w="100"/>
+              <w:left w:type="dxa" w:w="140"/>
+              <w:bottom w:type="dxa" w:w="100"/>
+              <w:right w:type="dxa" w:w="140"/>
+            </w:tcMar>
+            <w:vAlign w:val="top"/>
+          </w:tcPr>
+          <w:p>
+            <w:pPr>
+              <w:spacing w:after="60" w:before="0"/>
+            </w:pPr>
+            <w:r>
+              <w:rPr>
+                <w:rFonts w:ascii="Arial" w:cs="Arial" w:eastAsia="Arial" w:hAnsi="Arial"/>
+                <w:sz w:val="17"/>
+                <w:szCs w:val="17"/>
+              </w:rPr>
+              <w:t xml:space="preserve">No model needed. The proposal’s own design calls for deterministic code here — keep it as plain KV/D1 reads if a real prefilter is ever built.</w:t>
+            </w:r>
+          </w:p>
+        </w:tc>
+        <w:tc>
+          <w:tcPr>
+            <w:tcW w:type="dxa" w:w="5350"/>
+            <w:tcBorders>
+              <w:top w:val="single" w:color="CFCFCF" w:sz="2"/>
+              <w:left w:val="single" w:color="CFCFCF" w:sz="2"/>
+              <w:bottom w:val="single" w:color="CFCFCF" w:sz="2"/>
+              <w:right w:val="single" w:color="CFCFCF" w:sz="2"/>
+            </w:tcBorders>
+            <w:tcMar>
+              <w:top w:type="dxa" w:w="100"/>
+              <w:left w:type="dxa" w:w="140"/>
+              <w:bottom w:type="dxa" w:w="100"/>
+              <w:right w:type="dxa" w:w="140"/>
+            </w:tcMar>
+            <w:vAlign w:val="top"/>
+          </w:tcPr>
+          <w:p>
+            <w:pPr>
+              <w:spacing w:after="20" w:before="0"/>
+            </w:pPr>
+            <w:r>
+              <w:rPr>
+                <w:rFonts w:ascii="Arial" w:cs="Arial" w:eastAsia="Arial" w:hAnsi="Arial"/>
+                <w:b/>
+                <w:bCs/>
+                <w:color w:val="8A6D1D"/>
+                <w:sz w:val="17"/>
+                <w:szCs w:val="17"/>
+              </w:rPr>
+              <w:t xml:space="preserve">Proposed</w:t>
+            </w:r>
+          </w:p>
           <w:p>
             <w:pPr>
               <w:spacing w:after="60" w:before="0"/>
@@ -993,24 +1181,22 @@
               <w:t xml:space="preserve">A database trigger injects a “Style Card”, the last 3 factual triples, and the active mood score into the prompt metadata before routing runs.</w:t>
             </w:r>
           </w:p>
-        </w:tc>
-        <w:tc>
-          <w:tcPr>
-            <w:tcW w:type="dxa" w:w="4220"/>
-            <w:tcBorders>
-              <w:top w:val="single" w:color="CFCFCF" w:sz="2"/>
-              <w:left w:val="single" w:color="CFCFCF" w:sz="2"/>
-              <w:bottom w:val="single" w:color="CFCFCF" w:sz="2"/>
-              <w:right w:val="single" w:color="CFCFCF" w:sz="2"/>
-            </w:tcBorders>
-            <w:tcMar>
-              <w:top w:type="dxa" w:w="100"/>
-              <w:left w:type="dxa" w:w="140"/>
-              <w:bottom w:type="dxa" w:w="100"/>
-              <w:right w:type="dxa" w:w="140"/>
-            </w:tcMar>
-            <w:vAlign w:val="top"/>
-          </w:tcPr>
+          <w:p>
+            <w:pPr>
+              <w:spacing w:after="20" w:before="40"/>
+            </w:pPr>
+            <w:r>
+              <w:rPr>
+                <w:rFonts w:ascii="Arial" w:cs="Arial" w:eastAsia="Arial" w:hAnsi="Arial"/>
+                <w:b/>
+                <w:bCs/>
+                <w:color w:val="1F4E79"/>
+                <w:sz w:val="17"/>
+                <w:szCs w:val="17"/>
+              </w:rPr>
+              <w:t xml:space="preserve">Current</w:t>
+            </w:r>
+          </w:p>
           <w:p>
             <w:pPr>
               <w:spacing w:after="60" w:before="0"/>
@@ -1066,7 +1252,7 @@
         </w:tc>
         <w:tc>
           <w:tcPr>
-            <w:tcW w:type="dxa" w:w="1600"/>
+            <w:tcW w:type="dxa" w:w="1400"/>
             <w:tcBorders>
               <w:top w:val="single" w:color="CFCFCF" w:sz="2"/>
               <w:left w:val="single" w:color="CFCFCF" w:sz="2"/>
@@ -1103,7 +1289,7 @@
       <w:tr>
         <w:tc>
           <w:tcPr>
-            <w:tcW w:type="dxa" w:w="1440"/>
+            <w:tcW w:type="dxa" w:w="1450"/>
             <w:tcBorders>
               <w:top w:val="single" w:color="CFCFCF" w:sz="2"/>
               <w:left w:val="single" w:color="CFCFCF" w:sz="2"/>
@@ -1138,21 +1324,137 @@
         </w:tc>
         <w:tc>
           <w:tcPr>
-            <w:tcW w:type="dxa" w:w="2820"/>
-            <w:tcBorders>
-              <w:top w:val="single" w:color="CFCFCF" w:sz="2"/>
-              <w:left w:val="single" w:color="CFCFCF" w:sz="2"/>
-              <w:bottom w:val="single" w:color="CFCFCF" w:sz="2"/>
-              <w:right w:val="single" w:color="CFCFCF" w:sz="2"/>
-            </w:tcBorders>
-            <w:tcMar>
-              <w:top w:type="dxa" w:w="100"/>
-              <w:left w:type="dxa" w:w="140"/>
-              <w:bottom w:type="dxa" w:w="100"/>
-              <w:right w:type="dxa" w:w="140"/>
-            </w:tcMar>
-            <w:vAlign w:val="top"/>
-          </w:tcPr>
+            <w:tcW w:type="dxa" w:w="1700"/>
+            <w:tcBorders>
+              <w:top w:val="single" w:color="CFCFCF" w:sz="2"/>
+              <w:left w:val="single" w:color="CFCFCF" w:sz="2"/>
+              <w:bottom w:val="single" w:color="CFCFCF" w:sz="2"/>
+              <w:right w:val="single" w:color="CFCFCF" w:sz="2"/>
+            </w:tcBorders>
+            <w:shd w:fill="F7F2E8" w:val="clear"/>
+            <w:tcMar>
+              <w:top w:type="dxa" w:w="100"/>
+              <w:left w:type="dxa" w:w="140"/>
+              <w:bottom w:type="dxa" w:w="100"/>
+              <w:right w:type="dxa" w:w="140"/>
+            </w:tcMar>
+            <w:vAlign w:val="top"/>
+          </w:tcPr>
+          <w:p>
+            <w:pPr>
+              <w:spacing w:after="60" w:before="0"/>
+            </w:pPr>
+            <w:r>
+              <w:rPr>
+                <w:rFonts w:ascii="Arial" w:cs="Arial" w:eastAsia="Arial" w:hAnsi="Arial"/>
+                <w:i/>
+                <w:iCs/>
+                <w:sz w:val="17"/>
+                <w:szCs w:val="17"/>
+              </w:rPr>
+              <w:t xml:space="preserve">Not specified (Tier 1 / Tier 2 left blank in the proposal).</w:t>
+            </w:r>
+          </w:p>
+        </w:tc>
+        <w:tc>
+          <w:tcPr>
+            <w:tcW w:type="dxa" w:w="2050"/>
+            <w:tcBorders>
+              <w:top w:val="single" w:color="CFCFCF" w:sz="2"/>
+              <w:left w:val="single" w:color="CFCFCF" w:sz="2"/>
+              <w:bottom w:val="single" w:color="CFCFCF" w:sz="2"/>
+              <w:right w:val="single" w:color="CFCFCF" w:sz="2"/>
+            </w:tcBorders>
+            <w:shd w:fill="EAF1F8" w:val="clear"/>
+            <w:tcMar>
+              <w:top w:type="dxa" w:w="100"/>
+              <w:left w:type="dxa" w:w="140"/>
+              <w:bottom w:type="dxa" w:w="100"/>
+              <w:right w:type="dxa" w:w="140"/>
+            </w:tcMar>
+            <w:vAlign w:val="top"/>
+          </w:tcPr>
+          <w:p>
+            <w:pPr>
+              <w:spacing w:after="60" w:before="0"/>
+            </w:pPr>
+            <w:r>
+              <w:rPr>
+                <w:rFonts w:ascii="Arial" w:cs="Arial" w:eastAsia="Arial" w:hAnsi="Arial"/>
+                <w:i/>
+                <w:iCs/>
+                <w:sz w:val="17"/>
+                <w:szCs w:val="17"/>
+              </w:rPr>
+              <w:t xml:space="preserve">@cf/meta/llama-3.2-3b-instruct (single tier only)</w:t>
+            </w:r>
+          </w:p>
+        </w:tc>
+        <w:tc>
+          <w:tcPr>
+            <w:tcW w:type="dxa" w:w="2450"/>
+            <w:tcBorders>
+              <w:top w:val="single" w:color="CFCFCF" w:sz="2"/>
+              <w:left w:val="single" w:color="CFCFCF" w:sz="2"/>
+              <w:bottom w:val="single" w:color="CFCFCF" w:sz="2"/>
+              <w:right w:val="single" w:color="CFCFCF" w:sz="2"/>
+            </w:tcBorders>
+            <w:shd w:fill="E3F0DE" w:val="clear"/>
+            <w:tcMar>
+              <w:top w:type="dxa" w:w="100"/>
+              <w:left w:type="dxa" w:w="140"/>
+              <w:bottom w:type="dxa" w:w="100"/>
+              <w:right w:type="dxa" w:w="140"/>
+            </w:tcMar>
+            <w:vAlign w:val="top"/>
+          </w:tcPr>
+          <w:p>
+            <w:pPr>
+              <w:spacing w:after="60" w:before="0"/>
+            </w:pPr>
+            <w:r>
+              <w:rPr>
+                <w:rFonts w:ascii="Arial" w:cs="Arial" w:eastAsia="Arial" w:hAnsi="Arial"/>
+                <w:sz w:val="17"/>
+                <w:szCs w:val="17"/>
+              </w:rPr>
+              <w:t xml:space="preserve">Keep llama-3.2-3b-instruct for cost/speed — still current, not on Cloudflare’s deprecation list. If triage accuracy on non-English input becomes an issue, benchmark @cf/zai-org/glm-4.7-flash (131k context, built for fast multilingual dialogue + tool calling).</w:t>
+            </w:r>
+          </w:p>
+        </w:tc>
+        <w:tc>
+          <w:tcPr>
+            <w:tcW w:type="dxa" w:w="5350"/>
+            <w:tcBorders>
+              <w:top w:val="single" w:color="CFCFCF" w:sz="2"/>
+              <w:left w:val="single" w:color="CFCFCF" w:sz="2"/>
+              <w:bottom w:val="single" w:color="CFCFCF" w:sz="2"/>
+              <w:right w:val="single" w:color="CFCFCF" w:sz="2"/>
+            </w:tcBorders>
+            <w:tcMar>
+              <w:top w:type="dxa" w:w="100"/>
+              <w:left w:type="dxa" w:w="140"/>
+              <w:bottom w:type="dxa" w:w="100"/>
+              <w:right w:type="dxa" w:w="140"/>
+            </w:tcMar>
+            <w:vAlign w:val="top"/>
+          </w:tcPr>
+          <w:p>
+            <w:pPr>
+              <w:spacing w:after="20" w:before="0"/>
+            </w:pPr>
+            <w:r>
+              <w:rPr>
+                <w:rFonts w:ascii="Arial" w:cs="Arial" w:eastAsia="Arial" w:hAnsi="Arial"/>
+                <w:b/>
+                <w:bCs/>
+                <w:color w:val="8A6D1D"/>
+                <w:sz w:val="17"/>
+                <w:szCs w:val="17"/>
+              </w:rPr>
+              <w:t xml:space="preserve">Proposed</w:t>
+            </w:r>
+          </w:p>
           <w:p>
             <w:pPr>
               <w:spacing w:after="60" w:before="0"/>
@@ -1179,24 +1481,22 @@
               <w:t xml:space="preserve">Two-tier model choice; fails open after a 600ms timeout to a high-fidelity default.</w:t>
             </w:r>
           </w:p>
-        </w:tc>
-        <w:tc>
-          <w:tcPr>
-            <w:tcW w:type="dxa" w:w="4220"/>
-            <w:tcBorders>
-              <w:top w:val="single" w:color="CFCFCF" w:sz="2"/>
-              <w:left w:val="single" w:color="CFCFCF" w:sz="2"/>
-              <w:bottom w:val="single" w:color="CFCFCF" w:sz="2"/>
-              <w:right w:val="single" w:color="CFCFCF" w:sz="2"/>
-            </w:tcBorders>
-            <w:tcMar>
-              <w:top w:type="dxa" w:w="100"/>
-              <w:left w:type="dxa" w:w="140"/>
-              <w:bottom w:type="dxa" w:w="100"/>
-              <w:right w:type="dxa" w:w="140"/>
-            </w:tcMar>
-            <w:vAlign w:val="top"/>
-          </w:tcPr>
+          <w:p>
+            <w:pPr>
+              <w:spacing w:after="20" w:before="40"/>
+            </w:pPr>
+            <w:r>
+              <w:rPr>
+                <w:rFonts w:ascii="Arial" w:cs="Arial" w:eastAsia="Arial" w:hAnsi="Arial"/>
+                <w:b/>
+                <w:bCs/>
+                <w:color w:val="1F4E79"/>
+                <w:sz w:val="17"/>
+                <w:szCs w:val="17"/>
+              </w:rPr>
+              <w:t xml:space="preserve">Current</w:t>
+            </w:r>
+          </w:p>
           <w:p>
             <w:pPr>
               <w:spacing w:after="60" w:before="0"/>
@@ -1239,7 +1539,7 @@
         </w:tc>
         <w:tc>
           <w:tcPr>
-            <w:tcW w:type="dxa" w:w="1600"/>
+            <w:tcW w:type="dxa" w:w="1400"/>
             <w:tcBorders>
               <w:top w:val="single" w:color="CFCFCF" w:sz="2"/>
               <w:left w:val="single" w:color="CFCFCF" w:sz="2"/>
@@ -1276,7 +1576,7 @@
       <w:tr>
         <w:tc>
           <w:tcPr>
-            <w:tcW w:type="dxa" w:w="1440"/>
+            <w:tcW w:type="dxa" w:w="1450"/>
             <w:tcBorders>
               <w:top w:val="single" w:color="CFCFCF" w:sz="2"/>
               <w:left w:val="single" w:color="CFCFCF" w:sz="2"/>
@@ -1310,21 +1610,137 @@
         </w:tc>
         <w:tc>
           <w:tcPr>
-            <w:tcW w:type="dxa" w:w="2820"/>
-            <w:tcBorders>
-              <w:top w:val="single" w:color="CFCFCF" w:sz="2"/>
-              <w:left w:val="single" w:color="CFCFCF" w:sz="2"/>
-              <w:bottom w:val="single" w:color="CFCFCF" w:sz="2"/>
-              <w:right w:val="single" w:color="CFCFCF" w:sz="2"/>
-            </w:tcBorders>
-            <w:tcMar>
-              <w:top w:type="dxa" w:w="100"/>
-              <w:left w:type="dxa" w:w="140"/>
-              <w:bottom w:type="dxa" w:w="100"/>
-              <w:right w:type="dxa" w:w="140"/>
-            </w:tcMar>
-            <w:vAlign w:val="top"/>
-          </w:tcPr>
+            <w:tcW w:type="dxa" w:w="1700"/>
+            <w:tcBorders>
+              <w:top w:val="single" w:color="CFCFCF" w:sz="2"/>
+              <w:left w:val="single" w:color="CFCFCF" w:sz="2"/>
+              <w:bottom w:val="single" w:color="CFCFCF" w:sz="2"/>
+              <w:right w:val="single" w:color="CFCFCF" w:sz="2"/>
+            </w:tcBorders>
+            <w:shd w:fill="F7F2E8" w:val="clear"/>
+            <w:tcMar>
+              <w:top w:type="dxa" w:w="100"/>
+              <w:left w:type="dxa" w:w="140"/>
+              <w:bottom w:type="dxa" w:w="100"/>
+              <w:right w:type="dxa" w:w="140"/>
+            </w:tcMar>
+            <w:vAlign w:val="top"/>
+          </w:tcPr>
+          <w:p>
+            <w:pPr>
+              <w:spacing w:after="60" w:before="0"/>
+            </w:pPr>
+            <w:r>
+              <w:rPr>
+                <w:rFonts w:ascii="Arial" w:cs="Arial" w:eastAsia="Arial" w:hAnsi="Arial"/>
+                <w:i/>
+                <w:iCs/>
+                <w:sz w:val="17"/>
+                <w:szCs w:val="17"/>
+              </w:rPr>
+              <w:t xml:space="preserve">Not specified (Tier 1 / Tier 2 left blank).</w:t>
+            </w:r>
+          </w:p>
+        </w:tc>
+        <w:tc>
+          <w:tcPr>
+            <w:tcW w:type="dxa" w:w="2050"/>
+            <w:tcBorders>
+              <w:top w:val="single" w:color="CFCFCF" w:sz="2"/>
+              <w:left w:val="single" w:color="CFCFCF" w:sz="2"/>
+              <w:bottom w:val="single" w:color="CFCFCF" w:sz="2"/>
+              <w:right w:val="single" w:color="CFCFCF" w:sz="2"/>
+            </w:tcBorders>
+            <w:shd w:fill="EAF1F8" w:val="clear"/>
+            <w:tcMar>
+              <w:top w:type="dxa" w:w="100"/>
+              <w:left w:type="dxa" w:w="140"/>
+              <w:bottom w:type="dxa" w:w="100"/>
+              <w:right w:type="dxa" w:w="140"/>
+            </w:tcMar>
+            <w:vAlign w:val="top"/>
+          </w:tcPr>
+          <w:p>
+            <w:pPr>
+              <w:spacing w:after="60" w:before="0"/>
+            </w:pPr>
+            <w:r>
+              <w:rPr>
+                <w:rFonts w:ascii="Arial" w:cs="Arial" w:eastAsia="Arial" w:hAnsi="Arial"/>
+                <w:i/>
+                <w:iCs/>
+                <w:sz w:val="17"/>
+                <w:szCs w:val="17"/>
+              </w:rPr>
+              <w:t xml:space="preserve">@cf/deepgram/nova-3 — registered but has zero call sites (never actually invoked).</w:t>
+            </w:r>
+          </w:p>
+        </w:tc>
+        <w:tc>
+          <w:tcPr>
+            <w:tcW w:type="dxa" w:w="2450"/>
+            <w:tcBorders>
+              <w:top w:val="single" w:color="CFCFCF" w:sz="2"/>
+              <w:left w:val="single" w:color="CFCFCF" w:sz="2"/>
+              <w:bottom w:val="single" w:color="CFCFCF" w:sz="2"/>
+              <w:right w:val="single" w:color="CFCFCF" w:sz="2"/>
+            </w:tcBorders>
+            <w:shd w:fill="E3F0DE" w:val="clear"/>
+            <w:tcMar>
+              <w:top w:type="dxa" w:w="100"/>
+              <w:left w:type="dxa" w:w="140"/>
+              <w:bottom w:type="dxa" w:w="100"/>
+              <w:right w:type="dxa" w:w="140"/>
+            </w:tcMar>
+            <w:vAlign w:val="top"/>
+          </w:tcPr>
+          <w:p>
+            <w:pPr>
+              <w:spacing w:after="60" w:before="0"/>
+            </w:pPr>
+            <w:r>
+              <w:rPr>
+                <w:rFonts w:ascii="Arial" w:cs="Arial" w:eastAsia="Arial" w:hAnsi="Arial"/>
+                <w:sz w:val="17"/>
+                <w:szCs w:val="17"/>
+              </w:rPr>
+              <w:t xml:space="preserve">Wire up the already-registered nova-3 — it now supports 10 languages with regional variants (Mar 2026). Important: audio currently goes to a vision model that cannot accept an audio input type at all, so this is likely broken today, not just suboptimal.</w:t>
+            </w:r>
+          </w:p>
+        </w:tc>
+        <w:tc>
+          <w:tcPr>
+            <w:tcW w:type="dxa" w:w="5350"/>
+            <w:tcBorders>
+              <w:top w:val="single" w:color="CFCFCF" w:sz="2"/>
+              <w:left w:val="single" w:color="CFCFCF" w:sz="2"/>
+              <w:bottom w:val="single" w:color="CFCFCF" w:sz="2"/>
+              <w:right w:val="single" w:color="CFCFCF" w:sz="2"/>
+            </w:tcBorders>
+            <w:tcMar>
+              <w:top w:type="dxa" w:w="100"/>
+              <w:left w:type="dxa" w:w="140"/>
+              <w:bottom w:type="dxa" w:w="100"/>
+              <w:right w:type="dxa" w:w="140"/>
+            </w:tcMar>
+            <w:vAlign w:val="top"/>
+          </w:tcPr>
+          <w:p>
+            <w:pPr>
+              <w:spacing w:after="20" w:before="0"/>
+            </w:pPr>
+            <w:r>
+              <w:rPr>
+                <w:rFonts w:ascii="Arial" w:cs="Arial" w:eastAsia="Arial" w:hAnsi="Arial"/>
+                <w:b/>
+                <w:bCs/>
+                <w:color w:val="8A6D1D"/>
+                <w:sz w:val="17"/>
+                <w:szCs w:val="17"/>
+              </w:rPr>
+              <w:t xml:space="preserve">Proposed</w:t>
+            </w:r>
+          </w:p>
           <w:p>
             <w:pPr>
               <w:spacing w:after="60" w:before="0"/>
@@ -1338,24 +1754,22 @@
               <w:t xml:space="preserve">Dedicated speech-to-text layer, tiered models, preserves emotional cues from the audio.</w:t>
             </w:r>
           </w:p>
-        </w:tc>
-        <w:tc>
-          <w:tcPr>
-            <w:tcW w:type="dxa" w:w="4220"/>
-            <w:tcBorders>
-              <w:top w:val="single" w:color="CFCFCF" w:sz="2"/>
-              <w:left w:val="single" w:color="CFCFCF" w:sz="2"/>
-              <w:bottom w:val="single" w:color="CFCFCF" w:sz="2"/>
-              <w:right w:val="single" w:color="CFCFCF" w:sz="2"/>
-            </w:tcBorders>
-            <w:tcMar>
-              <w:top w:type="dxa" w:w="100"/>
-              <w:left w:type="dxa" w:w="140"/>
-              <w:bottom w:type="dxa" w:w="100"/>
-              <w:right w:type="dxa" w:w="140"/>
-            </w:tcMar>
-            <w:vAlign w:val="top"/>
-          </w:tcPr>
+          <w:p>
+            <w:pPr>
+              <w:spacing w:after="20" w:before="40"/>
+            </w:pPr>
+            <w:r>
+              <w:rPr>
+                <w:rFonts w:ascii="Arial" w:cs="Arial" w:eastAsia="Arial" w:hAnsi="Arial"/>
+                <w:b/>
+                <w:bCs/>
+                <w:color w:val="1F4E79"/>
+                <w:sz w:val="17"/>
+                <w:szCs w:val="17"/>
+              </w:rPr>
+              <w:t xml:space="preserve">Current</w:t>
+            </w:r>
+          </w:p>
           <w:p>
             <w:pPr>
               <w:spacing w:after="60" w:before="0"/>
@@ -1411,7 +1825,7 @@
         </w:tc>
         <w:tc>
           <w:tcPr>
-            <w:tcW w:type="dxa" w:w="1600"/>
+            <w:tcW w:type="dxa" w:w="1400"/>
             <w:tcBorders>
               <w:top w:val="single" w:color="CFCFCF" w:sz="2"/>
               <w:left w:val="single" w:color="CFCFCF" w:sz="2"/>
@@ -1463,7 +1877,7 @@
     </w:p>
     <w:tbl>
       <w:tblPr>
-        <w:tblW w:type="dxa" w:w="10080"/>
+        <w:tblW w:type="dxa" w:w="14400"/>
         <w:tblBorders>
           <w:top w:val="single" w:color="auto" w:sz="4"/>
           <w:left w:val="single" w:color="auto" w:sz="4"/>
@@ -1474,10 +1888,12 @@
         </w:tblBorders>
       </w:tblPr>
       <w:tblGrid>
-        <w:gridCol w:w="1440"/>
-        <w:gridCol w:w="2820"/>
-        <w:gridCol w:w="4220"/>
-        <w:gridCol w:w="1600"/>
+        <w:gridCol w:w="1450"/>
+        <w:gridCol w:w="1700"/>
+        <w:gridCol w:w="2050"/>
+        <w:gridCol w:w="2450"/>
+        <w:gridCol w:w="5350"/>
+        <w:gridCol w:w="1400"/>
       </w:tblGrid>
       <w:tr>
         <w:trPr>
@@ -1485,7 +1901,7 @@
         </w:trPr>
         <w:tc>
           <w:tcPr>
-            <w:tcW w:type="dxa" w:w="1440"/>
+            <w:tcW w:type="dxa" w:w="1450"/>
             <w:tcBorders>
               <w:top w:val="single" w:color="CFCFCF" w:sz="2"/>
               <w:left w:val="single" w:color="CFCFCF" w:sz="2"/>
@@ -1520,7 +1936,7 @@
         </w:tc>
         <w:tc>
           <w:tcPr>
-            <w:tcW w:type="dxa" w:w="2820"/>
+            <w:tcW w:type="dxa" w:w="1700"/>
             <w:tcBorders>
               <w:top w:val="single" w:color="CFCFCF" w:sz="2"/>
               <w:left w:val="single" w:color="CFCFCF" w:sz="2"/>
@@ -1549,13 +1965,13 @@
                 <w:sz w:val="20"/>
                 <w:szCs w:val="20"/>
               </w:rPr>
-              <w:t xml:space="preserve">Proposed design</w:t>
-            </w:r>
-          </w:p>
-        </w:tc>
-        <w:tc>
-          <w:tcPr>
-            <w:tcW w:type="dxa" w:w="4220"/>
+              <w:t xml:space="preserve">Proposed model(s)</w:t>
+            </w:r>
+          </w:p>
+        </w:tc>
+        <w:tc>
+          <w:tcPr>
+            <w:tcW w:type="dxa" w:w="2050"/>
             <w:tcBorders>
               <w:top w:val="single" w:color="CFCFCF" w:sz="2"/>
               <w:left w:val="single" w:color="CFCFCF" w:sz="2"/>
@@ -1584,13 +2000,13 @@
                 <w:sz w:val="20"/>
                 <w:szCs w:val="20"/>
               </w:rPr>
-              <w:t xml:space="preserve">Current reality (verified in code)</w:t>
-            </w:r>
-          </w:p>
-        </w:tc>
-        <w:tc>
-          <w:tcPr>
-            <w:tcW w:type="dxa" w:w="1600"/>
+              <w:t xml:space="preserve">Current model(s)</w:t>
+            </w:r>
+          </w:p>
+        </w:tc>
+        <w:tc>
+          <w:tcPr>
+            <w:tcW w:type="dxa" w:w="2450"/>
             <w:tcBorders>
               <w:top w:val="single" w:color="CFCFCF" w:sz="2"/>
               <w:left w:val="single" w:color="CFCFCF" w:sz="2"/>
@@ -1619,6 +2035,76 @@
                 <w:sz w:val="20"/>
                 <w:szCs w:val="20"/>
               </w:rPr>
+              <w:t xml:space="preserve">Recommended (Cloudflare, Jul 2026)</w:t>
+            </w:r>
+          </w:p>
+        </w:tc>
+        <w:tc>
+          <w:tcPr>
+            <w:tcW w:type="dxa" w:w="5350"/>
+            <w:tcBorders>
+              <w:top w:val="single" w:color="CFCFCF" w:sz="2"/>
+              <w:left w:val="single" w:color="CFCFCF" w:sz="2"/>
+              <w:bottom w:val="single" w:color="CFCFCF" w:sz="2"/>
+              <w:right w:val="single" w:color="CFCFCF" w:sz="2"/>
+            </w:tcBorders>
+            <w:shd w:fill="1F3864" w:val="clear"/>
+            <w:tcMar>
+              <w:top w:type="dxa" w:w="100"/>
+              <w:left w:type="dxa" w:w="140"/>
+              <w:bottom w:type="dxa" w:w="100"/>
+              <w:right w:type="dxa" w:w="140"/>
+            </w:tcMar>
+            <w:vAlign w:val="top"/>
+          </w:tcPr>
+          <w:p>
+            <w:pPr>
+              <w:spacing w:after="60" w:before="0"/>
+            </w:pPr>
+            <w:r>
+              <w:rPr>
+                <w:rFonts w:ascii="Arial" w:cs="Arial" w:eastAsia="Arial" w:hAnsi="Arial"/>
+                <w:b/>
+                <w:bCs/>
+                <w:color w:val="FFFFFF"/>
+                <w:sz w:val="20"/>
+                <w:szCs w:val="20"/>
+              </w:rPr>
+              <w:t xml:space="preserve">Notes — mechanism &amp; citations</w:t>
+            </w:r>
+          </w:p>
+        </w:tc>
+        <w:tc>
+          <w:tcPr>
+            <w:tcW w:type="dxa" w:w="1400"/>
+            <w:tcBorders>
+              <w:top w:val="single" w:color="CFCFCF" w:sz="2"/>
+              <w:left w:val="single" w:color="CFCFCF" w:sz="2"/>
+              <w:bottom w:val="single" w:color="CFCFCF" w:sz="2"/>
+              <w:right w:val="single" w:color="CFCFCF" w:sz="2"/>
+            </w:tcBorders>
+            <w:shd w:fill="1F3864" w:val="clear"/>
+            <w:tcMar>
+              <w:top w:type="dxa" w:w="100"/>
+              <w:left w:type="dxa" w:w="140"/>
+              <w:bottom w:type="dxa" w:w="100"/>
+              <w:right w:type="dxa" w:w="140"/>
+            </w:tcMar>
+            <w:vAlign w:val="top"/>
+          </w:tcPr>
+          <w:p>
+            <w:pPr>
+              <w:spacing w:after="60" w:before="0"/>
+            </w:pPr>
+            <w:r>
+              <w:rPr>
+                <w:rFonts w:ascii="Arial" w:cs="Arial" w:eastAsia="Arial" w:hAnsi="Arial"/>
+                <w:b/>
+                <w:bCs/>
+                <w:color w:val="FFFFFF"/>
+                <w:sz w:val="20"/>
+                <w:szCs w:val="20"/>
+              </w:rPr>
               <w:t xml:space="preserve">Status</w:t>
             </w:r>
           </w:p>
@@ -1627,7 +2113,7 @@
       <w:tr>
         <w:tc>
           <w:tcPr>
-            <w:tcW w:type="dxa" w:w="1440"/>
+            <w:tcW w:type="dxa" w:w="1450"/>
             <w:tcBorders>
               <w:top w:val="single" w:color="CFCFCF" w:sz="2"/>
               <w:left w:val="single" w:color="CFCFCF" w:sz="2"/>
@@ -1662,21 +2148,152 @@
         </w:tc>
         <w:tc>
           <w:tcPr>
-            <w:tcW w:type="dxa" w:w="2820"/>
-            <w:tcBorders>
-              <w:top w:val="single" w:color="CFCFCF" w:sz="2"/>
-              <w:left w:val="single" w:color="CFCFCF" w:sz="2"/>
-              <w:bottom w:val="single" w:color="CFCFCF" w:sz="2"/>
-              <w:right w:val="single" w:color="CFCFCF" w:sz="2"/>
-            </w:tcBorders>
-            <w:tcMar>
-              <w:top w:type="dxa" w:w="100"/>
-              <w:left w:type="dxa" w:w="140"/>
-              <w:bottom w:type="dxa" w:w="100"/>
-              <w:right w:type="dxa" w:w="140"/>
-            </w:tcMar>
-            <w:vAlign w:val="top"/>
-          </w:tcPr>
+            <w:tcW w:type="dxa" w:w="1700"/>
+            <w:tcBorders>
+              <w:top w:val="single" w:color="CFCFCF" w:sz="2"/>
+              <w:left w:val="single" w:color="CFCFCF" w:sz="2"/>
+              <w:bottom w:val="single" w:color="CFCFCF" w:sz="2"/>
+              <w:right w:val="single" w:color="CFCFCF" w:sz="2"/>
+            </w:tcBorders>
+            <w:shd w:fill="F7F2E8" w:val="clear"/>
+            <w:tcMar>
+              <w:top w:type="dxa" w:w="100"/>
+              <w:left w:type="dxa" w:w="140"/>
+              <w:bottom w:type="dxa" w:w="100"/>
+              <w:right w:type="dxa" w:w="140"/>
+            </w:tcMar>
+            <w:vAlign w:val="top"/>
+          </w:tcPr>
+          <w:p>
+            <w:pPr>
+              <w:spacing w:after="60" w:before="0"/>
+            </w:pPr>
+            <w:r>
+              <w:rPr>
+                <w:rFonts w:ascii="Arial" w:cs="Arial" w:eastAsia="Arial" w:hAnsi="Arial"/>
+                <w:i/>
+                <w:iCs/>
+                <w:sz w:val="17"/>
+                <w:szCs w:val="17"/>
+              </w:rPr>
+              <w:t xml:space="preserve">Not specified (Tier 1 / Tier 2 left blank).</w:t>
+            </w:r>
+          </w:p>
+        </w:tc>
+        <w:tc>
+          <w:tcPr>
+            <w:tcW w:type="dxa" w:w="2050"/>
+            <w:tcBorders>
+              <w:top w:val="single" w:color="CFCFCF" w:sz="2"/>
+              <w:left w:val="single" w:color="CFCFCF" w:sz="2"/>
+              <w:bottom w:val="single" w:color="CFCFCF" w:sz="2"/>
+              <w:right w:val="single" w:color="CFCFCF" w:sz="2"/>
+            </w:tcBorders>
+            <w:shd w:fill="EAF1F8" w:val="clear"/>
+            <w:tcMar>
+              <w:top w:type="dxa" w:w="100"/>
+              <w:left w:type="dxa" w:w="140"/>
+              <w:bottom w:type="dxa" w:w="100"/>
+              <w:right w:type="dxa" w:w="140"/>
+            </w:tcMar>
+            <w:vAlign w:val="top"/>
+          </w:tcPr>
+          <w:p>
+            <w:pPr>
+              <w:spacing w:after="60" w:before="0"/>
+            </w:pPr>
+            <w:r>
+              <w:rPr>
+                <w:rFonts w:ascii="Arial" w:cs="Arial" w:eastAsia="Arial" w:hAnsi="Arial"/>
+                <w:i/>
+                <w:iCs/>
+                <w:sz w:val="17"/>
+                <w:szCs w:val="17"/>
+              </w:rPr>
+              <w:t xml:space="preserve">casual → @cf/meta/llama-3.3-70b-instruct-fp8-fast</w:t>
+            </w:r>
+          </w:p>
+          <w:p>
+            <w:pPr>
+              <w:spacing w:after="60" w:before="0"/>
+            </w:pPr>
+            <w:r>
+              <w:rPr>
+                <w:rFonts w:ascii="Arial" w:cs="Arial" w:eastAsia="Arial" w:hAnsi="Arial"/>
+                <w:i/>
+                <w:iCs/>
+                <w:sz w:val="17"/>
+                <w:szCs w:val="17"/>
+              </w:rPr>
+              <w:t xml:space="preserve">functional → @cf/moonshotai/kimi-k2.7-code</w:t>
+            </w:r>
+          </w:p>
+        </w:tc>
+        <w:tc>
+          <w:tcPr>
+            <w:tcW w:type="dxa" w:w="2450"/>
+            <w:tcBorders>
+              <w:top w:val="single" w:color="CFCFCF" w:sz="2"/>
+              <w:left w:val="single" w:color="CFCFCF" w:sz="2"/>
+              <w:bottom w:val="single" w:color="CFCFCF" w:sz="2"/>
+              <w:right w:val="single" w:color="CFCFCF" w:sz="2"/>
+            </w:tcBorders>
+            <w:shd w:fill="E3F0DE" w:val="clear"/>
+            <w:tcMar>
+              <w:top w:type="dxa" w:w="100"/>
+              <w:left w:type="dxa" w:w="140"/>
+              <w:bottom w:type="dxa" w:w="100"/>
+              <w:right w:type="dxa" w:w="140"/>
+            </w:tcMar>
+            <w:vAlign w:val="top"/>
+          </w:tcPr>
+          <w:p>
+            <w:pPr>
+              <w:spacing w:after="60" w:before="0"/>
+            </w:pPr>
+            <w:r>
+              <w:rPr>
+                <w:rFonts w:ascii="Arial" w:cs="Arial" w:eastAsia="Arial" w:hAnsi="Arial"/>
+                <w:sz w:val="17"/>
+                <w:szCs w:val="17"/>
+              </w:rPr>
+              <w:t xml:space="preserve">For casual: @cf/google/gemma-4-26b-a4b-it — newer MoE model (4B active/26B total, Apr 2026) with native vision, reasoning and function calling at a fraction of 70B’s compute cost; could absorb the vision layer too. Keep kimi-k2.7-code for functional/code.</w:t>
+            </w:r>
+          </w:p>
+        </w:tc>
+        <w:tc>
+          <w:tcPr>
+            <w:tcW w:type="dxa" w:w="5350"/>
+            <w:tcBorders>
+              <w:top w:val="single" w:color="CFCFCF" w:sz="2"/>
+              <w:left w:val="single" w:color="CFCFCF" w:sz="2"/>
+              <w:bottom w:val="single" w:color="CFCFCF" w:sz="2"/>
+              <w:right w:val="single" w:color="CFCFCF" w:sz="2"/>
+            </w:tcBorders>
+            <w:tcMar>
+              <w:top w:type="dxa" w:w="100"/>
+              <w:left w:type="dxa" w:w="140"/>
+              <w:bottom w:type="dxa" w:w="100"/>
+              <w:right w:type="dxa" w:w="140"/>
+            </w:tcMar>
+            <w:vAlign w:val="top"/>
+          </w:tcPr>
+          <w:p>
+            <w:pPr>
+              <w:spacing w:after="20" w:before="0"/>
+            </w:pPr>
+            <w:r>
+              <w:rPr>
+                <w:rFonts w:ascii="Arial" w:cs="Arial" w:eastAsia="Arial" w:hAnsi="Arial"/>
+                <w:b/>
+                <w:bCs/>
+                <w:color w:val="8A6D1D"/>
+                <w:sz w:val="17"/>
+                <w:szCs w:val="17"/>
+              </w:rPr>
+              <w:t xml:space="preserve">Proposed</w:t>
+            </w:r>
+          </w:p>
           <w:p>
             <w:pPr>
               <w:spacing w:after="60" w:before="0"/>
@@ -1690,48 +2307,33 @@
               <w:t xml:space="preserve">One combined layer for casual conversation and functional/system actions (timers, pins, lists).</w:t>
             </w:r>
           </w:p>
-        </w:tc>
-        <w:tc>
-          <w:tcPr>
-            <w:tcW w:type="dxa" w:w="4220"/>
-            <w:tcBorders>
-              <w:top w:val="single" w:color="CFCFCF" w:sz="2"/>
-              <w:left w:val="single" w:color="CFCFCF" w:sz="2"/>
-              <w:bottom w:val="single" w:color="CFCFCF" w:sz="2"/>
-              <w:right w:val="single" w:color="CFCFCF" w:sz="2"/>
-            </w:tcBorders>
-            <w:tcMar>
-              <w:top w:type="dxa" w:w="100"/>
-              <w:left w:type="dxa" w:w="140"/>
-              <w:bottom w:type="dxa" w:w="100"/>
-              <w:right w:type="dxa" w:w="140"/>
-            </w:tcMar>
-            <w:vAlign w:val="top"/>
-          </w:tcPr>
-          <w:p>
-            <w:pPr>
-              <w:spacing w:after="60" w:before="0"/>
-            </w:pPr>
-            <w:r>
-              <w:rPr>
-                <w:rFonts w:ascii="Arial" w:cs="Arial" w:eastAsia="Arial" w:hAnsi="Arial"/>
-                <w:sz w:val="18"/>
-                <w:szCs w:val="18"/>
-              </w:rPr>
-              <w:t xml:space="preserve">casual → @cf/meta/llama-3.3-70b-instruct-fp8-fast (the default chat model).</w:t>
-            </w:r>
-          </w:p>
-          <w:p>
-            <w:pPr>
-              <w:spacing w:after="60" w:before="0"/>
-            </w:pPr>
-            <w:r>
-              <w:rPr>
-                <w:rFonts w:ascii="Arial" w:cs="Arial" w:eastAsia="Arial" w:hAnsi="Arial"/>
-                <w:sz w:val="18"/>
-                <w:szCs w:val="18"/>
-              </w:rPr>
-              <w:t xml:space="preserve">functional → @cf/moonshotai/kimi-k2.7-code, thinkingLevel HIGH — the same model slot used for “code”, not the chat model. So functional intent is actually handled by the Brain tier, not bundled with casual chat.</w:t>
+          <w:p>
+            <w:pPr>
+              <w:spacing w:after="20" w:before="40"/>
+            </w:pPr>
+            <w:r>
+              <w:rPr>
+                <w:rFonts w:ascii="Arial" w:cs="Arial" w:eastAsia="Arial" w:hAnsi="Arial"/>
+                <w:b/>
+                <w:bCs/>
+                <w:color w:val="1F4E79"/>
+                <w:sz w:val="17"/>
+                <w:szCs w:val="17"/>
+              </w:rPr>
+              <w:t xml:space="preserve">Current</w:t>
+            </w:r>
+          </w:p>
+          <w:p>
+            <w:pPr>
+              <w:spacing w:after="60" w:before="0"/>
+            </w:pPr>
+            <w:r>
+              <w:rPr>
+                <w:rFonts w:ascii="Arial" w:cs="Arial" w:eastAsia="Arial" w:hAnsi="Arial"/>
+                <w:sz w:val="18"/>
+                <w:szCs w:val="18"/>
+              </w:rPr>
+              <w:t xml:space="preserve">functional runs with thinkingLevel HIGH on the same model slot used for “code” — not the chat model. So functional intent is actually handled by the Brain tier, not bundled with casual chat as proposed.</w:t>
             </w:r>
           </w:p>
           <w:p>
@@ -1750,7 +2352,7 @@
         </w:tc>
         <w:tc>
           <w:tcPr>
-            <w:tcW w:type="dxa" w:w="1600"/>
+            <w:tcW w:type="dxa" w:w="1400"/>
             <w:tcBorders>
               <w:top w:val="single" w:color="CFCFCF" w:sz="2"/>
               <w:left w:val="single" w:color="CFCFCF" w:sz="2"/>
@@ -1787,7 +2389,7 @@
       <w:tr>
         <w:tc>
           <w:tcPr>
-            <w:tcW w:type="dxa" w:w="1440"/>
+            <w:tcW w:type="dxa" w:w="1450"/>
             <w:tcBorders>
               <w:top w:val="single" w:color="CFCFCF" w:sz="2"/>
               <w:left w:val="single" w:color="CFCFCF" w:sz="2"/>
@@ -1822,21 +2424,152 @@
         </w:tc>
         <w:tc>
           <w:tcPr>
-            <w:tcW w:type="dxa" w:w="2820"/>
-            <w:tcBorders>
-              <w:top w:val="single" w:color="CFCFCF" w:sz="2"/>
-              <w:left w:val="single" w:color="CFCFCF" w:sz="2"/>
-              <w:bottom w:val="single" w:color="CFCFCF" w:sz="2"/>
-              <w:right w:val="single" w:color="CFCFCF" w:sz="2"/>
-            </w:tcBorders>
-            <w:tcMar>
-              <w:top w:type="dxa" w:w="100"/>
-              <w:left w:type="dxa" w:w="140"/>
-              <w:bottom w:type="dxa" w:w="100"/>
-              <w:right w:type="dxa" w:w="140"/>
-            </w:tcMar>
-            <w:vAlign w:val="top"/>
-          </w:tcPr>
+            <w:tcW w:type="dxa" w:w="1700"/>
+            <w:tcBorders>
+              <w:top w:val="single" w:color="CFCFCF" w:sz="2"/>
+              <w:left w:val="single" w:color="CFCFCF" w:sz="2"/>
+              <w:bottom w:val="single" w:color="CFCFCF" w:sz="2"/>
+              <w:right w:val="single" w:color="CFCFCF" w:sz="2"/>
+            </w:tcBorders>
+            <w:shd w:fill="F7F2E8" w:val="clear"/>
+            <w:tcMar>
+              <w:top w:type="dxa" w:w="100"/>
+              <w:left w:type="dxa" w:w="140"/>
+              <w:bottom w:type="dxa" w:w="100"/>
+              <w:right w:type="dxa" w:w="140"/>
+            </w:tcMar>
+            <w:vAlign w:val="top"/>
+          </w:tcPr>
+          <w:p>
+            <w:pPr>
+              <w:spacing w:after="60" w:before="0"/>
+            </w:pPr>
+            <w:r>
+              <w:rPr>
+                <w:rFonts w:ascii="Arial" w:cs="Arial" w:eastAsia="Arial" w:hAnsi="Arial"/>
+                <w:i/>
+                <w:iCs/>
+                <w:sz w:val="17"/>
+                <w:szCs w:val="17"/>
+              </w:rPr>
+              <w:t xml:space="preserve">Not specified (Tier 1 / Tier 2 left blank).</w:t>
+            </w:r>
+          </w:p>
+        </w:tc>
+        <w:tc>
+          <w:tcPr>
+            <w:tcW w:type="dxa" w:w="2050"/>
+            <w:tcBorders>
+              <w:top w:val="single" w:color="CFCFCF" w:sz="2"/>
+              <w:left w:val="single" w:color="CFCFCF" w:sz="2"/>
+              <w:bottom w:val="single" w:color="CFCFCF" w:sz="2"/>
+              <w:right w:val="single" w:color="CFCFCF" w:sz="2"/>
+            </w:tcBorders>
+            <w:shd w:fill="EAF1F8" w:val="clear"/>
+            <w:tcMar>
+              <w:top w:type="dxa" w:w="100"/>
+              <w:left w:type="dxa" w:w="140"/>
+              <w:bottom w:type="dxa" w:w="100"/>
+              <w:right w:type="dxa" w:w="140"/>
+            </w:tcMar>
+            <w:vAlign w:val="top"/>
+          </w:tcPr>
+          <w:p>
+            <w:pPr>
+              <w:spacing w:after="60" w:before="0"/>
+            </w:pPr>
+            <w:r>
+              <w:rPr>
+                <w:rFonts w:ascii="Arial" w:cs="Arial" w:eastAsia="Arial" w:hAnsi="Arial"/>
+                <w:i/>
+                <w:iCs/>
+                <w:sz w:val="17"/>
+                <w:szCs w:val="17"/>
+              </w:rPr>
+              <w:t xml:space="preserve">emotional_vent → @cf/meta/llama-3.3-70b-instruct-fp8-fast (same as casual)</w:t>
+            </w:r>
+          </w:p>
+          <w:p>
+            <w:pPr>
+              <w:spacing w:after="60" w:before="0"/>
+            </w:pPr>
+            <w:r>
+              <w:rPr>
+                <w:rFonts w:ascii="Arial" w:cs="Arial" w:eastAsia="Arial" w:hAnsi="Arial"/>
+                <w:i/>
+                <w:iCs/>
+                <w:sz w:val="17"/>
+                <w:szCs w:val="17"/>
+              </w:rPr>
+              <w:t xml:space="preserve">crisis → no model called (fixed firewall reply)</w:t>
+            </w:r>
+          </w:p>
+        </w:tc>
+        <w:tc>
+          <w:tcPr>
+            <w:tcW w:type="dxa" w:w="2450"/>
+            <w:tcBorders>
+              <w:top w:val="single" w:color="CFCFCF" w:sz="2"/>
+              <w:left w:val="single" w:color="CFCFCF" w:sz="2"/>
+              <w:bottom w:val="single" w:color="CFCFCF" w:sz="2"/>
+              <w:right w:val="single" w:color="CFCFCF" w:sz="2"/>
+            </w:tcBorders>
+            <w:shd w:fill="E3F0DE" w:val="clear"/>
+            <w:tcMar>
+              <w:top w:type="dxa" w:w="100"/>
+              <w:left w:type="dxa" w:w="140"/>
+              <w:bottom w:type="dxa" w:w="100"/>
+              <w:right w:type="dxa" w:w="140"/>
+            </w:tcMar>
+            <w:vAlign w:val="top"/>
+          </w:tcPr>
+          <w:p>
+            <w:pPr>
+              <w:spacing w:after="60" w:before="0"/>
+            </w:pPr>
+            <w:r>
+              <w:rPr>
+                <w:rFonts w:ascii="Arial" w:cs="Arial" w:eastAsia="Arial" w:hAnsi="Arial"/>
+                <w:sz w:val="17"/>
+                <w:szCs w:val="17"/>
+              </w:rPr>
+              <w:t xml:space="preserve">Same gemma-4-26b-a4b-it candidate as B1&amp;D — its built-in reasoning mode may help with nuanced emotional judgement calls. No Cloudflare model markets itself as therapeutic/AEDP-tuned, so this needs prompt-level compensation regardless of model choice.</w:t>
+            </w:r>
+          </w:p>
+        </w:tc>
+        <w:tc>
+          <w:tcPr>
+            <w:tcW w:type="dxa" w:w="5350"/>
+            <w:tcBorders>
+              <w:top w:val="single" w:color="CFCFCF" w:sz="2"/>
+              <w:left w:val="single" w:color="CFCFCF" w:sz="2"/>
+              <w:bottom w:val="single" w:color="CFCFCF" w:sz="2"/>
+              <w:right w:val="single" w:color="CFCFCF" w:sz="2"/>
+            </w:tcBorders>
+            <w:tcMar>
+              <w:top w:type="dxa" w:w="100"/>
+              <w:left w:type="dxa" w:w="140"/>
+              <w:bottom w:type="dxa" w:w="100"/>
+              <w:right w:type="dxa" w:w="140"/>
+            </w:tcMar>
+            <w:vAlign w:val="top"/>
+          </w:tcPr>
+          <w:p>
+            <w:pPr>
+              <w:spacing w:after="20" w:before="0"/>
+            </w:pPr>
+            <w:r>
+              <w:rPr>
+                <w:rFonts w:ascii="Arial" w:cs="Arial" w:eastAsia="Arial" w:hAnsi="Arial"/>
+                <w:b/>
+                <w:bCs/>
+                <w:color w:val="8A6D1D"/>
+                <w:sz w:val="17"/>
+                <w:szCs w:val="17"/>
+              </w:rPr>
+              <w:t xml:space="preserve">Proposed</w:t>
+            </w:r>
+          </w:p>
           <w:p>
             <w:pPr>
               <w:spacing w:after="60" w:before="0"/>
@@ -1850,48 +2583,46 @@
               <w:t xml:space="preserve">One therapeutic layer for both emotional_vent and crisis, with long-term attachment tracking (AEDP framework).</w:t>
             </w:r>
           </w:p>
-        </w:tc>
-        <w:tc>
-          <w:tcPr>
-            <w:tcW w:type="dxa" w:w="4220"/>
-            <w:tcBorders>
-              <w:top w:val="single" w:color="CFCFCF" w:sz="2"/>
-              <w:left w:val="single" w:color="CFCFCF" w:sz="2"/>
-              <w:bottom w:val="single" w:color="CFCFCF" w:sz="2"/>
-              <w:right w:val="single" w:color="CFCFCF" w:sz="2"/>
-            </w:tcBorders>
-            <w:tcMar>
-              <w:top w:type="dxa" w:w="100"/>
-              <w:left w:type="dxa" w:w="140"/>
-              <w:bottom w:type="dxa" w:w="100"/>
-              <w:right w:type="dxa" w:w="140"/>
-            </w:tcMar>
-            <w:vAlign w:val="top"/>
-          </w:tcPr>
-          <w:p>
-            <w:pPr>
-              <w:spacing w:after="60" w:before="0"/>
-            </w:pPr>
-            <w:r>
-              <w:rPr>
-                <w:rFonts w:ascii="Arial" w:cs="Arial" w:eastAsia="Arial" w:hAnsi="Arial"/>
-                <w:sz w:val="18"/>
-                <w:szCs w:val="18"/>
-              </w:rPr>
-              <w:t xml:space="preserve">emotional_vent → the same default chat model as casual (llama-3.3-70b) — no dedicated “Soul” model exists.</w:t>
-            </w:r>
-          </w:p>
-          <w:p>
-            <w:pPr>
-              <w:spacing w:after="60" w:before="0"/>
-            </w:pPr>
-            <w:r>
-              <w:rPr>
-                <w:rFonts w:ascii="Arial" w:cs="Arial" w:eastAsia="Arial" w:hAnsi="Arial"/>
-                <w:sz w:val="18"/>
-                <w:szCs w:val="18"/>
-              </w:rPr>
-              <w:t xml:space="preserve">crisis → never reaches a model at all. A hard-coded firewall intercepts before generation and sends a fixed Samaritans / SHOUT reply with Voice and Delete buttons.</w:t>
+          <w:p>
+            <w:pPr>
+              <w:spacing w:after="20" w:before="40"/>
+            </w:pPr>
+            <w:r>
+              <w:rPr>
+                <w:rFonts w:ascii="Arial" w:cs="Arial" w:eastAsia="Arial" w:hAnsi="Arial"/>
+                <w:b/>
+                <w:bCs/>
+                <w:color w:val="1F4E79"/>
+                <w:sz w:val="17"/>
+                <w:szCs w:val="17"/>
+              </w:rPr>
+              <w:t xml:space="preserve">Current</w:t>
+            </w:r>
+          </w:p>
+          <w:p>
+            <w:pPr>
+              <w:spacing w:after="60" w:before="0"/>
+            </w:pPr>
+            <w:r>
+              <w:rPr>
+                <w:rFonts w:ascii="Arial" w:cs="Arial" w:eastAsia="Arial" w:hAnsi="Arial"/>
+                <w:sz w:val="18"/>
+                <w:szCs w:val="18"/>
+              </w:rPr>
+              <w:t xml:space="preserve">No dedicated “Soul” model exists — emotional_vent shares the default chat model with casual conversation.</w:t>
+            </w:r>
+          </w:p>
+          <w:p>
+            <w:pPr>
+              <w:spacing w:after="60" w:before="0"/>
+            </w:pPr>
+            <w:r>
+              <w:rPr>
+                <w:rFonts w:ascii="Arial" w:cs="Arial" w:eastAsia="Arial" w:hAnsi="Arial"/>
+                <w:sz w:val="18"/>
+                <w:szCs w:val="18"/>
+              </w:rPr>
+              <w:t xml:space="preserve">crisis never reaches a model at all. A hard-coded firewall intercepts before generation and sends a fixed Samaritans / SHOUT reply with Voice and Delete buttons.</w:t>
             </w:r>
           </w:p>
           <w:p>
@@ -1923,7 +2654,7 @@
         </w:tc>
         <w:tc>
           <w:tcPr>
-            <w:tcW w:type="dxa" w:w="1600"/>
+            <w:tcW w:type="dxa" w:w="1400"/>
             <w:tcBorders>
               <w:top w:val="single" w:color="CFCFCF" w:sz="2"/>
               <w:left w:val="single" w:color="CFCFCF" w:sz="2"/>
@@ -1960,7 +2691,7 @@
       <w:tr>
         <w:tc>
           <w:tcPr>
-            <w:tcW w:type="dxa" w:w="1440"/>
+            <w:tcW w:type="dxa" w:w="1450"/>
             <w:tcBorders>
               <w:top w:val="single" w:color="CFCFCF" w:sz="2"/>
               <w:left w:val="single" w:color="CFCFCF" w:sz="2"/>
@@ -1995,21 +2726,137 @@
         </w:tc>
         <w:tc>
           <w:tcPr>
-            <w:tcW w:type="dxa" w:w="2820"/>
-            <w:tcBorders>
-              <w:top w:val="single" w:color="CFCFCF" w:sz="2"/>
-              <w:left w:val="single" w:color="CFCFCF" w:sz="2"/>
-              <w:bottom w:val="single" w:color="CFCFCF" w:sz="2"/>
-              <w:right w:val="single" w:color="CFCFCF" w:sz="2"/>
-            </w:tcBorders>
-            <w:tcMar>
-              <w:top w:type="dxa" w:w="100"/>
-              <w:left w:type="dxa" w:w="140"/>
-              <w:bottom w:type="dxa" w:w="100"/>
-              <w:right w:type="dxa" w:w="140"/>
-            </w:tcMar>
-            <w:vAlign w:val="top"/>
-          </w:tcPr>
+            <w:tcW w:type="dxa" w:w="1700"/>
+            <w:tcBorders>
+              <w:top w:val="single" w:color="CFCFCF" w:sz="2"/>
+              <w:left w:val="single" w:color="CFCFCF" w:sz="2"/>
+              <w:bottom w:val="single" w:color="CFCFCF" w:sz="2"/>
+              <w:right w:val="single" w:color="CFCFCF" w:sz="2"/>
+            </w:tcBorders>
+            <w:shd w:fill="F7F2E8" w:val="clear"/>
+            <w:tcMar>
+              <w:top w:type="dxa" w:w="100"/>
+              <w:left w:type="dxa" w:w="140"/>
+              <w:bottom w:type="dxa" w:w="100"/>
+              <w:right w:type="dxa" w:w="140"/>
+            </w:tcMar>
+            <w:vAlign w:val="top"/>
+          </w:tcPr>
+          <w:p>
+            <w:pPr>
+              <w:spacing w:after="60" w:before="0"/>
+            </w:pPr>
+            <w:r>
+              <w:rPr>
+                <w:rFonts w:ascii="Arial" w:cs="Arial" w:eastAsia="Arial" w:hAnsi="Arial"/>
+                <w:i/>
+                <w:iCs/>
+                <w:sz w:val="17"/>
+                <w:szCs w:val="17"/>
+              </w:rPr>
+              <w:t xml:space="preserve">Not specified (Tier 1 / Tier 2 left blank).</w:t>
+            </w:r>
+          </w:p>
+        </w:tc>
+        <w:tc>
+          <w:tcPr>
+            <w:tcW w:type="dxa" w:w="2050"/>
+            <w:tcBorders>
+              <w:top w:val="single" w:color="CFCFCF" w:sz="2"/>
+              <w:left w:val="single" w:color="CFCFCF" w:sz="2"/>
+              <w:bottom w:val="single" w:color="CFCFCF" w:sz="2"/>
+              <w:right w:val="single" w:color="CFCFCF" w:sz="2"/>
+            </w:tcBorders>
+            <w:shd w:fill="EAF1F8" w:val="clear"/>
+            <w:tcMar>
+              <w:top w:type="dxa" w:w="100"/>
+              <w:left w:type="dxa" w:w="140"/>
+              <w:bottom w:type="dxa" w:w="100"/>
+              <w:right w:type="dxa" w:w="140"/>
+            </w:tcMar>
+            <w:vAlign w:val="top"/>
+          </w:tcPr>
+          <w:p>
+            <w:pPr>
+              <w:spacing w:after="60" w:before="0"/>
+            </w:pPr>
+            <w:r>
+              <w:rPr>
+                <w:rFonts w:ascii="Arial" w:cs="Arial" w:eastAsia="Arial" w:hAnsi="Arial"/>
+                <w:i/>
+                <w:iCs/>
+                <w:sz w:val="17"/>
+                <w:szCs w:val="17"/>
+              </w:rPr>
+              <w:t xml:space="preserve">@cf/moonshotai/kimi-k2.7-code</w:t>
+            </w:r>
+          </w:p>
+        </w:tc>
+        <w:tc>
+          <w:tcPr>
+            <w:tcW w:type="dxa" w:w="2450"/>
+            <w:tcBorders>
+              <w:top w:val="single" w:color="CFCFCF" w:sz="2"/>
+              <w:left w:val="single" w:color="CFCFCF" w:sz="2"/>
+              <w:bottom w:val="single" w:color="CFCFCF" w:sz="2"/>
+              <w:right w:val="single" w:color="CFCFCF" w:sz="2"/>
+            </w:tcBorders>
+            <w:shd w:fill="E3F0DE" w:val="clear"/>
+            <w:tcMar>
+              <w:top w:type="dxa" w:w="100"/>
+              <w:left w:type="dxa" w:w="140"/>
+              <w:bottom w:type="dxa" w:w="100"/>
+              <w:right w:type="dxa" w:w="140"/>
+            </w:tcMar>
+            <w:vAlign w:val="top"/>
+          </w:tcPr>
+          <w:p>
+            <w:pPr>
+              <w:spacing w:after="60" w:before="0"/>
+            </w:pPr>
+            <w:r>
+              <w:rPr>
+                <w:rFonts w:ascii="Arial" w:cs="Arial" w:eastAsia="Arial" w:hAnsi="Arial"/>
+                <w:sz w:val="17"/>
+                <w:szCs w:val="17"/>
+              </w:rPr>
+              <w:t xml:space="preserve">Kimi K2.7 Code is already the most current coding-specific flagship on Workers AI. @cf/zai-org/glm-5.2 (Jun 2026, Z.ai’s flagship agentic coding model, same 262k context) shipped 4 days later — worth a head-to-head benchmark before committing further.</w:t>
+            </w:r>
+          </w:p>
+        </w:tc>
+        <w:tc>
+          <w:tcPr>
+            <w:tcW w:type="dxa" w:w="5350"/>
+            <w:tcBorders>
+              <w:top w:val="single" w:color="CFCFCF" w:sz="2"/>
+              <w:left w:val="single" w:color="CFCFCF" w:sz="2"/>
+              <w:bottom w:val="single" w:color="CFCFCF" w:sz="2"/>
+              <w:right w:val="single" w:color="CFCFCF" w:sz="2"/>
+            </w:tcBorders>
+            <w:tcMar>
+              <w:top w:type="dxa" w:w="100"/>
+              <w:left w:type="dxa" w:w="140"/>
+              <w:bottom w:type="dxa" w:w="100"/>
+              <w:right w:type="dxa" w:w="140"/>
+            </w:tcMar>
+            <w:vAlign w:val="top"/>
+          </w:tcPr>
+          <w:p>
+            <w:pPr>
+              <w:spacing w:after="20" w:before="0"/>
+            </w:pPr>
+            <w:r>
+              <w:rPr>
+                <w:rFonts w:ascii="Arial" w:cs="Arial" w:eastAsia="Arial" w:hAnsi="Arial"/>
+                <w:b/>
+                <w:bCs/>
+                <w:color w:val="8A6D1D"/>
+                <w:sz w:val="17"/>
+                <w:szCs w:val="17"/>
+              </w:rPr>
+              <w:t xml:space="preserve">Proposed</w:t>
+            </w:r>
+          </w:p>
           <w:p>
             <w:pPr>
               <w:spacing w:after="60" w:before="0"/>
@@ -2023,35 +2870,33 @@
               <w:t xml:space="preserve">Dedicated tier for algorithm creation, scripting and debugging.</w:t>
             </w:r>
           </w:p>
-        </w:tc>
-        <w:tc>
-          <w:tcPr>
-            <w:tcW w:type="dxa" w:w="4220"/>
-            <w:tcBorders>
-              <w:top w:val="single" w:color="CFCFCF" w:sz="2"/>
-              <w:left w:val="single" w:color="CFCFCF" w:sz="2"/>
-              <w:bottom w:val="single" w:color="CFCFCF" w:sz="2"/>
-              <w:right w:val="single" w:color="CFCFCF" w:sz="2"/>
-            </w:tcBorders>
-            <w:tcMar>
-              <w:top w:type="dxa" w:w="100"/>
-              <w:left w:type="dxa" w:w="140"/>
-              <w:bottom w:type="dxa" w:w="100"/>
-              <w:right w:type="dxa" w:w="140"/>
-            </w:tcMar>
-            <w:vAlign w:val="top"/>
-          </w:tcPr>
-          <w:p>
-            <w:pPr>
-              <w:spacing w:after="60" w:before="0"/>
-            </w:pPr>
-            <w:r>
-              <w:rPr>
-                <w:rFonts w:ascii="Arial" w:cs="Arial" w:eastAsia="Arial" w:hAnsi="Arial"/>
-                <w:sz w:val="18"/>
-                <w:szCs w:val="18"/>
-              </w:rPr>
-              <w:t xml:space="preserve">@cf/moonshotai/kimi-k2.7-code, thinkingLevel HIGH, for both code and functional intents.</w:t>
+          <w:p>
+            <w:pPr>
+              <w:spacing w:after="20" w:before="40"/>
+            </w:pPr>
+            <w:r>
+              <w:rPr>
+                <w:rFonts w:ascii="Arial" w:cs="Arial" w:eastAsia="Arial" w:hAnsi="Arial"/>
+                <w:b/>
+                <w:bCs/>
+                <w:color w:val="1F4E79"/>
+                <w:sz w:val="17"/>
+                <w:szCs w:val="17"/>
+              </w:rPr>
+              <w:t xml:space="preserve">Current</w:t>
+            </w:r>
+          </w:p>
+          <w:p>
+            <w:pPr>
+              <w:spacing w:after="60" w:before="0"/>
+            </w:pPr>
+            <w:r>
+              <w:rPr>
+                <w:rFonts w:ascii="Arial" w:cs="Arial" w:eastAsia="Arial" w:hAnsi="Arial"/>
+                <w:sz w:val="18"/>
+                <w:szCs w:val="18"/>
+              </w:rPr>
+              <w:t xml:space="preserve">Runs with thinkingLevel HIGH for both code and functional intents.</w:t>
             </w:r>
           </w:p>
           <w:p>
@@ -2083,7 +2928,7 @@
         </w:tc>
         <w:tc>
           <w:tcPr>
-            <w:tcW w:type="dxa" w:w="1600"/>
+            <w:tcW w:type="dxa" w:w="1400"/>
             <w:tcBorders>
               <w:top w:val="single" w:color="CFCFCF" w:sz="2"/>
               <w:left w:val="single" w:color="CFCFCF" w:sz="2"/>
@@ -2120,7 +2965,7 @@
       <w:tr>
         <w:tc>
           <w:tcPr>
-            <w:tcW w:type="dxa" w:w="1440"/>
+            <w:tcW w:type="dxa" w:w="1450"/>
             <w:tcBorders>
               <w:top w:val="single" w:color="CFCFCF" w:sz="2"/>
               <w:left w:val="single" w:color="CFCFCF" w:sz="2"/>
@@ -2155,21 +3000,137 @@
         </w:tc>
         <w:tc>
           <w:tcPr>
-            <w:tcW w:type="dxa" w:w="2820"/>
-            <w:tcBorders>
-              <w:top w:val="single" w:color="CFCFCF" w:sz="2"/>
-              <w:left w:val="single" w:color="CFCFCF" w:sz="2"/>
-              <w:bottom w:val="single" w:color="CFCFCF" w:sz="2"/>
-              <w:right w:val="single" w:color="CFCFCF" w:sz="2"/>
-            </w:tcBorders>
-            <w:tcMar>
-              <w:top w:type="dxa" w:w="100"/>
-              <w:left w:type="dxa" w:w="140"/>
-              <w:bottom w:type="dxa" w:w="100"/>
-              <w:right w:type="dxa" w:w="140"/>
-            </w:tcMar>
-            <w:vAlign w:val="top"/>
-          </w:tcPr>
+            <w:tcW w:type="dxa" w:w="1700"/>
+            <w:tcBorders>
+              <w:top w:val="single" w:color="CFCFCF" w:sz="2"/>
+              <w:left w:val="single" w:color="CFCFCF" w:sz="2"/>
+              <w:bottom w:val="single" w:color="CFCFCF" w:sz="2"/>
+              <w:right w:val="single" w:color="CFCFCF" w:sz="2"/>
+            </w:tcBorders>
+            <w:shd w:fill="F7F2E8" w:val="clear"/>
+            <w:tcMar>
+              <w:top w:type="dxa" w:w="100"/>
+              <w:left w:type="dxa" w:w="140"/>
+              <w:bottom w:type="dxa" w:w="100"/>
+              <w:right w:type="dxa" w:w="140"/>
+            </w:tcMar>
+            <w:vAlign w:val="top"/>
+          </w:tcPr>
+          <w:p>
+            <w:pPr>
+              <w:spacing w:after="60" w:before="0"/>
+            </w:pPr>
+            <w:r>
+              <w:rPr>
+                <w:rFonts w:ascii="Arial" w:cs="Arial" w:eastAsia="Arial" w:hAnsi="Arial"/>
+                <w:i/>
+                <w:iCs/>
+                <w:sz w:val="17"/>
+                <w:szCs w:val="17"/>
+              </w:rPr>
+              <w:t xml:space="preserve">Not specified (Tier 1 left blank).</w:t>
+            </w:r>
+          </w:p>
+        </w:tc>
+        <w:tc>
+          <w:tcPr>
+            <w:tcW w:type="dxa" w:w="2050"/>
+            <w:tcBorders>
+              <w:top w:val="single" w:color="CFCFCF" w:sz="2"/>
+              <w:left w:val="single" w:color="CFCFCF" w:sz="2"/>
+              <w:bottom w:val="single" w:color="CFCFCF" w:sz="2"/>
+              <w:right w:val="single" w:color="CFCFCF" w:sz="2"/>
+            </w:tcBorders>
+            <w:shd w:fill="EAF1F8" w:val="clear"/>
+            <w:tcMar>
+              <w:top w:type="dxa" w:w="100"/>
+              <w:left w:type="dxa" w:w="140"/>
+              <w:bottom w:type="dxa" w:w="100"/>
+              <w:right w:type="dxa" w:w="140"/>
+            </w:tcMar>
+            <w:vAlign w:val="top"/>
+          </w:tcPr>
+          <w:p>
+            <w:pPr>
+              <w:spacing w:after="60" w:before="0"/>
+            </w:pPr>
+            <w:r>
+              <w:rPr>
+                <w:rFonts w:ascii="Arial" w:cs="Arial" w:eastAsia="Arial" w:hAnsi="Arial"/>
+                <w:i/>
+                <w:iCs/>
+                <w:sz w:val="17"/>
+                <w:szCs w:val="17"/>
+              </w:rPr>
+              <w:t xml:space="preserve">gemini-3.1-flash-tts-preview (Gemini API, voice “Zubenelgenubi”)</w:t>
+            </w:r>
+          </w:p>
+        </w:tc>
+        <w:tc>
+          <w:tcPr>
+            <w:tcW w:type="dxa" w:w="2450"/>
+            <w:tcBorders>
+              <w:top w:val="single" w:color="CFCFCF" w:sz="2"/>
+              <w:left w:val="single" w:color="CFCFCF" w:sz="2"/>
+              <w:bottom w:val="single" w:color="CFCFCF" w:sz="2"/>
+              <w:right w:val="single" w:color="CFCFCF" w:sz="2"/>
+            </w:tcBorders>
+            <w:shd w:fill="E3F0DE" w:val="clear"/>
+            <w:tcMar>
+              <w:top w:type="dxa" w:w="100"/>
+              <w:left w:type="dxa" w:w="140"/>
+              <w:bottom w:type="dxa" w:w="100"/>
+              <w:right w:type="dxa" w:w="140"/>
+            </w:tcMar>
+            <w:vAlign w:val="top"/>
+          </w:tcPr>
+          <w:p>
+            <w:pPr>
+              <w:spacing w:after="60" w:before="0"/>
+            </w:pPr>
+            <w:r>
+              <w:rPr>
+                <w:rFonts w:ascii="Arial" w:cs="Arial" w:eastAsia="Arial" w:hAnsi="Arial"/>
+                <w:sz w:val="17"/>
+                <w:szCs w:val="17"/>
+              </w:rPr>
+              <w:t xml:space="preserve">@cf/deepgram/aura-2-en (or aura-2-es) — context-aware pacing/expressiveness, already hosted on Workers AI. Moving here off Gemini would retire the dead GCP_TTS_API_KEY secret and finish the Cloudflare migration for this layer.</w:t>
+            </w:r>
+          </w:p>
+        </w:tc>
+        <w:tc>
+          <w:tcPr>
+            <w:tcW w:type="dxa" w:w="5350"/>
+            <w:tcBorders>
+              <w:top w:val="single" w:color="CFCFCF" w:sz="2"/>
+              <w:left w:val="single" w:color="CFCFCF" w:sz="2"/>
+              <w:bottom w:val="single" w:color="CFCFCF" w:sz="2"/>
+              <w:right w:val="single" w:color="CFCFCF" w:sz="2"/>
+            </w:tcBorders>
+            <w:tcMar>
+              <w:top w:type="dxa" w:w="100"/>
+              <w:left w:type="dxa" w:w="140"/>
+              <w:bottom w:type="dxa" w:w="100"/>
+              <w:right w:type="dxa" w:w="140"/>
+            </w:tcMar>
+            <w:vAlign w:val="top"/>
+          </w:tcPr>
+          <w:p>
+            <w:pPr>
+              <w:spacing w:after="20" w:before="0"/>
+            </w:pPr>
+            <w:r>
+              <w:rPr>
+                <w:rFonts w:ascii="Arial" w:cs="Arial" w:eastAsia="Arial" w:hAnsi="Arial"/>
+                <w:b/>
+                <w:bCs/>
+                <w:color w:val="8A6D1D"/>
+                <w:sz w:val="17"/>
+                <w:szCs w:val="17"/>
+              </w:rPr>
+              <w:t xml:space="preserve">Proposed</w:t>
+            </w:r>
+          </w:p>
           <w:p>
             <w:pPr>
               <w:spacing w:after="60" w:before="0"/>
@@ -2183,35 +3144,33 @@
               <w:t xml:space="preserve">Dedicated TTS tier.</w:t>
             </w:r>
           </w:p>
-        </w:tc>
-        <w:tc>
-          <w:tcPr>
-            <w:tcW w:type="dxa" w:w="4220"/>
-            <w:tcBorders>
-              <w:top w:val="single" w:color="CFCFCF" w:sz="2"/>
-              <w:left w:val="single" w:color="CFCFCF" w:sz="2"/>
-              <w:bottom w:val="single" w:color="CFCFCF" w:sz="2"/>
-              <w:right w:val="single" w:color="CFCFCF" w:sz="2"/>
-            </w:tcBorders>
-            <w:tcMar>
-              <w:top w:type="dxa" w:w="100"/>
-              <w:left w:type="dxa" w:w="140"/>
-              <w:bottom w:type="dxa" w:w="100"/>
-              <w:right w:type="dxa" w:w="140"/>
-            </w:tcMar>
-            <w:vAlign w:val="top"/>
-          </w:tcPr>
-          <w:p>
-            <w:pPr>
-              <w:spacing w:after="60" w:before="0"/>
-            </w:pPr>
-            <w:r>
-              <w:rPr>
-                <w:rFonts w:ascii="Arial" w:cs="Arial" w:eastAsia="Arial" w:hAnsi="Arial"/>
-                <w:sz w:val="18"/>
-                <w:szCs w:val="18"/>
-              </w:rPr>
-              <w:t xml:space="preserve">Runs on the Gemini Speech Generation API (gemini-3.1-flash-tts-preview), voice “Zubenelgenubi”, using GEMINI_API_KEY.</w:t>
+          <w:p>
+            <w:pPr>
+              <w:spacing w:after="20" w:before="40"/>
+            </w:pPr>
+            <w:r>
+              <w:rPr>
+                <w:rFonts w:ascii="Arial" w:cs="Arial" w:eastAsia="Arial" w:hAnsi="Arial"/>
+                <w:b/>
+                <w:bCs/>
+                <w:color w:val="1F4E79"/>
+                <w:sz w:val="17"/>
+                <w:szCs w:val="17"/>
+              </w:rPr>
+              <w:t xml:space="preserve">Current</w:t>
+            </w:r>
+          </w:p>
+          <w:p>
+            <w:pPr>
+              <w:spacing w:after="60" w:before="0"/>
+            </w:pPr>
+            <w:r>
+              <w:rPr>
+                <w:rFonts w:ascii="Arial" w:cs="Arial" w:eastAsia="Arial" w:hAnsi="Arial"/>
+                <w:sz w:val="18"/>
+                <w:szCs w:val="18"/>
+              </w:rPr>
+              <w:t xml:space="preserve">Uses GEMINI_API_KEY, not the declared GCP_TTS_API_KEY.</w:t>
             </w:r>
           </w:p>
           <w:p>
@@ -2256,7 +3215,7 @@
         </w:tc>
         <w:tc>
           <w:tcPr>
-            <w:tcW w:type="dxa" w:w="1600"/>
+            <w:tcW w:type="dxa" w:w="1400"/>
             <w:tcBorders>
               <w:top w:val="single" w:color="CFCFCF" w:sz="2"/>
               <w:left w:val="single" w:color="CFCFCF" w:sz="2"/>
@@ -2293,7 +3252,7 @@
       <w:tr>
         <w:tc>
           <w:tcPr>
-            <w:tcW w:type="dxa" w:w="1440"/>
+            <w:tcW w:type="dxa" w:w="1450"/>
             <w:tcBorders>
               <w:top w:val="single" w:color="CFCFCF" w:sz="2"/>
               <w:left w:val="single" w:color="CFCFCF" w:sz="2"/>
@@ -2328,21 +3287,137 @@
         </w:tc>
         <w:tc>
           <w:tcPr>
-            <w:tcW w:type="dxa" w:w="2820"/>
-            <w:tcBorders>
-              <w:top w:val="single" w:color="CFCFCF" w:sz="2"/>
-              <w:left w:val="single" w:color="CFCFCF" w:sz="2"/>
-              <w:bottom w:val="single" w:color="CFCFCF" w:sz="2"/>
-              <w:right w:val="single" w:color="CFCFCF" w:sz="2"/>
-            </w:tcBorders>
-            <w:tcMar>
-              <w:top w:type="dxa" w:w="100"/>
-              <w:left w:type="dxa" w:w="140"/>
-              <w:bottom w:type="dxa" w:w="100"/>
-              <w:right w:type="dxa" w:w="140"/>
-            </w:tcMar>
-            <w:vAlign w:val="top"/>
-          </w:tcPr>
+            <w:tcW w:type="dxa" w:w="1700"/>
+            <w:tcBorders>
+              <w:top w:val="single" w:color="CFCFCF" w:sz="2"/>
+              <w:left w:val="single" w:color="CFCFCF" w:sz="2"/>
+              <w:bottom w:val="single" w:color="CFCFCF" w:sz="2"/>
+              <w:right w:val="single" w:color="CFCFCF" w:sz="2"/>
+            </w:tcBorders>
+            <w:shd w:fill="F7F2E8" w:val="clear"/>
+            <w:tcMar>
+              <w:top w:type="dxa" w:w="100"/>
+              <w:left w:type="dxa" w:w="140"/>
+              <w:bottom w:type="dxa" w:w="100"/>
+              <w:right w:type="dxa" w:w="140"/>
+            </w:tcMar>
+            <w:vAlign w:val="top"/>
+          </w:tcPr>
+          <w:p>
+            <w:pPr>
+              <w:spacing w:after="60" w:before="0"/>
+            </w:pPr>
+            <w:r>
+              <w:rPr>
+                <w:rFonts w:ascii="Arial" w:cs="Arial" w:eastAsia="Arial" w:hAnsi="Arial"/>
+                <w:i/>
+                <w:iCs/>
+                <w:sz w:val="17"/>
+                <w:szCs w:val="17"/>
+              </w:rPr>
+              <w:t xml:space="preserve">Not specified (Tier 1 standard / Tier 2 premium left blank).</w:t>
+            </w:r>
+          </w:p>
+        </w:tc>
+        <w:tc>
+          <w:tcPr>
+            <w:tcW w:type="dxa" w:w="2050"/>
+            <w:tcBorders>
+              <w:top w:val="single" w:color="CFCFCF" w:sz="2"/>
+              <w:left w:val="single" w:color="CFCFCF" w:sz="2"/>
+              <w:bottom w:val="single" w:color="CFCFCF" w:sz="2"/>
+              <w:right w:val="single" w:color="CFCFCF" w:sz="2"/>
+            </w:tcBorders>
+            <w:shd w:fill="EAF1F8" w:val="clear"/>
+            <w:tcMar>
+              <w:top w:type="dxa" w:w="100"/>
+              <w:left w:type="dxa" w:w="140"/>
+              <w:bottom w:type="dxa" w:w="100"/>
+              <w:right w:type="dxa" w:w="140"/>
+            </w:tcMar>
+            <w:vAlign w:val="top"/>
+          </w:tcPr>
+          <w:p>
+            <w:pPr>
+              <w:spacing w:after="60" w:before="0"/>
+            </w:pPr>
+            <w:r>
+              <w:rPr>
+                <w:rFonts w:ascii="Arial" w:cs="Arial" w:eastAsia="Arial" w:hAnsi="Arial"/>
+                <w:i/>
+                <w:iCs/>
+                <w:sz w:val="17"/>
+                <w:szCs w:val="17"/>
+              </w:rPr>
+              <w:t xml:space="preserve">None — generate_image tool is a no-op stub; no model is ever called.</w:t>
+            </w:r>
+          </w:p>
+        </w:tc>
+        <w:tc>
+          <w:tcPr>
+            <w:tcW w:type="dxa" w:w="2450"/>
+            <w:tcBorders>
+              <w:top w:val="single" w:color="CFCFCF" w:sz="2"/>
+              <w:left w:val="single" w:color="CFCFCF" w:sz="2"/>
+              <w:bottom w:val="single" w:color="CFCFCF" w:sz="2"/>
+              <w:right w:val="single" w:color="CFCFCF" w:sz="2"/>
+            </w:tcBorders>
+            <w:shd w:fill="E3F0DE" w:val="clear"/>
+            <w:tcMar>
+              <w:top w:type="dxa" w:w="100"/>
+              <w:left w:type="dxa" w:w="140"/>
+              <w:bottom w:type="dxa" w:w="100"/>
+              <w:right w:type="dxa" w:w="140"/>
+            </w:tcMar>
+            <w:vAlign w:val="top"/>
+          </w:tcPr>
+          <w:p>
+            <w:pPr>
+              <w:spacing w:after="60" w:before="0"/>
+            </w:pPr>
+            <w:r>
+              <w:rPr>
+                <w:rFonts w:ascii="Arial" w:cs="Arial" w:eastAsia="Arial" w:hAnsi="Arial"/>
+                <w:sz w:val="17"/>
+                <w:szCs w:val="17"/>
+              </w:rPr>
+              <w:t xml:space="preserve">Tier 1 (standard): @cf/black-forest-labs/flux-2-klein-9b — ultra-fast, unifies generation and editing. Tier 2 (premium): @cf/leonardo/phoenix-1.0 — exceptional prompt adherence and accurate text rendering. Either would finally give this layer a working model instead of the stub.</w:t>
+            </w:r>
+          </w:p>
+        </w:tc>
+        <w:tc>
+          <w:tcPr>
+            <w:tcW w:type="dxa" w:w="5350"/>
+            <w:tcBorders>
+              <w:top w:val="single" w:color="CFCFCF" w:sz="2"/>
+              <w:left w:val="single" w:color="CFCFCF" w:sz="2"/>
+              <w:bottom w:val="single" w:color="CFCFCF" w:sz="2"/>
+              <w:right w:val="single" w:color="CFCFCF" w:sz="2"/>
+            </w:tcBorders>
+            <w:tcMar>
+              <w:top w:type="dxa" w:w="100"/>
+              <w:left w:type="dxa" w:w="140"/>
+              <w:bottom w:type="dxa" w:w="100"/>
+              <w:right w:type="dxa" w:w="140"/>
+            </w:tcMar>
+            <w:vAlign w:val="top"/>
+          </w:tcPr>
+          <w:p>
+            <w:pPr>
+              <w:spacing w:after="20" w:before="0"/>
+            </w:pPr>
+            <w:r>
+              <w:rPr>
+                <w:rFonts w:ascii="Arial" w:cs="Arial" w:eastAsia="Arial" w:hAnsi="Arial"/>
+                <w:b/>
+                <w:bCs/>
+                <w:color w:val="8A6D1D"/>
+                <w:sz w:val="17"/>
+                <w:szCs w:val="17"/>
+              </w:rPr>
+              <w:t xml:space="preserve">Proposed</w:t>
+            </w:r>
+          </w:p>
           <w:p>
             <w:pPr>
               <w:spacing w:after="60" w:before="0"/>
@@ -2356,24 +3431,22 @@
               <w:t xml:space="preserve">Two-tier image generation pipeline: standard engine + premium escalation.</w:t>
             </w:r>
           </w:p>
-        </w:tc>
-        <w:tc>
-          <w:tcPr>
-            <w:tcW w:type="dxa" w:w="4220"/>
-            <w:tcBorders>
-              <w:top w:val="single" w:color="CFCFCF" w:sz="2"/>
-              <w:left w:val="single" w:color="CFCFCF" w:sz="2"/>
-              <w:bottom w:val="single" w:color="CFCFCF" w:sz="2"/>
-              <w:right w:val="single" w:color="CFCFCF" w:sz="2"/>
-            </w:tcBorders>
-            <w:tcMar>
-              <w:top w:type="dxa" w:w="100"/>
-              <w:left w:type="dxa" w:w="140"/>
-              <w:bottom w:type="dxa" w:w="100"/>
-              <w:right w:type="dxa" w:w="140"/>
-            </w:tcMar>
-            <w:vAlign w:val="top"/>
-          </w:tcPr>
+          <w:p>
+            <w:pPr>
+              <w:spacing w:after="20" w:before="40"/>
+            </w:pPr>
+            <w:r>
+              <w:rPr>
+                <w:rFonts w:ascii="Arial" w:cs="Arial" w:eastAsia="Arial" w:hAnsi="Arial"/>
+                <w:b/>
+                <w:bCs/>
+                <w:color w:val="1F4E79"/>
+                <w:sz w:val="17"/>
+                <w:szCs w:val="17"/>
+              </w:rPr>
+              <w:t xml:space="preserve">Current</w:t>
+            </w:r>
+          </w:p>
           <w:p>
             <w:pPr>
               <w:spacing w:after="60" w:before="0"/>
@@ -2416,7 +3489,7 @@
         </w:tc>
         <w:tc>
           <w:tcPr>
-            <w:tcW w:type="dxa" w:w="1600"/>
+            <w:tcW w:type="dxa" w:w="1400"/>
             <w:tcBorders>
               <w:top w:val="single" w:color="CFCFCF" w:sz="2"/>
               <w:left w:val="single" w:color="CFCFCF" w:sz="2"/>
@@ -2468,7 +3541,7 @@
     </w:p>
     <w:tbl>
       <w:tblPr>
-        <w:tblW w:type="dxa" w:w="10080"/>
+        <w:tblW w:type="dxa" w:w="14400"/>
         <w:tblBorders>
           <w:top w:val="single" w:color="auto" w:sz="4"/>
           <w:left w:val="single" w:color="auto" w:sz="4"/>
@@ -2479,10 +3552,12 @@
         </w:tblBorders>
       </w:tblPr>
       <w:tblGrid>
-        <w:gridCol w:w="1440"/>
-        <w:gridCol w:w="2820"/>
-        <w:gridCol w:w="4220"/>
-        <w:gridCol w:w="1600"/>
+        <w:gridCol w:w="1450"/>
+        <w:gridCol w:w="1700"/>
+        <w:gridCol w:w="2050"/>
+        <w:gridCol w:w="2450"/>
+        <w:gridCol w:w="5350"/>
+        <w:gridCol w:w="1400"/>
       </w:tblGrid>
       <w:tr>
         <w:trPr>
@@ -2490,7 +3565,7 @@
         </w:trPr>
         <w:tc>
           <w:tcPr>
-            <w:tcW w:type="dxa" w:w="1440"/>
+            <w:tcW w:type="dxa" w:w="1450"/>
             <w:tcBorders>
               <w:top w:val="single" w:color="CFCFCF" w:sz="2"/>
               <w:left w:val="single" w:color="CFCFCF" w:sz="2"/>
@@ -2525,7 +3600,7 @@
         </w:tc>
         <w:tc>
           <w:tcPr>
-            <w:tcW w:type="dxa" w:w="2820"/>
+            <w:tcW w:type="dxa" w:w="1700"/>
             <w:tcBorders>
               <w:top w:val="single" w:color="CFCFCF" w:sz="2"/>
               <w:left w:val="single" w:color="CFCFCF" w:sz="2"/>
@@ -2554,13 +3629,13 @@
                 <w:sz w:val="20"/>
                 <w:szCs w:val="20"/>
               </w:rPr>
-              <w:t xml:space="preserve">Proposed design</w:t>
-            </w:r>
-          </w:p>
-        </w:tc>
-        <w:tc>
-          <w:tcPr>
-            <w:tcW w:type="dxa" w:w="4220"/>
+              <w:t xml:space="preserve">Proposed model(s)</w:t>
+            </w:r>
+          </w:p>
+        </w:tc>
+        <w:tc>
+          <w:tcPr>
+            <w:tcW w:type="dxa" w:w="2050"/>
             <w:tcBorders>
               <w:top w:val="single" w:color="CFCFCF" w:sz="2"/>
               <w:left w:val="single" w:color="CFCFCF" w:sz="2"/>
@@ -2589,13 +3664,13 @@
                 <w:sz w:val="20"/>
                 <w:szCs w:val="20"/>
               </w:rPr>
-              <w:t xml:space="preserve">Current reality (verified in code)</w:t>
-            </w:r>
-          </w:p>
-        </w:tc>
-        <w:tc>
-          <w:tcPr>
-            <w:tcW w:type="dxa" w:w="1600"/>
+              <w:t xml:space="preserve">Current model(s)</w:t>
+            </w:r>
+          </w:p>
+        </w:tc>
+        <w:tc>
+          <w:tcPr>
+            <w:tcW w:type="dxa" w:w="2450"/>
             <w:tcBorders>
               <w:top w:val="single" w:color="CFCFCF" w:sz="2"/>
               <w:left w:val="single" w:color="CFCFCF" w:sz="2"/>
@@ -2624,6 +3699,76 @@
                 <w:sz w:val="20"/>
                 <w:szCs w:val="20"/>
               </w:rPr>
+              <w:t xml:space="preserve">Recommended (Cloudflare, Jul 2026)</w:t>
+            </w:r>
+          </w:p>
+        </w:tc>
+        <w:tc>
+          <w:tcPr>
+            <w:tcW w:type="dxa" w:w="5350"/>
+            <w:tcBorders>
+              <w:top w:val="single" w:color="CFCFCF" w:sz="2"/>
+              <w:left w:val="single" w:color="CFCFCF" w:sz="2"/>
+              <w:bottom w:val="single" w:color="CFCFCF" w:sz="2"/>
+              <w:right w:val="single" w:color="CFCFCF" w:sz="2"/>
+            </w:tcBorders>
+            <w:shd w:fill="1F3864" w:val="clear"/>
+            <w:tcMar>
+              <w:top w:type="dxa" w:w="100"/>
+              <w:left w:type="dxa" w:w="140"/>
+              <w:bottom w:type="dxa" w:w="100"/>
+              <w:right w:type="dxa" w:w="140"/>
+            </w:tcMar>
+            <w:vAlign w:val="top"/>
+          </w:tcPr>
+          <w:p>
+            <w:pPr>
+              <w:spacing w:after="60" w:before="0"/>
+            </w:pPr>
+            <w:r>
+              <w:rPr>
+                <w:rFonts w:ascii="Arial" w:cs="Arial" w:eastAsia="Arial" w:hAnsi="Arial"/>
+                <w:b/>
+                <w:bCs/>
+                <w:color w:val="FFFFFF"/>
+                <w:sz w:val="20"/>
+                <w:szCs w:val="20"/>
+              </w:rPr>
+              <w:t xml:space="preserve">Notes — mechanism &amp; citations</w:t>
+            </w:r>
+          </w:p>
+        </w:tc>
+        <w:tc>
+          <w:tcPr>
+            <w:tcW w:type="dxa" w:w="1400"/>
+            <w:tcBorders>
+              <w:top w:val="single" w:color="CFCFCF" w:sz="2"/>
+              <w:left w:val="single" w:color="CFCFCF" w:sz="2"/>
+              <w:bottom w:val="single" w:color="CFCFCF" w:sz="2"/>
+              <w:right w:val="single" w:color="CFCFCF" w:sz="2"/>
+            </w:tcBorders>
+            <w:shd w:fill="1F3864" w:val="clear"/>
+            <w:tcMar>
+              <w:top w:type="dxa" w:w="100"/>
+              <w:left w:type="dxa" w:w="140"/>
+              <w:bottom w:type="dxa" w:w="100"/>
+              <w:right w:type="dxa" w:w="140"/>
+            </w:tcMar>
+            <w:vAlign w:val="top"/>
+          </w:tcPr>
+          <w:p>
+            <w:pPr>
+              <w:spacing w:after="60" w:before="0"/>
+            </w:pPr>
+            <w:r>
+              <w:rPr>
+                <w:rFonts w:ascii="Arial" w:cs="Arial" w:eastAsia="Arial" w:hAnsi="Arial"/>
+                <w:b/>
+                <w:bCs/>
+                <w:color w:val="FFFFFF"/>
+                <w:sz w:val="20"/>
+                <w:szCs w:val="20"/>
+              </w:rPr>
               <w:t xml:space="preserve">Status</w:t>
             </w:r>
           </w:p>
@@ -2632,7 +3777,7 @@
       <w:tr>
         <w:tc>
           <w:tcPr>
-            <w:tcW w:type="dxa" w:w="1440"/>
+            <w:tcW w:type="dxa" w:w="1450"/>
             <w:tcBorders>
               <w:top w:val="single" w:color="CFCFCF" w:sz="2"/>
               <w:left w:val="single" w:color="CFCFCF" w:sz="2"/>
@@ -2667,21 +3812,137 @@
         </w:tc>
         <w:tc>
           <w:tcPr>
-            <w:tcW w:type="dxa" w:w="2820"/>
-            <w:tcBorders>
-              <w:top w:val="single" w:color="CFCFCF" w:sz="2"/>
-              <w:left w:val="single" w:color="CFCFCF" w:sz="2"/>
-              <w:bottom w:val="single" w:color="CFCFCF" w:sz="2"/>
-              <w:right w:val="single" w:color="CFCFCF" w:sz="2"/>
-            </w:tcBorders>
-            <w:tcMar>
-              <w:top w:type="dxa" w:w="100"/>
-              <w:left w:type="dxa" w:w="140"/>
-              <w:bottom w:type="dxa" w:w="100"/>
-              <w:right w:type="dxa" w:w="140"/>
-            </w:tcMar>
-            <w:vAlign w:val="top"/>
-          </w:tcPr>
+            <w:tcW w:type="dxa" w:w="1700"/>
+            <w:tcBorders>
+              <w:top w:val="single" w:color="CFCFCF" w:sz="2"/>
+              <w:left w:val="single" w:color="CFCFCF" w:sz="2"/>
+              <w:bottom w:val="single" w:color="CFCFCF" w:sz="2"/>
+              <w:right w:val="single" w:color="CFCFCF" w:sz="2"/>
+            </w:tcBorders>
+            <w:shd w:fill="F7F2E8" w:val="clear"/>
+            <w:tcMar>
+              <w:top w:type="dxa" w:w="100"/>
+              <w:left w:type="dxa" w:w="140"/>
+              <w:bottom w:type="dxa" w:w="100"/>
+              <w:right w:type="dxa" w:w="140"/>
+            </w:tcMar>
+            <w:vAlign w:val="top"/>
+          </w:tcPr>
+          <w:p>
+            <w:pPr>
+              <w:spacing w:after="60" w:before="0"/>
+            </w:pPr>
+            <w:r>
+              <w:rPr>
+                <w:rFonts w:ascii="Arial" w:cs="Arial" w:eastAsia="Arial" w:hAnsi="Arial"/>
+                <w:i/>
+                <w:iCs/>
+                <w:sz w:val="17"/>
+                <w:szCs w:val="17"/>
+              </w:rPr>
+              <w:t xml:space="preserve">Not specified (Tier 1 / Tier 2 left blank).</w:t>
+            </w:r>
+          </w:p>
+        </w:tc>
+        <w:tc>
+          <w:tcPr>
+            <w:tcW w:type="dxa" w:w="2050"/>
+            <w:tcBorders>
+              <w:top w:val="single" w:color="CFCFCF" w:sz="2"/>
+              <w:left w:val="single" w:color="CFCFCF" w:sz="2"/>
+              <w:bottom w:val="single" w:color="CFCFCF" w:sz="2"/>
+              <w:right w:val="single" w:color="CFCFCF" w:sz="2"/>
+            </w:tcBorders>
+            <w:shd w:fill="EAF1F8" w:val="clear"/>
+            <w:tcMar>
+              <w:top w:type="dxa" w:w="100"/>
+              <w:left w:type="dxa" w:w="140"/>
+              <w:bottom w:type="dxa" w:w="100"/>
+              <w:right w:type="dxa" w:w="140"/>
+            </w:tcMar>
+            <w:vAlign w:val="top"/>
+          </w:tcPr>
+          <w:p>
+            <w:pPr>
+              <w:spacing w:after="60" w:before="0"/>
+            </w:pPr>
+            <w:r>
+              <w:rPr>
+                <w:rFonts w:ascii="Arial" w:cs="Arial" w:eastAsia="Arial" w:hAnsi="Arial"/>
+                <w:i/>
+                <w:iCs/>
+                <w:sz w:val="17"/>
+                <w:szCs w:val="17"/>
+              </w:rPr>
+              <w:t xml:space="preserve">@cf/meta/llama-3.2-3b-instruct</w:t>
+            </w:r>
+          </w:p>
+        </w:tc>
+        <w:tc>
+          <w:tcPr>
+            <w:tcW w:type="dxa" w:w="2450"/>
+            <w:tcBorders>
+              <w:top w:val="single" w:color="CFCFCF" w:sz="2"/>
+              <w:left w:val="single" w:color="CFCFCF" w:sz="2"/>
+              <w:bottom w:val="single" w:color="CFCFCF" w:sz="2"/>
+              <w:right w:val="single" w:color="CFCFCF" w:sz="2"/>
+            </w:tcBorders>
+            <w:shd w:fill="E3F0DE" w:val="clear"/>
+            <w:tcMar>
+              <w:top w:type="dxa" w:w="100"/>
+              <w:left w:type="dxa" w:w="140"/>
+              <w:bottom w:type="dxa" w:w="100"/>
+              <w:right w:type="dxa" w:w="140"/>
+            </w:tcMar>
+            <w:vAlign w:val="top"/>
+          </w:tcPr>
+          <w:p>
+            <w:pPr>
+              <w:spacing w:after="60" w:before="0"/>
+            </w:pPr>
+            <w:r>
+              <w:rPr>
+                <w:rFonts w:ascii="Arial" w:cs="Arial" w:eastAsia="Arial" w:hAnsi="Arial"/>
+                <w:sz w:val="17"/>
+                <w:szCs w:val="17"/>
+              </w:rPr>
+              <w:t xml:space="preserve">Keep llama-3.2-3b-instruct. @cf/ibm-granite/granite-4.0-h-micro is a newer small model tuned for structured/agentic output — worth benchmarking against it for this JSON-schema extraction task.</w:t>
+            </w:r>
+          </w:p>
+        </w:tc>
+        <w:tc>
+          <w:tcPr>
+            <w:tcW w:type="dxa" w:w="5350"/>
+            <w:tcBorders>
+              <w:top w:val="single" w:color="CFCFCF" w:sz="2"/>
+              <w:left w:val="single" w:color="CFCFCF" w:sz="2"/>
+              <w:bottom w:val="single" w:color="CFCFCF" w:sz="2"/>
+              <w:right w:val="single" w:color="CFCFCF" w:sz="2"/>
+            </w:tcBorders>
+            <w:tcMar>
+              <w:top w:type="dxa" w:w="100"/>
+              <w:left w:type="dxa" w:w="140"/>
+              <w:bottom w:type="dxa" w:w="100"/>
+              <w:right w:type="dxa" w:w="140"/>
+            </w:tcMar>
+            <w:vAlign w:val="top"/>
+          </w:tcPr>
+          <w:p>
+            <w:pPr>
+              <w:spacing w:after="20" w:before="0"/>
+            </w:pPr>
+            <w:r>
+              <w:rPr>
+                <w:rFonts w:ascii="Arial" w:cs="Arial" w:eastAsia="Arial" w:hAnsi="Arial"/>
+                <w:b/>
+                <w:bCs/>
+                <w:color w:val="8A6D1D"/>
+                <w:sz w:val="17"/>
+                <w:szCs w:val="17"/>
+              </w:rPr>
+              <w:t xml:space="preserve">Proposed</w:t>
+            </w:r>
+          </w:p>
           <w:p>
             <w:pPr>
               <w:spacing w:after="60" w:before="0"/>
@@ -2695,24 +3956,22 @@
               <w:t xml:space="preserve">Five sub-tasks (knowledge-graph updates, mood/emotion tagging, reaction interpretation, auto-episode tracking) collapsed into one JSON pass.</w:t>
             </w:r>
           </w:p>
-        </w:tc>
-        <w:tc>
-          <w:tcPr>
-            <w:tcW w:type="dxa" w:w="4220"/>
-            <w:tcBorders>
-              <w:top w:val="single" w:color="CFCFCF" w:sz="2"/>
-              <w:left w:val="single" w:color="CFCFCF" w:sz="2"/>
-              <w:bottom w:val="single" w:color="CFCFCF" w:sz="2"/>
-              <w:right w:val="single" w:color="CFCFCF" w:sz="2"/>
-            </w:tcBorders>
-            <w:tcMar>
-              <w:top w:type="dxa" w:w="100"/>
-              <w:left w:type="dxa" w:w="140"/>
-              <w:bottom w:type="dxa" w:w="100"/>
-              <w:right w:type="dxa" w:w="140"/>
-            </w:tcMar>
-            <w:vAlign w:val="top"/>
-          </w:tcPr>
+          <w:p>
+            <w:pPr>
+              <w:spacing w:after="20" w:before="40"/>
+            </w:pPr>
+            <w:r>
+              <w:rPr>
+                <w:rFonts w:ascii="Arial" w:cs="Arial" w:eastAsia="Arial" w:hAnsi="Arial"/>
+                <w:b/>
+                <w:bCs/>
+                <w:color w:val="1F4E79"/>
+                <w:sz w:val="17"/>
+                <w:szCs w:val="17"/>
+              </w:rPr>
+              <w:t xml:space="preserve">Current</w:t>
+            </w:r>
+          </w:p>
           <w:p>
             <w:pPr>
               <w:spacing w:after="60" w:before="0"/>
@@ -2768,7 +4027,7 @@
         </w:tc>
         <w:tc>
           <w:tcPr>
-            <w:tcW w:type="dxa" w:w="1600"/>
+            <w:tcW w:type="dxa" w:w="1400"/>
             <w:tcBorders>
               <w:top w:val="single" w:color="CFCFCF" w:sz="2"/>
               <w:left w:val="single" w:color="CFCFCF" w:sz="2"/>
@@ -2805,7 +4064,7 @@
       <w:tr>
         <w:tc>
           <w:tcPr>
-            <w:tcW w:type="dxa" w:w="1440"/>
+            <w:tcW w:type="dxa" w:w="1450"/>
             <w:tcBorders>
               <w:top w:val="single" w:color="CFCFCF" w:sz="2"/>
               <w:left w:val="single" w:color="CFCFCF" w:sz="2"/>
@@ -2840,21 +4099,137 @@
         </w:tc>
         <w:tc>
           <w:tcPr>
-            <w:tcW w:type="dxa" w:w="2820"/>
-            <w:tcBorders>
-              <w:top w:val="single" w:color="CFCFCF" w:sz="2"/>
-              <w:left w:val="single" w:color="CFCFCF" w:sz="2"/>
-              <w:bottom w:val="single" w:color="CFCFCF" w:sz="2"/>
-              <w:right w:val="single" w:color="CFCFCF" w:sz="2"/>
-            </w:tcBorders>
-            <w:tcMar>
-              <w:top w:type="dxa" w:w="100"/>
-              <w:left w:type="dxa" w:w="140"/>
-              <w:bottom w:type="dxa" w:w="100"/>
-              <w:right w:type="dxa" w:w="140"/>
-            </w:tcMar>
-            <w:vAlign w:val="top"/>
-          </w:tcPr>
+            <w:tcW w:type="dxa" w:w="1700"/>
+            <w:tcBorders>
+              <w:top w:val="single" w:color="CFCFCF" w:sz="2"/>
+              <w:left w:val="single" w:color="CFCFCF" w:sz="2"/>
+              <w:bottom w:val="single" w:color="CFCFCF" w:sz="2"/>
+              <w:right w:val="single" w:color="CFCFCF" w:sz="2"/>
+            </w:tcBorders>
+            <w:shd w:fill="F7F2E8" w:val="clear"/>
+            <w:tcMar>
+              <w:top w:type="dxa" w:w="100"/>
+              <w:left w:type="dxa" w:w="140"/>
+              <w:bottom w:type="dxa" w:w="100"/>
+              <w:right w:type="dxa" w:w="140"/>
+            </w:tcMar>
+            <w:vAlign w:val="top"/>
+          </w:tcPr>
+          <w:p>
+            <w:pPr>
+              <w:spacing w:after="60" w:before="0"/>
+            </w:pPr>
+            <w:r>
+              <w:rPr>
+                <w:rFonts w:ascii="Arial" w:cs="Arial" w:eastAsia="Arial" w:hAnsi="Arial"/>
+                <w:i/>
+                <w:iCs/>
+                <w:sz w:val="17"/>
+                <w:szCs w:val="17"/>
+              </w:rPr>
+              <w:t xml:space="preserve">gemini-embedding-2 — the only layer where the proposal names an actual model.</w:t>
+            </w:r>
+          </w:p>
+        </w:tc>
+        <w:tc>
+          <w:tcPr>
+            <w:tcW w:type="dxa" w:w="2050"/>
+            <w:tcBorders>
+              <w:top w:val="single" w:color="CFCFCF" w:sz="2"/>
+              <w:left w:val="single" w:color="CFCFCF" w:sz="2"/>
+              <w:bottom w:val="single" w:color="CFCFCF" w:sz="2"/>
+              <w:right w:val="single" w:color="CFCFCF" w:sz="2"/>
+            </w:tcBorders>
+            <w:shd w:fill="EAF1F8" w:val="clear"/>
+            <w:tcMar>
+              <w:top w:type="dxa" w:w="100"/>
+              <w:left w:type="dxa" w:w="140"/>
+              <w:bottom w:type="dxa" w:w="100"/>
+              <w:right w:type="dxa" w:w="140"/>
+            </w:tcMar>
+            <w:vAlign w:val="top"/>
+          </w:tcPr>
+          <w:p>
+            <w:pPr>
+              <w:spacing w:after="60" w:before="0"/>
+            </w:pPr>
+            <w:r>
+              <w:rPr>
+                <w:rFonts w:ascii="Arial" w:cs="Arial" w:eastAsia="Arial" w:hAnsi="Arial"/>
+                <w:i/>
+                <w:iCs/>
+                <w:sz w:val="17"/>
+                <w:szCs w:val="17"/>
+              </w:rPr>
+              <w:t xml:space="preserve">@cf/qwen/qwen3-embedding-0.6b, plus @cf/baai/bge-reranker-base at retrieval time</w:t>
+            </w:r>
+          </w:p>
+        </w:tc>
+        <w:tc>
+          <w:tcPr>
+            <w:tcW w:type="dxa" w:w="2450"/>
+            <w:tcBorders>
+              <w:top w:val="single" w:color="CFCFCF" w:sz="2"/>
+              <w:left w:val="single" w:color="CFCFCF" w:sz="2"/>
+              <w:bottom w:val="single" w:color="CFCFCF" w:sz="2"/>
+              <w:right w:val="single" w:color="CFCFCF" w:sz="2"/>
+            </w:tcBorders>
+            <w:shd w:fill="E3F0DE" w:val="clear"/>
+            <w:tcMar>
+              <w:top w:type="dxa" w:w="100"/>
+              <w:left w:type="dxa" w:w="140"/>
+              <w:bottom w:type="dxa" w:w="100"/>
+              <w:right w:type="dxa" w:w="140"/>
+            </w:tcMar>
+            <w:vAlign w:val="top"/>
+          </w:tcPr>
+          <w:p>
+            <w:pPr>
+              <w:spacing w:after="60" w:before="0"/>
+            </w:pPr>
+            <w:r>
+              <w:rPr>
+                <w:rFonts w:ascii="Arial" w:cs="Arial" w:eastAsia="Arial" w:hAnsi="Arial"/>
+                <w:sz w:val="17"/>
+                <w:szCs w:val="17"/>
+              </w:rPr>
+              <w:t xml:space="preserve">Keep qwen3-embedding-0.6b — already the newest embedding model on Workers AI (Nov 2025). No Cloudflare-hosted multimodal (image/audio) embedding model exists today, so the proposal’s multimodal-embedding requirement genuinely can’t be met on this platform yet. Reranker: no newer alternative to bge-reranker-base currently listed.</w:t>
+            </w:r>
+          </w:p>
+        </w:tc>
+        <w:tc>
+          <w:tcPr>
+            <w:tcW w:type="dxa" w:w="5350"/>
+            <w:tcBorders>
+              <w:top w:val="single" w:color="CFCFCF" w:sz="2"/>
+              <w:left w:val="single" w:color="CFCFCF" w:sz="2"/>
+              <w:bottom w:val="single" w:color="CFCFCF" w:sz="2"/>
+              <w:right w:val="single" w:color="CFCFCF" w:sz="2"/>
+            </w:tcBorders>
+            <w:tcMar>
+              <w:top w:type="dxa" w:w="100"/>
+              <w:left w:type="dxa" w:w="140"/>
+              <w:bottom w:type="dxa" w:w="100"/>
+              <w:right w:type="dxa" w:w="140"/>
+            </w:tcMar>
+            <w:vAlign w:val="top"/>
+          </w:tcPr>
+          <w:p>
+            <w:pPr>
+              <w:spacing w:after="20" w:before="0"/>
+            </w:pPr>
+            <w:r>
+              <w:rPr>
+                <w:rFonts w:ascii="Arial" w:cs="Arial" w:eastAsia="Arial" w:hAnsi="Arial"/>
+                <w:b/>
+                <w:bCs/>
+                <w:color w:val="8A6D1D"/>
+                <w:sz w:val="17"/>
+                <w:szCs w:val="17"/>
+              </w:rPr>
+              <w:t xml:space="preserve">Proposed</w:t>
+            </w:r>
+          </w:p>
           <w:p>
             <w:pPr>
               <w:spacing w:after="60" w:before="0"/>
@@ -2868,48 +4243,46 @@
               <w:t xml:space="preserve">gemini-embedding-2 — natively multimodal (text + image + audio), 3072-dimensional vectors.</w:t>
             </w:r>
           </w:p>
-        </w:tc>
-        <w:tc>
-          <w:tcPr>
-            <w:tcW w:type="dxa" w:w="4220"/>
-            <w:tcBorders>
-              <w:top w:val="single" w:color="CFCFCF" w:sz="2"/>
-              <w:left w:val="single" w:color="CFCFCF" w:sz="2"/>
-              <w:bottom w:val="single" w:color="CFCFCF" w:sz="2"/>
-              <w:right w:val="single" w:color="CFCFCF" w:sz="2"/>
-            </w:tcBorders>
-            <w:tcMar>
-              <w:top w:type="dxa" w:w="100"/>
-              <w:left w:type="dxa" w:w="140"/>
-              <w:bottom w:type="dxa" w:w="100"/>
-              <w:right w:type="dxa" w:w="140"/>
-            </w:tcMar>
-            <w:vAlign w:val="top"/>
-          </w:tcPr>
-          <w:p>
-            <w:pPr>
-              <w:spacing w:after="60" w:before="0"/>
-            </w:pPr>
-            <w:r>
-              <w:rPr>
-                <w:rFonts w:ascii="Arial" w:cs="Arial" w:eastAsia="Arial" w:hAnsi="Arial"/>
-                <w:sz w:val="18"/>
-                <w:szCs w:val="18"/>
-              </w:rPr>
-              <w:t xml:space="preserve">@cf/qwen/qwen3-embedding-0.6b via Cloudflare Vectorize — text only. Indexes memory “fact” strings (truncated to 200 characters; full text rehydrated from D1 on retrieval).</w:t>
-            </w:r>
-          </w:p>
-          <w:p>
-            <w:pPr>
-              <w:spacing w:after="60" w:before="0"/>
-            </w:pPr>
-            <w:r>
-              <w:rPr>
-                <w:rFonts w:ascii="Arial" w:cs="Arial" w:eastAsia="Arial" w:hAnsi="Arial"/>
-                <w:sz w:val="18"/>
-                <w:szCs w:val="18"/>
-              </w:rPr>
-              <w:t xml:space="preserve">A reranker (@cf/baai/bge-reranker-base) also runs at retrieval time — an extra stage the proposal doesn’t mention at all.</w:t>
+          <w:p>
+            <w:pPr>
+              <w:spacing w:after="20" w:before="40"/>
+            </w:pPr>
+            <w:r>
+              <w:rPr>
+                <w:rFonts w:ascii="Arial" w:cs="Arial" w:eastAsia="Arial" w:hAnsi="Arial"/>
+                <w:b/>
+                <w:bCs/>
+                <w:color w:val="1F4E79"/>
+                <w:sz w:val="17"/>
+                <w:szCs w:val="17"/>
+              </w:rPr>
+              <w:t xml:space="preserve">Current</w:t>
+            </w:r>
+          </w:p>
+          <w:p>
+            <w:pPr>
+              <w:spacing w:after="60" w:before="0"/>
+            </w:pPr>
+            <w:r>
+              <w:rPr>
+                <w:rFonts w:ascii="Arial" w:cs="Arial" w:eastAsia="Arial" w:hAnsi="Arial"/>
+                <w:sz w:val="18"/>
+                <w:szCs w:val="18"/>
+              </w:rPr>
+              <w:t xml:space="preserve">Text only via Cloudflare Vectorize. Indexes memory “fact” strings (truncated to 200 characters; full text rehydrated from D1 on retrieval).</w:t>
+            </w:r>
+          </w:p>
+          <w:p>
+            <w:pPr>
+              <w:spacing w:after="60" w:before="0"/>
+            </w:pPr>
+            <w:r>
+              <w:rPr>
+                <w:rFonts w:ascii="Arial" w:cs="Arial" w:eastAsia="Arial" w:hAnsi="Arial"/>
+                <w:sz w:val="18"/>
+                <w:szCs w:val="18"/>
+              </w:rPr>
+              <w:t xml:space="preserve">The reranker is an extra stage the proposal doesn’t mention at all.</w:t>
             </w:r>
           </w:p>
           <w:p>
@@ -2941,7 +4314,7 @@
         </w:tc>
         <w:tc>
           <w:tcPr>
-            <w:tcW w:type="dxa" w:w="1600"/>
+            <w:tcW w:type="dxa" w:w="1400"/>
             <w:tcBorders>
               <w:top w:val="single" w:color="CFCFCF" w:sz="2"/>
               <w:left w:val="single" w:color="CFCFCF" w:sz="2"/>
@@ -2993,7 +4366,7 @@
     </w:p>
     <w:tbl>
       <w:tblPr>
-        <w:tblW w:type="dxa" w:w="10080"/>
+        <w:tblW w:type="dxa" w:w="14400"/>
         <w:tblBorders>
           <w:top w:val="single" w:color="auto" w:sz="4"/>
           <w:left w:val="single" w:color="auto" w:sz="4"/>
@@ -3004,10 +4377,12 @@
         </w:tblBorders>
       </w:tblPr>
       <w:tblGrid>
-        <w:gridCol w:w="1440"/>
-        <w:gridCol w:w="2820"/>
-        <w:gridCol w:w="4220"/>
-        <w:gridCol w:w="1600"/>
+        <w:gridCol w:w="1450"/>
+        <w:gridCol w:w="1700"/>
+        <w:gridCol w:w="2050"/>
+        <w:gridCol w:w="2450"/>
+        <w:gridCol w:w="5350"/>
+        <w:gridCol w:w="1400"/>
       </w:tblGrid>
       <w:tr>
         <w:trPr>
@@ -3015,7 +4390,7 @@
         </w:trPr>
         <w:tc>
           <w:tcPr>
-            <w:tcW w:type="dxa" w:w="1440"/>
+            <w:tcW w:type="dxa" w:w="1450"/>
             <w:tcBorders>
               <w:top w:val="single" w:color="CFCFCF" w:sz="2"/>
               <w:left w:val="single" w:color="CFCFCF" w:sz="2"/>
@@ -3050,7 +4425,7 @@
         </w:tc>
         <w:tc>
           <w:tcPr>
-            <w:tcW w:type="dxa" w:w="2820"/>
+            <w:tcW w:type="dxa" w:w="1700"/>
             <w:tcBorders>
               <w:top w:val="single" w:color="CFCFCF" w:sz="2"/>
               <w:left w:val="single" w:color="CFCFCF" w:sz="2"/>
@@ -3079,13 +4454,13 @@
                 <w:sz w:val="20"/>
                 <w:szCs w:val="20"/>
               </w:rPr>
-              <w:t xml:space="preserve">Proposed design</w:t>
-            </w:r>
-          </w:p>
-        </w:tc>
-        <w:tc>
-          <w:tcPr>
-            <w:tcW w:type="dxa" w:w="4220"/>
+              <w:t xml:space="preserve">Proposed model(s)</w:t>
+            </w:r>
+          </w:p>
+        </w:tc>
+        <w:tc>
+          <w:tcPr>
+            <w:tcW w:type="dxa" w:w="2050"/>
             <w:tcBorders>
               <w:top w:val="single" w:color="CFCFCF" w:sz="2"/>
               <w:left w:val="single" w:color="CFCFCF" w:sz="2"/>
@@ -3114,13 +4489,13 @@
                 <w:sz w:val="20"/>
                 <w:szCs w:val="20"/>
               </w:rPr>
-              <w:t xml:space="preserve">Current reality (verified in code)</w:t>
-            </w:r>
-          </w:p>
-        </w:tc>
-        <w:tc>
-          <w:tcPr>
-            <w:tcW w:type="dxa" w:w="1600"/>
+              <w:t xml:space="preserve">Current model(s)</w:t>
+            </w:r>
+          </w:p>
+        </w:tc>
+        <w:tc>
+          <w:tcPr>
+            <w:tcW w:type="dxa" w:w="2450"/>
             <w:tcBorders>
               <w:top w:val="single" w:color="CFCFCF" w:sz="2"/>
               <w:left w:val="single" w:color="CFCFCF" w:sz="2"/>
@@ -3149,6 +4524,76 @@
                 <w:sz w:val="20"/>
                 <w:szCs w:val="20"/>
               </w:rPr>
+              <w:t xml:space="preserve">Recommended (Cloudflare, Jul 2026)</w:t>
+            </w:r>
+          </w:p>
+        </w:tc>
+        <w:tc>
+          <w:tcPr>
+            <w:tcW w:type="dxa" w:w="5350"/>
+            <w:tcBorders>
+              <w:top w:val="single" w:color="CFCFCF" w:sz="2"/>
+              <w:left w:val="single" w:color="CFCFCF" w:sz="2"/>
+              <w:bottom w:val="single" w:color="CFCFCF" w:sz="2"/>
+              <w:right w:val="single" w:color="CFCFCF" w:sz="2"/>
+            </w:tcBorders>
+            <w:shd w:fill="1F3864" w:val="clear"/>
+            <w:tcMar>
+              <w:top w:type="dxa" w:w="100"/>
+              <w:left w:type="dxa" w:w="140"/>
+              <w:bottom w:type="dxa" w:w="100"/>
+              <w:right w:type="dxa" w:w="140"/>
+            </w:tcMar>
+            <w:vAlign w:val="top"/>
+          </w:tcPr>
+          <w:p>
+            <w:pPr>
+              <w:spacing w:after="60" w:before="0"/>
+            </w:pPr>
+            <w:r>
+              <w:rPr>
+                <w:rFonts w:ascii="Arial" w:cs="Arial" w:eastAsia="Arial" w:hAnsi="Arial"/>
+                <w:b/>
+                <w:bCs/>
+                <w:color w:val="FFFFFF"/>
+                <w:sz w:val="20"/>
+                <w:szCs w:val="20"/>
+              </w:rPr>
+              <w:t xml:space="preserve">Notes — mechanism &amp; citations</w:t>
+            </w:r>
+          </w:p>
+        </w:tc>
+        <w:tc>
+          <w:tcPr>
+            <w:tcW w:type="dxa" w:w="1400"/>
+            <w:tcBorders>
+              <w:top w:val="single" w:color="CFCFCF" w:sz="2"/>
+              <w:left w:val="single" w:color="CFCFCF" w:sz="2"/>
+              <w:bottom w:val="single" w:color="CFCFCF" w:sz="2"/>
+              <w:right w:val="single" w:color="CFCFCF" w:sz="2"/>
+            </w:tcBorders>
+            <w:shd w:fill="1F3864" w:val="clear"/>
+            <w:tcMar>
+              <w:top w:type="dxa" w:w="100"/>
+              <w:left w:type="dxa" w:w="140"/>
+              <w:bottom w:type="dxa" w:w="100"/>
+              <w:right w:type="dxa" w:w="140"/>
+            </w:tcMar>
+            <w:vAlign w:val="top"/>
+          </w:tcPr>
+          <w:p>
+            <w:pPr>
+              <w:spacing w:after="60" w:before="0"/>
+            </w:pPr>
+            <w:r>
+              <w:rPr>
+                <w:rFonts w:ascii="Arial" w:cs="Arial" w:eastAsia="Arial" w:hAnsi="Arial"/>
+                <w:b/>
+                <w:bCs/>
+                <w:color w:val="FFFFFF"/>
+                <w:sz w:val="20"/>
+                <w:szCs w:val="20"/>
+              </w:rPr>
               <w:t xml:space="preserve">Status</w:t>
             </w:r>
           </w:p>
@@ -3157,7 +4602,7 @@
       <w:tr>
         <w:tc>
           <w:tcPr>
-            <w:tcW w:type="dxa" w:w="1440"/>
+            <w:tcW w:type="dxa" w:w="1450"/>
             <w:tcBorders>
               <w:top w:val="single" w:color="CFCFCF" w:sz="2"/>
               <w:left w:val="single" w:color="CFCFCF" w:sz="2"/>
@@ -3192,21 +4637,137 @@
         </w:tc>
         <w:tc>
           <w:tcPr>
-            <w:tcW w:type="dxa" w:w="2820"/>
-            <w:tcBorders>
-              <w:top w:val="single" w:color="CFCFCF" w:sz="2"/>
-              <w:left w:val="single" w:color="CFCFCF" w:sz="2"/>
-              <w:bottom w:val="single" w:color="CFCFCF" w:sz="2"/>
-              <w:right w:val="single" w:color="CFCFCF" w:sz="2"/>
-            </w:tcBorders>
-            <w:tcMar>
-              <w:top w:type="dxa" w:w="100"/>
-              <w:left w:type="dxa" w:w="140"/>
-              <w:bottom w:type="dxa" w:w="100"/>
-              <w:right w:type="dxa" w:w="140"/>
-            </w:tcMar>
-            <w:vAlign w:val="top"/>
-          </w:tcPr>
+            <w:tcW w:type="dxa" w:w="1700"/>
+            <w:tcBorders>
+              <w:top w:val="single" w:color="CFCFCF" w:sz="2"/>
+              <w:left w:val="single" w:color="CFCFCF" w:sz="2"/>
+              <w:bottom w:val="single" w:color="CFCFCF" w:sz="2"/>
+              <w:right w:val="single" w:color="CFCFCF" w:sz="2"/>
+            </w:tcBorders>
+            <w:shd w:fill="F7F2E8" w:val="clear"/>
+            <w:tcMar>
+              <w:top w:type="dxa" w:w="100"/>
+              <w:left w:type="dxa" w:w="140"/>
+              <w:bottom w:type="dxa" w:w="100"/>
+              <w:right w:type="dxa" w:w="140"/>
+            </w:tcMar>
+            <w:vAlign w:val="top"/>
+          </w:tcPr>
+          <w:p>
+            <w:pPr>
+              <w:spacing w:after="60" w:before="0"/>
+            </w:pPr>
+            <w:r>
+              <w:rPr>
+                <w:rFonts w:ascii="Arial" w:cs="Arial" w:eastAsia="Arial" w:hAnsi="Arial"/>
+                <w:i/>
+                <w:iCs/>
+                <w:sz w:val="17"/>
+                <w:szCs w:val="17"/>
+              </w:rPr>
+              <w:t xml:space="preserve">Not specified (Tier 1 / Tier 2 left blank).</w:t>
+            </w:r>
+          </w:p>
+        </w:tc>
+        <w:tc>
+          <w:tcPr>
+            <w:tcW w:type="dxa" w:w="2050"/>
+            <w:tcBorders>
+              <w:top w:val="single" w:color="CFCFCF" w:sz="2"/>
+              <w:left w:val="single" w:color="CFCFCF" w:sz="2"/>
+              <w:bottom w:val="single" w:color="CFCFCF" w:sz="2"/>
+              <w:right w:val="single" w:color="CFCFCF" w:sz="2"/>
+            </w:tcBorders>
+            <w:shd w:fill="EAF1F8" w:val="clear"/>
+            <w:tcMar>
+              <w:top w:type="dxa" w:w="100"/>
+              <w:left w:type="dxa" w:w="140"/>
+              <w:bottom w:type="dxa" w:w="100"/>
+              <w:right w:type="dxa" w:w="140"/>
+            </w:tcMar>
+            <w:vAlign w:val="top"/>
+          </w:tcPr>
+          <w:p>
+            <w:pPr>
+              <w:spacing w:after="60" w:before="0"/>
+            </w:pPr>
+            <w:r>
+              <w:rPr>
+                <w:rFonts w:ascii="Arial" w:cs="Arial" w:eastAsia="Arial" w:hAnsi="Arial"/>
+                <w:i/>
+                <w:iCs/>
+                <w:sz w:val="17"/>
+                <w:szCs w:val="17"/>
+              </w:rPr>
+              <w:t xml:space="preserve">None — this job does not exist.</w:t>
+            </w:r>
+          </w:p>
+        </w:tc>
+        <w:tc>
+          <w:tcPr>
+            <w:tcW w:type="dxa" w:w="2450"/>
+            <w:tcBorders>
+              <w:top w:val="single" w:color="CFCFCF" w:sz="2"/>
+              <w:left w:val="single" w:color="CFCFCF" w:sz="2"/>
+              <w:bottom w:val="single" w:color="CFCFCF" w:sz="2"/>
+              <w:right w:val="single" w:color="CFCFCF" w:sz="2"/>
+            </w:tcBorders>
+            <w:shd w:fill="E3F0DE" w:val="clear"/>
+            <w:tcMar>
+              <w:top w:type="dxa" w:w="100"/>
+              <w:left w:type="dxa" w:w="140"/>
+              <w:bottom w:type="dxa" w:w="100"/>
+              <w:right w:type="dxa" w:w="140"/>
+            </w:tcMar>
+            <w:vAlign w:val="top"/>
+          </w:tcPr>
+          <w:p>
+            <w:pPr>
+              <w:spacing w:after="60" w:before="0"/>
+            </w:pPr>
+            <w:r>
+              <w:rPr>
+                <w:rFonts w:ascii="Arial" w:cs="Arial" w:eastAsia="Arial" w:hAnsi="Arial"/>
+                <w:sz w:val="17"/>
+                <w:szCs w:val="17"/>
+              </w:rPr>
+              <w:t xml:space="preserve">If built: @cf/google/gemma-4-26b-a4b-it (256k context + reasoning) suits a periodic, longer-context emotional-trend synthesis task better than the 3B triage model used elsewhere in the system.</w:t>
+            </w:r>
+          </w:p>
+        </w:tc>
+        <w:tc>
+          <w:tcPr>
+            <w:tcW w:type="dxa" w:w="5350"/>
+            <w:tcBorders>
+              <w:top w:val="single" w:color="CFCFCF" w:sz="2"/>
+              <w:left w:val="single" w:color="CFCFCF" w:sz="2"/>
+              <w:bottom w:val="single" w:color="CFCFCF" w:sz="2"/>
+              <w:right w:val="single" w:color="CFCFCF" w:sz="2"/>
+            </w:tcBorders>
+            <w:tcMar>
+              <w:top w:type="dxa" w:w="100"/>
+              <w:left w:type="dxa" w:w="140"/>
+              <w:bottom w:type="dxa" w:w="100"/>
+              <w:right w:type="dxa" w:w="140"/>
+            </w:tcMar>
+            <w:vAlign w:val="top"/>
+          </w:tcPr>
+          <w:p>
+            <w:pPr>
+              <w:spacing w:after="20" w:before="0"/>
+            </w:pPr>
+            <w:r>
+              <w:rPr>
+                <w:rFonts w:ascii="Arial" w:cs="Arial" w:eastAsia="Arial" w:hAnsi="Arial"/>
+                <w:b/>
+                <w:bCs/>
+                <w:color w:val="8A6D1D"/>
+                <w:sz w:val="17"/>
+                <w:szCs w:val="17"/>
+              </w:rPr>
+              <w:t xml:space="preserve">Proposed</w:t>
+            </w:r>
+          </w:p>
           <w:p>
             <w:pPr>
               <w:spacing w:after="60" w:before="0"/>
@@ -3220,24 +4781,22 @@
               <w:t xml:space="preserve">Daily job reviewing day-long conversational blocks to trace emotional trends and defence mechanisms.</w:t>
             </w:r>
           </w:p>
-        </w:tc>
-        <w:tc>
-          <w:tcPr>
-            <w:tcW w:type="dxa" w:w="4220"/>
-            <w:tcBorders>
-              <w:top w:val="single" w:color="CFCFCF" w:sz="2"/>
-              <w:left w:val="single" w:color="CFCFCF" w:sz="2"/>
-              <w:bottom w:val="single" w:color="CFCFCF" w:sz="2"/>
-              <w:right w:val="single" w:color="CFCFCF" w:sz="2"/>
-            </w:tcBorders>
-            <w:tcMar>
-              <w:top w:type="dxa" w:w="100"/>
-              <w:left w:type="dxa" w:w="140"/>
-              <w:bottom w:type="dxa" w:w="100"/>
-              <w:right w:type="dxa" w:w="140"/>
-            </w:tcMar>
-            <w:vAlign w:val="top"/>
-          </w:tcPr>
+          <w:p>
+            <w:pPr>
+              <w:spacing w:after="20" w:before="40"/>
+            </w:pPr>
+            <w:r>
+              <w:rPr>
+                <w:rFonts w:ascii="Arial" w:cs="Arial" w:eastAsia="Arial" w:hAnsi="Arial"/>
+                <w:b/>
+                <w:bCs/>
+                <w:color w:val="1F4E79"/>
+                <w:sz w:val="17"/>
+                <w:szCs w:val="17"/>
+              </w:rPr>
+              <w:t xml:space="preserve">Current</w:t>
+            </w:r>
+          </w:p>
           <w:p>
             <w:pPr>
               <w:spacing w:after="60" w:before="0"/>
@@ -3293,7 +4852,7 @@
         </w:tc>
         <w:tc>
           <w:tcPr>
-            <w:tcW w:type="dxa" w:w="1600"/>
+            <w:tcW w:type="dxa" w:w="1400"/>
             <w:tcBorders>
               <w:top w:val="single" w:color="CFCFCF" w:sz="2"/>
               <w:left w:val="single" w:color="CFCFCF" w:sz="2"/>
@@ -3330,7 +4889,7 @@
       <w:tr>
         <w:tc>
           <w:tcPr>
-            <w:tcW w:type="dxa" w:w="1440"/>
+            <w:tcW w:type="dxa" w:w="1450"/>
             <w:tcBorders>
               <w:top w:val="single" w:color="CFCFCF" w:sz="2"/>
               <w:left w:val="single" w:color="CFCFCF" w:sz="2"/>
@@ -3365,21 +4924,152 @@
         </w:tc>
         <w:tc>
           <w:tcPr>
-            <w:tcW w:type="dxa" w:w="2820"/>
-            <w:tcBorders>
-              <w:top w:val="single" w:color="CFCFCF" w:sz="2"/>
-              <w:left w:val="single" w:color="CFCFCF" w:sz="2"/>
-              <w:bottom w:val="single" w:color="CFCFCF" w:sz="2"/>
-              <w:right w:val="single" w:color="CFCFCF" w:sz="2"/>
-            </w:tcBorders>
-            <w:tcMar>
-              <w:top w:type="dxa" w:w="100"/>
-              <w:left w:type="dxa" w:w="140"/>
-              <w:bottom w:type="dxa" w:w="100"/>
-              <w:right w:type="dxa" w:w="140"/>
-            </w:tcMar>
-            <w:vAlign w:val="top"/>
-          </w:tcPr>
+            <w:tcW w:type="dxa" w:w="1700"/>
+            <w:tcBorders>
+              <w:top w:val="single" w:color="CFCFCF" w:sz="2"/>
+              <w:left w:val="single" w:color="CFCFCF" w:sz="2"/>
+              <w:bottom w:val="single" w:color="CFCFCF" w:sz="2"/>
+              <w:right w:val="single" w:color="CFCFCF" w:sz="2"/>
+            </w:tcBorders>
+            <w:shd w:fill="F7F2E8" w:val="clear"/>
+            <w:tcMar>
+              <w:top w:type="dxa" w:w="100"/>
+              <w:left w:type="dxa" w:w="140"/>
+              <w:bottom w:type="dxa" w:w="100"/>
+              <w:right w:type="dxa" w:w="140"/>
+            </w:tcMar>
+            <w:vAlign w:val="top"/>
+          </w:tcPr>
+          <w:p>
+            <w:pPr>
+              <w:spacing w:after="60" w:before="0"/>
+            </w:pPr>
+            <w:r>
+              <w:rPr>
+                <w:rFonts w:ascii="Arial" w:cs="Arial" w:eastAsia="Arial" w:hAnsi="Arial"/>
+                <w:i/>
+                <w:iCs/>
+                <w:sz w:val="17"/>
+                <w:szCs w:val="17"/>
+              </w:rPr>
+              <w:t xml:space="preserve">Not specified (Tier 1 / Tier 2 left blank).</w:t>
+            </w:r>
+          </w:p>
+        </w:tc>
+        <w:tc>
+          <w:tcPr>
+            <w:tcW w:type="dxa" w:w="2050"/>
+            <w:tcBorders>
+              <w:top w:val="single" w:color="CFCFCF" w:sz="2"/>
+              <w:left w:val="single" w:color="CFCFCF" w:sz="2"/>
+              <w:bottom w:val="single" w:color="CFCFCF" w:sz="2"/>
+              <w:right w:val="single" w:color="CFCFCF" w:sz="2"/>
+            </w:tcBorders>
+            <w:shd w:fill="EAF1F8" w:val="clear"/>
+            <w:tcMar>
+              <w:top w:type="dxa" w:w="100"/>
+              <w:left w:type="dxa" w:w="140"/>
+              <w:bottom w:type="dxa" w:w="100"/>
+              <w:right w:type="dxa" w:w="140"/>
+            </w:tcMar>
+            <w:vAlign w:val="top"/>
+          </w:tcPr>
+          <w:p>
+            <w:pPr>
+              <w:spacing w:after="60" w:before="0"/>
+            </w:pPr>
+            <w:r>
+              <w:rPr>
+                <w:rFonts w:ascii="Arial" w:cs="Arial" w:eastAsia="Arial" w:hAnsi="Arial"/>
+                <w:i/>
+                <w:iCs/>
+                <w:sz w:val="17"/>
+                <w:szCs w:val="17"/>
+              </w:rPr>
+              <w:t xml:space="preserve">@cf/zai-org/glm-4.7-flash (monthly dedup pass) + Gemini API (consolidation pass)</w:t>
+            </w:r>
+          </w:p>
+          <w:p>
+            <w:pPr>
+              <w:spacing w:after="60" w:before="0"/>
+            </w:pPr>
+            <w:r>
+              <w:rPr>
+                <w:rFonts w:ascii="Arial" w:cs="Arial" w:eastAsia="Arial" w:hAnsi="Arial"/>
+                <w:i/>
+                <w:iCs/>
+                <w:sz w:val="17"/>
+                <w:szCs w:val="17"/>
+              </w:rPr>
+              <w:t xml:space="preserve">Real-time supersession itself is deterministic code — no model call.</w:t>
+            </w:r>
+          </w:p>
+        </w:tc>
+        <w:tc>
+          <w:tcPr>
+            <w:tcW w:type="dxa" w:w="2450"/>
+            <w:tcBorders>
+              <w:top w:val="single" w:color="CFCFCF" w:sz="2"/>
+              <w:left w:val="single" w:color="CFCFCF" w:sz="2"/>
+              <w:bottom w:val="single" w:color="CFCFCF" w:sz="2"/>
+              <w:right w:val="single" w:color="CFCFCF" w:sz="2"/>
+            </w:tcBorders>
+            <w:shd w:fill="E3F0DE" w:val="clear"/>
+            <w:tcMar>
+              <w:top w:type="dxa" w:w="100"/>
+              <w:left w:type="dxa" w:w="140"/>
+              <w:bottom w:type="dxa" w:w="100"/>
+              <w:right w:type="dxa" w:w="140"/>
+            </w:tcMar>
+            <w:vAlign w:val="top"/>
+          </w:tcPr>
+          <w:p>
+            <w:pPr>
+              <w:spacing w:after="60" w:before="0"/>
+            </w:pPr>
+            <w:r>
+              <w:rPr>
+                <w:rFonts w:ascii="Arial" w:cs="Arial" w:eastAsia="Arial" w:hAnsi="Arial"/>
+                <w:sz w:val="17"/>
+                <w:szCs w:val="17"/>
+              </w:rPr>
+              <w:t xml:space="preserve">Keep glm-4.7-flash for dedup — current, fast, good multilingual tool calling. Replace the Gemini consolidation-pass stage with gemma-4-26b-a4b-it or @cf/nvidia/nemotron-3-120b-a12b to finish the Cloudflare migration for this layer too.</w:t>
+            </w:r>
+          </w:p>
+        </w:tc>
+        <w:tc>
+          <w:tcPr>
+            <w:tcW w:type="dxa" w:w="5350"/>
+            <w:tcBorders>
+              <w:top w:val="single" w:color="CFCFCF" w:sz="2"/>
+              <w:left w:val="single" w:color="CFCFCF" w:sz="2"/>
+              <w:bottom w:val="single" w:color="CFCFCF" w:sz="2"/>
+              <w:right w:val="single" w:color="CFCFCF" w:sz="2"/>
+            </w:tcBorders>
+            <w:tcMar>
+              <w:top w:type="dxa" w:w="100"/>
+              <w:left w:type="dxa" w:w="140"/>
+              <w:bottom w:type="dxa" w:w="100"/>
+              <w:right w:type="dxa" w:w="140"/>
+            </w:tcMar>
+            <w:vAlign w:val="top"/>
+          </w:tcPr>
+          <w:p>
+            <w:pPr>
+              <w:spacing w:after="20" w:before="0"/>
+            </w:pPr>
+            <w:r>
+              <w:rPr>
+                <w:rFonts w:ascii="Arial" w:cs="Arial" w:eastAsia="Arial" w:hAnsi="Arial"/>
+                <w:b/>
+                <w:bCs/>
+                <w:color w:val="8A6D1D"/>
+                <w:sz w:val="17"/>
+                <w:szCs w:val="17"/>
+              </w:rPr>
+              <w:t xml:space="preserve">Proposed</w:t>
+            </w:r>
+          </w:p>
           <w:p>
             <w:pPr>
               <w:spacing w:after="60" w:before="0"/>
@@ -3393,35 +5083,33 @@
               <w:t xml:space="preserve">Scheduled scan across the knowledge graph and vector DB to resolve contradictions, deduplicate, and deprecate stale records.</w:t>
             </w:r>
           </w:p>
-        </w:tc>
-        <w:tc>
-          <w:tcPr>
-            <w:tcW w:type="dxa" w:w="4220"/>
-            <w:tcBorders>
-              <w:top w:val="single" w:color="CFCFCF" w:sz="2"/>
-              <w:left w:val="single" w:color="CFCFCF" w:sz="2"/>
-              <w:bottom w:val="single" w:color="CFCFCF" w:sz="2"/>
-              <w:right w:val="single" w:color="CFCFCF" w:sz="2"/>
-            </w:tcBorders>
-            <w:tcMar>
-              <w:top w:type="dxa" w:w="100"/>
-              <w:left w:type="dxa" w:w="140"/>
-              <w:bottom w:type="dxa" w:w="100"/>
-              <w:right w:type="dxa" w:w="140"/>
-            </w:tcMar>
-            <w:vAlign w:val="top"/>
-          </w:tcPr>
-          <w:p>
-            <w:pPr>
-              <w:spacing w:after="60" w:before="0"/>
-            </w:pPr>
-            <w:r>
-              <w:rPr>
-                <w:rFonts w:ascii="Arial" w:cs="Arial" w:eastAsia="Arial" w:hAnsi="Arial"/>
-                <w:sz w:val="18"/>
-                <w:szCs w:val="18"/>
-              </w:rPr>
-              <w:t xml:space="preserve">Two related mechanisms exist instead of one scheduled scan: (1) real-time supersession — when the AI’s memory-save tool detects a contradiction at write time, it flags the old row’s superseded_at field rather than deleting it; (2) a monthly consolidation workflow that runs a scheduled dedup pass (model @cf/zai-org/glm-4.7-flash) plus a Gemini consolidation pass, on the 1st of the month at 03:00.</w:t>
+          <w:p>
+            <w:pPr>
+              <w:spacing w:after="20" w:before="40"/>
+            </w:pPr>
+            <w:r>
+              <w:rPr>
+                <w:rFonts w:ascii="Arial" w:cs="Arial" w:eastAsia="Arial" w:hAnsi="Arial"/>
+                <w:b/>
+                <w:bCs/>
+                <w:color w:val="1F4E79"/>
+                <w:sz w:val="17"/>
+                <w:szCs w:val="17"/>
+              </w:rPr>
+              <w:t xml:space="preserve">Current</w:t>
+            </w:r>
+          </w:p>
+          <w:p>
+            <w:pPr>
+              <w:spacing w:after="60" w:before="0"/>
+            </w:pPr>
+            <w:r>
+              <w:rPr>
+                <w:rFonts w:ascii="Arial" w:cs="Arial" w:eastAsia="Arial" w:hAnsi="Arial"/>
+                <w:sz w:val="18"/>
+                <w:szCs w:val="18"/>
+              </w:rPr>
+              <w:t xml:space="preserve">Two related mechanisms exist instead of one scheduled scan: (1) real-time supersession — when the AI’s memory-save tool detects a contradiction at write time, it flags the old row’s superseded_at field rather than deleting it; (2) a monthly consolidation workflow running on the 1st of the month at 03:00.</w:t>
             </w:r>
           </w:p>
           <w:p>
@@ -3453,7 +5141,7 @@
         </w:tc>
         <w:tc>
           <w:tcPr>
-            <w:tcW w:type="dxa" w:w="1600"/>
+            <w:tcW w:type="dxa" w:w="1400"/>
             <w:tcBorders>
               <w:top w:val="single" w:color="CFCFCF" w:sz="2"/>
               <w:left w:val="single" w:color="CFCFCF" w:sz="2"/>
@@ -3523,7 +5211,7 @@
     </w:p>
     <w:tbl>
       <w:tblPr>
-        <w:tblW w:type="dxa" w:w="10080"/>
+        <w:tblW w:type="dxa" w:w="14400"/>
         <w:tblBorders>
           <w:top w:val="single" w:color="auto" w:sz="4"/>
           <w:left w:val="single" w:color="auto" w:sz="4"/>
@@ -3534,14 +5222,14 @@
         </w:tblBorders>
       </w:tblPr>
       <w:tblGrid>
-        <w:gridCol w:w="2600"/>
-        <w:gridCol w:w="3480"/>
-        <w:gridCol w:w="4000"/>
+        <w:gridCol w:w="3200"/>
+        <w:gridCol w:w="4900"/>
+        <w:gridCol w:w="6300"/>
       </w:tblGrid>
       <w:tr>
         <w:tc>
           <w:tcPr>
-            <w:tcW w:type="dxa" w:w="2600"/>
+            <w:tcW w:type="dxa" w:w="3200"/>
             <w:tcBorders>
               <w:top w:val="single" w:color="CFCFCF" w:sz="2"/>
               <w:left w:val="single" w:color="CFCFCF" w:sz="2"/>
@@ -3576,7 +5264,7 @@
         </w:tc>
         <w:tc>
           <w:tcPr>
-            <w:tcW w:type="dxa" w:w="3480"/>
+            <w:tcW w:type="dxa" w:w="4900"/>
             <w:tcBorders>
               <w:top w:val="single" w:color="CFCFCF" w:sz="2"/>
               <w:left w:val="single" w:color="CFCFCF" w:sz="2"/>
@@ -3611,7 +5299,7 @@
         </w:tc>
         <w:tc>
           <w:tcPr>
-            <w:tcW w:type="dxa" w:w="4000"/>
+            <w:tcW w:type="dxa" w:w="6300"/>
             <w:tcBorders>
               <w:top w:val="single" w:color="CFCFCF" w:sz="2"/>
               <w:left w:val="single" w:color="CFCFCF" w:sz="2"/>
@@ -3648,7 +5336,7 @@
       <w:tr>
         <w:tc>
           <w:tcPr>
-            <w:tcW w:type="dxa" w:w="2600"/>
+            <w:tcW w:type="dxa" w:w="3200"/>
             <w:tcBorders>
               <w:top w:val="single" w:color="CFCFCF" w:sz="2"/>
               <w:left w:val="single" w:color="CFCFCF" w:sz="2"/>
@@ -3681,7 +5369,7 @@
         </w:tc>
         <w:tc>
           <w:tcPr>
-            <w:tcW w:type="dxa" w:w="3480"/>
+            <w:tcW w:type="dxa" w:w="4900"/>
             <w:tcBorders>
               <w:top w:val="single" w:color="CFCFCF" w:sz="2"/>
               <w:left w:val="single" w:color="CFCFCF" w:sz="2"/>
@@ -3714,7 +5402,7 @@
         </w:tc>
         <w:tc>
           <w:tcPr>
-            <w:tcW w:type="dxa" w:w="4000"/>
+            <w:tcW w:type="dxa" w:w="6300"/>
             <w:tcBorders>
               <w:top w:val="single" w:color="CFCFCF" w:sz="2"/>
               <w:left w:val="single" w:color="CFCFCF" w:sz="2"/>
@@ -3747,7 +5435,7 @@
       <w:tr>
         <w:tc>
           <w:tcPr>
-            <w:tcW w:type="dxa" w:w="2600"/>
+            <w:tcW w:type="dxa" w:w="3200"/>
             <w:tcBorders>
               <w:top w:val="single" w:color="CFCFCF" w:sz="2"/>
               <w:left w:val="single" w:color="CFCFCF" w:sz="2"/>
@@ -3780,7 +5468,7 @@
         </w:tc>
         <w:tc>
           <w:tcPr>
-            <w:tcW w:type="dxa" w:w="3480"/>
+            <w:tcW w:type="dxa" w:w="4900"/>
             <w:tcBorders>
               <w:top w:val="single" w:color="CFCFCF" w:sz="2"/>
               <w:left w:val="single" w:color="CFCFCF" w:sz="2"/>
@@ -3813,7 +5501,7 @@
         </w:tc>
         <w:tc>
           <w:tcPr>
-            <w:tcW w:type="dxa" w:w="4000"/>
+            <w:tcW w:type="dxa" w:w="6300"/>
             <w:tcBorders>
               <w:top w:val="single" w:color="CFCFCF" w:sz="2"/>
               <w:left w:val="single" w:color="CFCFCF" w:sz="2"/>
@@ -3846,7 +5534,7 @@
       <w:tr>
         <w:tc>
           <w:tcPr>
-            <w:tcW w:type="dxa" w:w="2600"/>
+            <w:tcW w:type="dxa" w:w="3200"/>
             <w:tcBorders>
               <w:top w:val="single" w:color="CFCFCF" w:sz="2"/>
               <w:left w:val="single" w:color="CFCFCF" w:sz="2"/>
@@ -3879,7 +5567,7 @@
         </w:tc>
         <w:tc>
           <w:tcPr>
-            <w:tcW w:type="dxa" w:w="3480"/>
+            <w:tcW w:type="dxa" w:w="4900"/>
             <w:tcBorders>
               <w:top w:val="single" w:color="CFCFCF" w:sz="2"/>
               <w:left w:val="single" w:color="CFCFCF" w:sz="2"/>
@@ -3912,7 +5600,7 @@
         </w:tc>
         <w:tc>
           <w:tcPr>
-            <w:tcW w:type="dxa" w:w="4000"/>
+            <w:tcW w:type="dxa" w:w="6300"/>
             <w:tcBorders>
               <w:top w:val="single" w:color="CFCFCF" w:sz="2"/>
               <w:left w:val="single" w:color="CFCFCF" w:sz="2"/>
@@ -3945,7 +5633,7 @@
       <w:tr>
         <w:tc>
           <w:tcPr>
-            <w:tcW w:type="dxa" w:w="2600"/>
+            <w:tcW w:type="dxa" w:w="3200"/>
             <w:tcBorders>
               <w:top w:val="single" w:color="CFCFCF" w:sz="2"/>
               <w:left w:val="single" w:color="CFCFCF" w:sz="2"/>
@@ -3978,7 +5666,7 @@
         </w:tc>
         <w:tc>
           <w:tcPr>
-            <w:tcW w:type="dxa" w:w="3480"/>
+            <w:tcW w:type="dxa" w:w="4900"/>
             <w:tcBorders>
               <w:top w:val="single" w:color="CFCFCF" w:sz="2"/>
               <w:left w:val="single" w:color="CFCFCF" w:sz="2"/>
@@ -4011,7 +5699,7 @@
         </w:tc>
         <w:tc>
           <w:tcPr>
-            <w:tcW w:type="dxa" w:w="4000"/>
+            <w:tcW w:type="dxa" w:w="6300"/>
             <w:tcBorders>
               <w:top w:val="single" w:color="CFCFCF" w:sz="2"/>
               <w:left w:val="single" w:color="CFCFCF" w:sz="2"/>
@@ -4044,7 +5732,7 @@
       <w:tr>
         <w:tc>
           <w:tcPr>
-            <w:tcW w:type="dxa" w:w="2600"/>
+            <w:tcW w:type="dxa" w:w="3200"/>
             <w:tcBorders>
               <w:top w:val="single" w:color="CFCFCF" w:sz="2"/>
               <w:left w:val="single" w:color="CFCFCF" w:sz="2"/>
@@ -4077,7 +5765,7 @@
         </w:tc>
         <w:tc>
           <w:tcPr>
-            <w:tcW w:type="dxa" w:w="3480"/>
+            <w:tcW w:type="dxa" w:w="4900"/>
             <w:tcBorders>
               <w:top w:val="single" w:color="CFCFCF" w:sz="2"/>
               <w:left w:val="single" w:color="CFCFCF" w:sz="2"/>
@@ -4110,7 +5798,7 @@
         </w:tc>
         <w:tc>
           <w:tcPr>
-            <w:tcW w:type="dxa" w:w="4000"/>
+            <w:tcW w:type="dxa" w:w="6300"/>
             <w:tcBorders>
               <w:top w:val="single" w:color="CFCFCF" w:sz="2"/>
               <w:left w:val="single" w:color="CFCFCF" w:sz="2"/>
@@ -4143,7 +5831,7 @@
       <w:tr>
         <w:tc>
           <w:tcPr>
-            <w:tcW w:type="dxa" w:w="2600"/>
+            <w:tcW w:type="dxa" w:w="3200"/>
             <w:tcBorders>
               <w:top w:val="single" w:color="CFCFCF" w:sz="2"/>
               <w:left w:val="single" w:color="CFCFCF" w:sz="2"/>
@@ -4176,7 +5864,7 @@
         </w:tc>
         <w:tc>
           <w:tcPr>
-            <w:tcW w:type="dxa" w:w="3480"/>
+            <w:tcW w:type="dxa" w:w="4900"/>
             <w:tcBorders>
               <w:top w:val="single" w:color="CFCFCF" w:sz="2"/>
               <w:left w:val="single" w:color="CFCFCF" w:sz="2"/>
@@ -4209,7 +5897,7 @@
         </w:tc>
         <w:tc>
           <w:tcPr>
-            <w:tcW w:type="dxa" w:w="4000"/>
+            <w:tcW w:type="dxa" w:w="6300"/>
             <w:tcBorders>
               <w:top w:val="single" w:color="CFCFCF" w:sz="2"/>
               <w:left w:val="single" w:color="CFCFCF" w:sz="2"/>
@@ -4242,7 +5930,7 @@
       <w:tr>
         <w:tc>
           <w:tcPr>
-            <w:tcW w:type="dxa" w:w="2600"/>
+            <w:tcW w:type="dxa" w:w="3200"/>
             <w:tcBorders>
               <w:top w:val="single" w:color="CFCFCF" w:sz="2"/>
               <w:left w:val="single" w:color="CFCFCF" w:sz="2"/>
@@ -4275,7 +5963,7 @@
         </w:tc>
         <w:tc>
           <w:tcPr>
-            <w:tcW w:type="dxa" w:w="3480"/>
+            <w:tcW w:type="dxa" w:w="4900"/>
             <w:tcBorders>
               <w:top w:val="single" w:color="CFCFCF" w:sz="2"/>
               <w:left w:val="single" w:color="CFCFCF" w:sz="2"/>
@@ -4308,7 +5996,7 @@
         </w:tc>
         <w:tc>
           <w:tcPr>
-            <w:tcW w:type="dxa" w:w="4000"/>
+            <w:tcW w:type="dxa" w:w="6300"/>
             <w:tcBorders>
               <w:top w:val="single" w:color="CFCFCF" w:sz="2"/>
               <w:left w:val="single" w:color="CFCFCF" w:sz="2"/>
@@ -4341,7 +6029,7 @@
       <w:tr>
         <w:tc>
           <w:tcPr>
-            <w:tcW w:type="dxa" w:w="2600"/>
+            <w:tcW w:type="dxa" w:w="3200"/>
             <w:tcBorders>
               <w:top w:val="single" w:color="CFCFCF" w:sz="2"/>
               <w:left w:val="single" w:color="CFCFCF" w:sz="2"/>
@@ -4374,7 +6062,7 @@
         </w:tc>
         <w:tc>
           <w:tcPr>
-            <w:tcW w:type="dxa" w:w="3480"/>
+            <w:tcW w:type="dxa" w:w="4900"/>
             <w:tcBorders>
               <w:top w:val="single" w:color="CFCFCF" w:sz="2"/>
               <w:left w:val="single" w:color="CFCFCF" w:sz="2"/>
@@ -4407,7 +6095,7 @@
         </w:tc>
         <w:tc>
           <w:tcPr>
-            <w:tcW w:type="dxa" w:w="4000"/>
+            <w:tcW w:type="dxa" w:w="6300"/>
             <w:tcBorders>
               <w:top w:val="single" w:color="CFCFCF" w:sz="2"/>
               <w:left w:val="single" w:color="CFCFCF" w:sz="2"/>
@@ -4440,7 +6128,7 @@
       <w:tr>
         <w:tc>
           <w:tcPr>
-            <w:tcW w:type="dxa" w:w="2600"/>
+            <w:tcW w:type="dxa" w:w="3200"/>
             <w:tcBorders>
               <w:top w:val="single" w:color="CFCFCF" w:sz="2"/>
               <w:left w:val="single" w:color="CFCFCF" w:sz="2"/>
@@ -4473,7 +6161,7 @@
         </w:tc>
         <w:tc>
           <w:tcPr>
-            <w:tcW w:type="dxa" w:w="3480"/>
+            <w:tcW w:type="dxa" w:w="4900"/>
             <w:tcBorders>
               <w:top w:val="single" w:color="CFCFCF" w:sz="2"/>
               <w:left w:val="single" w:color="CFCFCF" w:sz="2"/>
@@ -4506,7 +6194,7 @@
         </w:tc>
         <w:tc>
           <w:tcPr>
-            <w:tcW w:type="dxa" w:w="4000"/>
+            <w:tcW w:type="dxa" w:w="6300"/>
             <w:tcBorders>
               <w:top w:val="single" w:color="CFCFCF" w:sz="2"/>
               <w:left w:val="single" w:color="CFCFCF" w:sz="2"/>
@@ -4539,7 +6227,7 @@
       <w:tr>
         <w:tc>
           <w:tcPr>
-            <w:tcW w:type="dxa" w:w="2600"/>
+            <w:tcW w:type="dxa" w:w="3200"/>
             <w:tcBorders>
               <w:top w:val="single" w:color="CFCFCF" w:sz="2"/>
               <w:left w:val="single" w:color="CFCFCF" w:sz="2"/>
@@ -4572,7 +6260,7 @@
         </w:tc>
         <w:tc>
           <w:tcPr>
-            <w:tcW w:type="dxa" w:w="3480"/>
+            <w:tcW w:type="dxa" w:w="4900"/>
             <w:tcBorders>
               <w:top w:val="single" w:color="CFCFCF" w:sz="2"/>
               <w:left w:val="single" w:color="CFCFCF" w:sz="2"/>
@@ -4605,7 +6293,7 @@
         </w:tc>
         <w:tc>
           <w:tcPr>
-            <w:tcW w:type="dxa" w:w="4000"/>
+            <w:tcW w:type="dxa" w:w="6300"/>
             <w:tcBorders>
               <w:top w:val="single" w:color="CFCFCF" w:sz="2"/>
               <w:left w:val="single" w:color="CFCFCF" w:sz="2"/>
@@ -4666,7 +6354,7 @@
     </w:p>
     <w:tbl>
       <w:tblPr>
-        <w:tblW w:type="dxa" w:w="10080"/>
+        <w:tblW w:type="dxa" w:w="14400"/>
         <w:tblBorders>
           <w:top w:val="single" w:color="auto" w:sz="4"/>
           <w:left w:val="single" w:color="auto" w:sz="4"/>
@@ -4677,14 +6365,14 @@
         </w:tblBorders>
       </w:tblPr>
       <w:tblGrid>
-        <w:gridCol w:w="2200"/>
-        <w:gridCol w:w="3880"/>
-        <w:gridCol w:w="4000"/>
+        <w:gridCol w:w="2800"/>
+        <w:gridCol w:w="5700"/>
+        <w:gridCol w:w="5900"/>
       </w:tblGrid>
       <w:tr>
         <w:tc>
           <w:tcPr>
-            <w:tcW w:type="dxa" w:w="2200"/>
+            <w:tcW w:type="dxa" w:w="2800"/>
             <w:tcBorders>
               <w:top w:val="single" w:color="CFCFCF" w:sz="2"/>
               <w:left w:val="single" w:color="CFCFCF" w:sz="2"/>
@@ -4719,7 +6407,7 @@
         </w:tc>
         <w:tc>
           <w:tcPr>
-            <w:tcW w:type="dxa" w:w="3880"/>
+            <w:tcW w:type="dxa" w:w="5700"/>
             <w:tcBorders>
               <w:top w:val="single" w:color="CFCFCF" w:sz="2"/>
               <w:left w:val="single" w:color="CFCFCF" w:sz="2"/>
@@ -4754,7 +6442,7 @@
         </w:tc>
         <w:tc>
           <w:tcPr>
-            <w:tcW w:type="dxa" w:w="4000"/>
+            <w:tcW w:type="dxa" w:w="5900"/>
             <w:tcBorders>
               <w:top w:val="single" w:color="CFCFCF" w:sz="2"/>
               <w:left w:val="single" w:color="CFCFCF" w:sz="2"/>
@@ -4791,7 +6479,7 @@
       <w:tr>
         <w:tc>
           <w:tcPr>
-            <w:tcW w:type="dxa" w:w="2200"/>
+            <w:tcW w:type="dxa" w:w="2800"/>
             <w:tcBorders>
               <w:top w:val="single" w:color="CFCFCF" w:sz="2"/>
               <w:left w:val="single" w:color="CFCFCF" w:sz="2"/>
@@ -4825,7 +6513,7 @@
         </w:tc>
         <w:tc>
           <w:tcPr>
-            <w:tcW w:type="dxa" w:w="3880"/>
+            <w:tcW w:type="dxa" w:w="5700"/>
             <w:tcBorders>
               <w:top w:val="single" w:color="CFCFCF" w:sz="2"/>
               <w:left w:val="single" w:color="CFCFCF" w:sz="2"/>
@@ -4856,7 +6544,7 @@
         </w:tc>
         <w:tc>
           <w:tcPr>
-            <w:tcW w:type="dxa" w:w="4000"/>
+            <w:tcW w:type="dxa" w:w="5900"/>
             <w:tcBorders>
               <w:top w:val="single" w:color="CFCFCF" w:sz="2"/>
               <w:left w:val="single" w:color="CFCFCF" w:sz="2"/>
@@ -4891,7 +6579,7 @@
       <w:tr>
         <w:tc>
           <w:tcPr>
-            <w:tcW w:type="dxa" w:w="2200"/>
+            <w:tcW w:type="dxa" w:w="2800"/>
             <w:tcBorders>
               <w:top w:val="single" w:color="CFCFCF" w:sz="2"/>
               <w:left w:val="single" w:color="CFCFCF" w:sz="2"/>
@@ -4925,7 +6613,7 @@
         </w:tc>
         <w:tc>
           <w:tcPr>
-            <w:tcW w:type="dxa" w:w="3880"/>
+            <w:tcW w:type="dxa" w:w="5700"/>
             <w:tcBorders>
               <w:top w:val="single" w:color="CFCFCF" w:sz="2"/>
               <w:left w:val="single" w:color="CFCFCF" w:sz="2"/>
@@ -4956,7 +6644,7 @@
         </w:tc>
         <w:tc>
           <w:tcPr>
-            <w:tcW w:type="dxa" w:w="4000"/>
+            <w:tcW w:type="dxa" w:w="5900"/>
             <w:tcBorders>
               <w:top w:val="single" w:color="CFCFCF" w:sz="2"/>
               <w:left w:val="single" w:color="CFCFCF" w:sz="2"/>
@@ -4991,7 +6679,7 @@
       <w:tr>
         <w:tc>
           <w:tcPr>
-            <w:tcW w:type="dxa" w:w="2200"/>
+            <w:tcW w:type="dxa" w:w="2800"/>
             <w:tcBorders>
               <w:top w:val="single" w:color="CFCFCF" w:sz="2"/>
               <w:left w:val="single" w:color="CFCFCF" w:sz="2"/>
@@ -5025,7 +6713,7 @@
         </w:tc>
         <w:tc>
           <w:tcPr>
-            <w:tcW w:type="dxa" w:w="3880"/>
+            <w:tcW w:type="dxa" w:w="5700"/>
             <w:tcBorders>
               <w:top w:val="single" w:color="CFCFCF" w:sz="2"/>
               <w:left w:val="single" w:color="CFCFCF" w:sz="2"/>
@@ -5056,7 +6744,7 @@
         </w:tc>
         <w:tc>
           <w:tcPr>
-            <w:tcW w:type="dxa" w:w="4000"/>
+            <w:tcW w:type="dxa" w:w="5900"/>
             <w:tcBorders>
               <w:top w:val="single" w:color="CFCFCF" w:sz="2"/>
               <w:left w:val="single" w:color="CFCFCF" w:sz="2"/>
@@ -5316,8 +7004,8 @@
     <w:sectPr>
       <w:headerReference w:type="default" r:id="rId7"/>
       <w:footerReference w:type="default" r:id="rId8"/>
-      <w:pgSz w:w="12240" w:h="15840" w:orient="portrait"/>
-      <w:pgMar w:top="1080" w:right="1080" w:bottom="1080" w:left="1080" w:header="708" w:footer="708" w:gutter="0"/>
+      <w:pgSz w:w="15840" w:h="12240" w:orient="landscape"/>
+      <w:pgMar w:top="720" w:right="720" w:bottom="720" w:left="720" w:header="708" w:footer="708" w:gutter="0"/>
       <w:pgNumType/>
       <w:docGrid w:linePitch="360"/>
     </w:sectPr>

</xml_diff>

<commit_message>
updates wrangler version to
</commit_message>
<xml_diff>
--- a/docs/Eukara_Architecture_Proposed_vs_Current.docx
+++ b/docs/Eukara_Architecture_Proposed_vs_Current.docx
@@ -36,7 +36,7 @@
     </w:p>
     <w:p>
       <w:pPr>
-        <w:spacing w:after="240" w:before="0"/>
+        <w:spacing w:after="100" w:before="0"/>
       </w:pPr>
       <w:r>
         <w:rPr>
@@ -47,6 +47,24 @@
           <w:szCs w:val="18"/>
         </w:rPr>
         <w:t xml:space="preserve">Source: the proposed architecture document you provided (“Eukara Core System Architecture”), cross-referenced against a direct read of the repository (src/, docs/, decisions/) and docs/journal.md. Findings are code-reading based, not runtime-verified — see the note before the gaps section.</w:t>
+      </w:r>
+    </w:p>
+    <w:p>
+      <w:pPr>
+        <w:spacing w:after="240" w:before="0"/>
+      </w:pPr>
+      <w:r>
+        <w:rPr>
+          <w:rFonts w:ascii="Arial" w:cs="Arial" w:eastAsia="Arial" w:hAnsi="Arial"/>
+          <w:b/>
+          <w:bCs/>
+          <w:i/>
+          <w:iCs/>
+          <w:color w:val="9C4221"/>
+          <w:sz w:val="18"/>
+          <w:szCs w:val="18"/>
+        </w:rPr>
+        <w:t xml:space="preserve">Revision note (2026-07-01): the codebase changed same-day, after the first version of this document. Chat and code intents were merged onto @cf/openai/gpt-oss-120b, a new “grounded” lane (Gemma 4) was added, and fallbackPro moved off Kimi K2.7 Code. This revision reflects that change and one new issue it surfaced — see Layer C and the Gaps section.</w:t>
       </w:r>
     </w:p>
     <w:p>
@@ -633,7 +651,7 @@
                 <w:sz w:val="24"/>
                 <w:szCs w:val="24"/>
               </w:rPr>
-              <w:t xml:space="preserve">1</w:t>
+              <w:t xml:space="preserve">0</w:t>
             </w:r>
           </w:p>
         </w:tc>
@@ -703,7 +721,7 @@
                 <w:sz w:val="24"/>
                 <w:szCs w:val="24"/>
               </w:rPr>
-              <w:t xml:space="preserve">2</w:t>
+              <w:t xml:space="preserve">3</w:t>
             </w:r>
           </w:p>
         </w:tc>
@@ -2210,7 +2228,7 @@
                 <w:sz w:val="17"/>
                 <w:szCs w:val="17"/>
               </w:rPr>
-              <w:t xml:space="preserve">casual → @cf/meta/llama-3.3-70b-instruct-fp8-fast</w:t>
+              <w:t xml:space="preserve">casual → @cf/openai/gpt-oss-120b</w:t>
             </w:r>
           </w:p>
           <w:p>
@@ -2225,7 +2243,7 @@
                 <w:sz w:val="17"/>
                 <w:szCs w:val="17"/>
               </w:rPr>
-              <w:t xml:space="preserve">functional → @cf/moonshotai/kimi-k2.7-code</w:t>
+              <w:t xml:space="preserve">functional → @cf/openai/gpt-oss-120b (same model, as of 2026-07-01)</w:t>
             </w:r>
           </w:p>
         </w:tc>
@@ -2257,7 +2275,7 @@
                 <w:sz w:val="17"/>
                 <w:szCs w:val="17"/>
               </w:rPr>
-              <w:t xml:space="preserve">For casual: @cf/google/gemma-4-26b-a4b-it — newer MoE model (4B active/26B total, Apr 2026) with native vision, reasoning and function calling at a fraction of 70B’s compute cost; could absorb the vision layer too. Keep kimi-k2.7-code for functional/code.</w:t>
+              <w:t xml:space="preserve">gpt-oss-120b is a solid single-model choice for casual — no urgent need to change. If you want the vision layer absorbed into the chat model too, @cf/google/gemma-4-26b-a4b-it is the alternative (native vision + reasoning), but that would be a bigger consolidation decision, not a quick swap.</w:t>
             </w:r>
           </w:p>
         </w:tc>
@@ -2333,20 +2351,20 @@
                 <w:sz w:val="18"/>
                 <w:szCs w:val="18"/>
               </w:rPr>
-              <w:t xml:space="preserve">functional runs with thinkingLevel HIGH on the same model slot used for “code” — not the chat model. So functional intent is actually handled by the Brain tier, not bundled with casual chat as proposed.</w:t>
-            </w:r>
-          </w:p>
-          <w:p>
-            <w:pPr>
-              <w:spacing w:after="60" w:before="0"/>
-            </w:pPr>
-            <w:r>
-              <w:rPr>
-                <w:rFonts w:ascii="Arial" w:cs="Arial" w:eastAsia="Arial" w:hAnsi="Arial"/>
-                <w:sz w:val="18"/>
-                <w:szCs w:val="18"/>
-              </w:rPr>
-              <w:t xml:space="preserve">src/ai/router.ts</w:t>
+              <w:t xml:space="preserve">As of 2026-06-22–2026-06-30, functional ran on a separate model from casual (same slot as “code”). As of 2026-07-01, chat and code were merged onto the same model, so casual and functional are — coincidentally — bundled together again, just not for the reason the proposal describes.</w:t>
+            </w:r>
+          </w:p>
+          <w:p>
+            <w:pPr>
+              <w:spacing w:after="60" w:before="0"/>
+            </w:pPr>
+            <w:r>
+              <w:rPr>
+                <w:rFonts w:ascii="Arial" w:cs="Arial" w:eastAsia="Arial" w:hAnsi="Arial"/>
+                <w:sz w:val="18"/>
+                <w:szCs w:val="18"/>
+              </w:rPr>
+              <w:t xml:space="preserve">src/ai/router.ts, src/config/models.ts</w:t>
             </w:r>
           </w:p>
         </w:tc>
@@ -2486,7 +2504,7 @@
                 <w:sz w:val="17"/>
                 <w:szCs w:val="17"/>
               </w:rPr>
-              <w:t xml:space="preserve">emotional_vent → @cf/meta/llama-3.3-70b-instruct-fp8-fast (same as casual)</w:t>
+              <w:t xml:space="preserve">emotional_vent → @cf/openai/gpt-oss-120b (same as casual, since 2026-07-01)</w:t>
             </w:r>
           </w:p>
           <w:p>
@@ -2533,7 +2551,7 @@
                 <w:sz w:val="17"/>
                 <w:szCs w:val="17"/>
               </w:rPr>
-              <w:t xml:space="preserve">Same gemma-4-26b-a4b-it candidate as B1&amp;D — its built-in reasoning mode may help with nuanced emotional judgement calls. No Cloudflare model markets itself as therapeutic/AEDP-tuned, so this needs prompt-level compensation regardless of model choice.</w:t>
+              <w:t xml:space="preserve">gpt-oss-120b is a reasonable choice here too. No Cloudflare model markets itself as therapeutic/AEDP-tuned, so this needs prompt-level compensation regardless of model choice — a model swap alone won’t close this gap.</w:t>
             </w:r>
           </w:p>
         </w:tc>
@@ -2788,7 +2806,7 @@
                 <w:sz w:val="17"/>
                 <w:szCs w:val="17"/>
               </w:rPr>
-              <w:t xml:space="preserve">@cf/moonshotai/kimi-k2.7-code</w:t>
+              <w:t xml:space="preserve">@cf/openai/gpt-oss-120b (changed 2026-07-01, was kimi-k2.7-code)</w:t>
             </w:r>
           </w:p>
         </w:tc>
@@ -2820,7 +2838,7 @@
                 <w:sz w:val="17"/>
                 <w:szCs w:val="17"/>
               </w:rPr>
-              <w:t xml:space="preserve">Kimi K2.7 Code is already the most current coding-specific flagship on Workers AI. @cf/zai-org/glm-5.2 (Jun 2026, Z.ai’s flagship agentic coding model, same 262k context) shipped 4 days later — worth a head-to-head benchmark before committing further.</w:t>
+              <w:t xml:space="preserve">This layer likely regressed today. gpt-oss-120b is a strong general model but not a coding specialist, and — per your own code comment in cloudflare.ts — its env.AI.run() path does not accept reasoning_effort, so the thinkingLevel: HIGH the router sets for code/functional is now silently ignored. If code quality matters here, route code/functional back to a dedicated model that supports reasoning_effort: kimi-k2.7-code (already in the compat list, orphaned since today) or @cf/zai-org/glm-5.2 (Jun 2026, Z.ai’s flagship agentic coding model). If gpt-oss-120b is being kept for cost/infra reasons, the reasoning boost needs a prompt-level substitute since the parameter path is gone.</w:t>
             </w:r>
           </w:p>
         </w:tc>
@@ -2896,33 +2914,46 @@
                 <w:sz w:val="18"/>
                 <w:szCs w:val="18"/>
               </w:rPr>
-              <w:t xml:space="preserve">Runs with thinkingLevel HIGH for both code and functional intents.</w:t>
-            </w:r>
-          </w:p>
-          <w:p>
-            <w:pPr>
-              <w:spacing w:after="60" w:before="0"/>
-            </w:pPr>
-            <w:r>
-              <w:rPr>
-                <w:rFonts w:ascii="Arial" w:cs="Arial" w:eastAsia="Arial" w:hAnsi="Arial"/>
-                <w:sz w:val="18"/>
-                <w:szCs w:val="18"/>
-              </w:rPr>
-              <w:t xml:space="preserve">No second/fallback tier confirmed.</w:t>
-            </w:r>
-          </w:p>
-          <w:p>
-            <w:pPr>
-              <w:spacing w:after="60" w:before="0"/>
-            </w:pPr>
-            <w:r>
-              <w:rPr>
-                <w:rFonts w:ascii="Arial" w:cs="Arial" w:eastAsia="Arial" w:hAnsi="Arial"/>
-                <w:sz w:val="18"/>
-                <w:szCs w:val="18"/>
-              </w:rPr>
-              <w:t xml:space="preserve">src/ai/router.ts, src/config/models.ts</w:t>
+              <w:t xml:space="preserve">Still routed as a separate intent from casual (router.ts keeps the code/functional branches distinct with thinkingLevel HIGH/MEDIUM), but as of 2026-07-01 it runs on the exact same model as casual chat — the “dedicated tier” concept survives in routing only, not in compute.</w:t>
+            </w:r>
+          </w:p>
+          <w:p>
+            <w:pPr>
+              <w:spacing w:after="60" w:before="0"/>
+            </w:pPr>
+            <w:r>
+              <w:rPr>
+                <w:rFonts w:ascii="Arial" w:cs="Arial" w:eastAsia="Arial" w:hAnsi="Arial"/>
+                <w:sz w:val="18"/>
+                <w:szCs w:val="18"/>
+              </w:rPr>
+              <w:t xml:space="preserve">New regression: thinkingLevel has no effect on gpt-oss-120b via the env.AI.run() path used here (reasoning_effort belongs to a different endpoint shape) — confirmed in src/ai/cloudflare.ts’s own comments.</w:t>
+            </w:r>
+          </w:p>
+          <w:p>
+            <w:pPr>
+              <w:spacing w:after="60" w:before="0"/>
+            </w:pPr>
+            <w:r>
+              <w:rPr>
+                <w:rFonts w:ascii="Arial" w:cs="Arial" w:eastAsia="Arial" w:hAnsi="Arial"/>
+                <w:sz w:val="18"/>
+                <w:szCs w:val="18"/>
+              </w:rPr>
+              <w:t xml:space="preserve">kimi-k2.7-code, which held this slot until today, is now orphaned: still listed in cloudflare.ts’s model-compat arrays but not assigned to any CF_MODELS slot.</w:t>
+            </w:r>
+          </w:p>
+          <w:p>
+            <w:pPr>
+              <w:spacing w:after="60" w:before="0"/>
+            </w:pPr>
+            <w:r>
+              <w:rPr>
+                <w:rFonts w:ascii="Arial" w:cs="Arial" w:eastAsia="Arial" w:hAnsi="Arial"/>
+                <w:sz w:val="18"/>
+                <w:szCs w:val="18"/>
+              </w:rPr>
+              <w:t xml:space="preserve">src/ai/router.ts, src/config/models.ts, src/ai/cloudflare.ts:34–50</w:t>
             </w:r>
           </w:p>
         </w:tc>
@@ -2935,7 +2966,7 @@
               <w:bottom w:val="single" w:color="CFCFCF" w:sz="2"/>
               <w:right w:val="single" w:color="CFCFCF" w:sz="2"/>
             </w:tcBorders>
-            <w:shd w:fill="DCEFDC" w:val="clear"/>
+            <w:shd w:fill="FDE6D2" w:val="clear"/>
             <w:tcMar>
               <w:top w:type="dxa" w:w="100"/>
               <w:left w:type="dxa" w:w="140"/>
@@ -2957,7 +2988,7 @@
                 <w:sz w:val="18"/>
                 <w:szCs w:val="18"/>
               </w:rPr>
-              <w:t xml:space="preserve">Implemented</w:t>
+              <w:t xml:space="preserve">Partial</w:t>
             </w:r>
           </w:p>
         </w:tc>
@@ -4986,7 +5017,7 @@
                 <w:sz w:val="17"/>
                 <w:szCs w:val="17"/>
               </w:rPr>
-              <w:t xml:space="preserve">@cf/zai-org/glm-4.7-flash (monthly dedup pass) + Gemini API (consolidation pass)</w:t>
+              <w:t xml:space="preserve">@cf/zai-org/glm-4.7-flash (monthly dedup pass) — unaffected, still fine</w:t>
             </w:r>
           </w:p>
           <w:p>
@@ -5001,7 +5032,7 @@
                 <w:sz w:val="17"/>
                 <w:szCs w:val="17"/>
               </w:rPr>
-              <w:t xml:space="preserve">Real-time supersession itself is deterministic code — no model call.</w:t>
+              <w:t xml:space="preserve">Gemini API (consolidation pass) — likely broken as of 2026-07-01, see Notes</w:t>
             </w:r>
           </w:p>
         </w:tc>
@@ -5033,7 +5064,7 @@
                 <w:sz w:val="17"/>
                 <w:szCs w:val="17"/>
               </w:rPr>
-              <w:t xml:space="preserve">Keep glm-4.7-flash for dedup — current, fast, good multilingual tool calling. Replace the Gemini consolidation-pass stage with gemma-4-26b-a4b-it or @cf/nvidia/nemotron-3-120b-a12b to finish the Cloudflare migration for this layer too.</w:t>
+              <w:t xml:space="preserve">Fix first, choose second. consolidation.ts passes CF_MODELS.chat straight into the Gemini SDK’s model field — that’s now the string “@cf/openai/gpt-oss-120b”, which is not a valid Gemini model name, so this call is very likely erroring on every run. Once fixed, migrate this stage onto gemma-4-26b-a4b-it or @cf/nvidia/nemotron-3-120b-a12b to finish the Cloudflare migration for this layer rather than re-pointing it at a real Gemini model string.</w:t>
             </w:r>
           </w:p>
         </w:tc>
@@ -5122,20 +5153,20 @@
                 <w:sz w:val="18"/>
                 <w:szCs w:val="18"/>
               </w:rPr>
-              <w:t xml:space="preserve">Closer to the proposal than most items here, but monthly rather than continuous, and still partly Gemini-dependent.</w:t>
-            </w:r>
-          </w:p>
-          <w:p>
-            <w:pPr>
-              <w:spacing w:after="60" w:before="0"/>
-            </w:pPr>
-            <w:r>
-              <w:rPr>
-                <w:rFonts w:ascii="Arial" w:cs="Arial" w:eastAsia="Arial" w:hAnsi="Arial"/>
-                <w:sz w:val="18"/>
-                <w:szCs w:val="18"/>
-              </w:rPr>
-              <w:t xml:space="preserve">src/services/memory.ts; src/workflows/consolidation.ts</w:t>
+              <w:t xml:space="preserve">Bug found 2026-07-01: consolidation.ts’s Gemini call does ai.models.generateContent({ model: CF_MODELS.chat, ... }) — passing the Cloudflare model ID as the Gemini model name. Since CF_MODELS.chat changed today to “@cf/openai/gpt-oss-120b”, this is not a valid Gemini model and the consolidation-pass step is very likely failing every run (architect.ts has the identical pattern — see Gaps).</w:t>
+            </w:r>
+          </w:p>
+          <w:p>
+            <w:pPr>
+              <w:spacing w:after="60" w:before="0"/>
+            </w:pPr>
+            <w:r>
+              <w:rPr>
+                <w:rFonts w:ascii="Arial" w:cs="Arial" w:eastAsia="Arial" w:hAnsi="Arial"/>
+                <w:sz w:val="18"/>
+                <w:szCs w:val="18"/>
+              </w:rPr>
+              <w:t xml:space="preserve">src/services/memory.ts; src/workflows/consolidation.ts:84–100</w:t>
             </w:r>
           </w:p>
         </w:tc>
@@ -5396,7 +5427,7 @@
                 <w:sz w:val="18"/>
                 <w:szCs w:val="18"/>
               </w:rPr>
-              <w:t xml:space="preserve">@cf/meta/llama-3.3-70b-instruct-fp8-fast</w:t>
+              <w:t xml:space="preserve">@cf/openai/gpt-oss-120b</w:t>
             </w:r>
           </w:p>
         </w:tc>
@@ -5427,7 +5458,7 @@
                 <w:sz w:val="18"/>
                 <w:szCs w:val="18"/>
               </w:rPr>
-              <w:t xml:space="preserve">casual conversation; emotional_vent</w:t>
+              <w:t xml:space="preserve">casual conversation; emotional_vent — changed 2026-07-01, was llama-3.3-70b</w:t>
             </w:r>
           </w:p>
         </w:tc>
@@ -5495,7 +5526,7 @@
                 <w:sz w:val="18"/>
                 <w:szCs w:val="18"/>
               </w:rPr>
-              <w:t xml:space="preserve">@cf/moonshotai/kimi-k2.7-code</w:t>
+              <w:t xml:space="preserve">@cf/openai/gpt-oss-120b</w:t>
             </w:r>
           </w:p>
         </w:tc>
@@ -5526,7 +5557,7 @@
                 <w:sz w:val="18"/>
                 <w:szCs w:val="18"/>
               </w:rPr>
-              <w:t xml:space="preserve">code and functional intents (thinkingLevel HIGH)</w:t>
+              <w:t xml:space="preserve">code and functional intents — changed 2026-07-01, was kimi-k2.7-code; thinkingLevel HIGH is set but has no effect on this model via this endpoint</w:t>
             </w:r>
           </w:p>
         </w:tc>
@@ -5561,7 +5592,7 @@
                 <w:sz w:val="18"/>
                 <w:szCs w:val="18"/>
               </w:rPr>
-              <w:t xml:space="preserve">Observation / triage</w:t>
+              <w:t xml:space="preserve">Grounded (new slot)</w:t>
             </w:r>
           </w:p>
         </w:tc>
@@ -5594,7 +5625,7 @@
                 <w:sz w:val="18"/>
                 <w:szCs w:val="18"/>
               </w:rPr>
-              <w:t xml:space="preserve">@cf/meta/llama-3.2-3b-instruct</w:t>
+              <w:t xml:space="preserve">@cf/google/gemma-4-26b-a4b-it</w:t>
             </w:r>
           </w:p>
         </w:tc>
@@ -5625,7 +5656,7 @@
                 <w:sz w:val="18"/>
                 <w:szCs w:val="18"/>
               </w:rPr>
-              <w:t xml:space="preserve">curator intent classification; subconscious background pass; topic-shift check</w:t>
+              <w:t xml:space="preserve">weekly report, curiosity research, and the no-silence salvage fallback — added 2026-07-01 because gpt-oss has no native web search</w:t>
             </w:r>
           </w:p>
         </w:tc>
@@ -5660,7 +5691,7 @@
                 <w:sz w:val="18"/>
                 <w:szCs w:val="18"/>
               </w:rPr>
-              <w:t xml:space="preserve">Tagging</w:t>
+              <w:t xml:space="preserve">Observation / triage</w:t>
             </w:r>
           </w:p>
         </w:tc>
@@ -5693,7 +5724,7 @@
                 <w:sz w:val="18"/>
                 <w:szCs w:val="18"/>
               </w:rPr>
-              <w:t xml:space="preserve">@cf/meta/llama-3.2-1b-instruct</w:t>
+              <w:t xml:space="preserve">@cf/meta/llama-3.2-3b-instruct</w:t>
             </w:r>
           </w:p>
         </w:tc>
@@ -5724,7 +5755,7 @@
                 <w:sz w:val="18"/>
                 <w:szCs w:val="18"/>
               </w:rPr>
-              <w:t xml:space="preserve">mood/clinical tagging</w:t>
+              <w:t xml:space="preserve">curator intent classification; subconscious background pass; topic-shift check — unchanged</w:t>
             </w:r>
           </w:p>
         </w:tc>
@@ -5759,7 +5790,7 @@
                 <w:sz w:val="18"/>
                 <w:szCs w:val="18"/>
               </w:rPr>
-              <w:t xml:space="preserve">Dedup</w:t>
+              <w:t xml:space="preserve">Tagging</w:t>
             </w:r>
           </w:p>
         </w:tc>
@@ -5792,7 +5823,7 @@
                 <w:sz w:val="18"/>
                 <w:szCs w:val="18"/>
               </w:rPr>
-              <w:t xml:space="preserve">@cf/zai-org/glm-4.7-flash</w:t>
+              <w:t xml:space="preserve">@cf/meta/llama-3.2-1b-instruct</w:t>
             </w:r>
           </w:p>
         </w:tc>
@@ -5823,7 +5854,7 @@
                 <w:sz w:val="18"/>
                 <w:szCs w:val="18"/>
               </w:rPr>
-              <w:t xml:space="preserve">monthly memory-consolidation dedup pass</w:t>
+              <w:t xml:space="preserve">mood/clinical tagging — unchanged</w:t>
             </w:r>
           </w:p>
         </w:tc>
@@ -5858,7 +5889,7 @@
                 <w:sz w:val="18"/>
                 <w:szCs w:val="18"/>
               </w:rPr>
-              <w:t xml:space="preserve">Embedding</w:t>
+              <w:t xml:space="preserve">Dedup</w:t>
             </w:r>
           </w:p>
         </w:tc>
@@ -5891,7 +5922,7 @@
                 <w:sz w:val="18"/>
                 <w:szCs w:val="18"/>
               </w:rPr>
-              <w:t xml:space="preserve">@cf/qwen/qwen3-embedding-0.6b</w:t>
+              <w:t xml:space="preserve">@cf/zai-org/glm-4.7-flash</w:t>
             </w:r>
           </w:p>
         </w:tc>
@@ -5922,7 +5953,7 @@
                 <w:sz w:val="18"/>
                 <w:szCs w:val="18"/>
               </w:rPr>
-              <w:t xml:space="preserve">Vectorize semantic memory search (text only)</w:t>
+              <w:t xml:space="preserve">monthly memory-consolidation dedup pass — unchanged</w:t>
             </w:r>
           </w:p>
         </w:tc>
@@ -5957,7 +5988,7 @@
                 <w:sz w:val="18"/>
                 <w:szCs w:val="18"/>
               </w:rPr>
-              <w:t xml:space="preserve">Reranker</w:t>
+              <w:t xml:space="preserve">Embedding</w:t>
             </w:r>
           </w:p>
         </w:tc>
@@ -5990,7 +6021,7 @@
                 <w:sz w:val="18"/>
                 <w:szCs w:val="18"/>
               </w:rPr>
-              <w:t xml:space="preserve">@cf/baai/bge-reranker-base</w:t>
+              <w:t xml:space="preserve">@cf/qwen/qwen3-embedding-0.6b</w:t>
             </w:r>
           </w:p>
         </w:tc>
@@ -6021,7 +6052,7 @@
                 <w:sz w:val="18"/>
                 <w:szCs w:val="18"/>
               </w:rPr>
-              <w:t xml:space="preserve">reordering semantic search results</w:t>
+              <w:t xml:space="preserve">Vectorize semantic memory search (text only) — unchanged</w:t>
             </w:r>
           </w:p>
         </w:tc>
@@ -6056,7 +6087,7 @@
                 <w:sz w:val="18"/>
                 <w:szCs w:val="18"/>
               </w:rPr>
-              <w:t xml:space="preserve">Vision</w:t>
+              <w:t xml:space="preserve">Reranker</w:t>
             </w:r>
           </w:p>
         </w:tc>
@@ -6089,7 +6120,7 @@
                 <w:sz w:val="18"/>
                 <w:szCs w:val="18"/>
               </w:rPr>
-              <w:t xml:space="preserve">@cf/llava-hf/llava-1.5-7b-hf</w:t>
+              <w:t xml:space="preserve">@cf/baai/bge-reranker-base</w:t>
             </w:r>
           </w:p>
         </w:tc>
@@ -6120,7 +6151,7 @@
                 <w:sz w:val="18"/>
                 <w:szCs w:val="18"/>
               </w:rPr>
-              <w:t xml:space="preserve">all media (images, voice, video, documents)</w:t>
+              <w:t xml:space="preserve">reordering semantic search results — unchanged</w:t>
             </w:r>
           </w:p>
         </w:tc>
@@ -6155,7 +6186,7 @@
                 <w:sz w:val="18"/>
                 <w:szCs w:val="18"/>
               </w:rPr>
-              <w:t xml:space="preserve">STT (registered, unused)</w:t>
+              <w:t xml:space="preserve">Vision</w:t>
             </w:r>
           </w:p>
         </w:tc>
@@ -6188,7 +6219,7 @@
                 <w:sz w:val="18"/>
                 <w:szCs w:val="18"/>
               </w:rPr>
-              <w:t xml:space="preserve">@cf/deepgram/nova-3</w:t>
+              <w:t xml:space="preserve">@cf/llava-hf/llava-1.5-7b-hf</w:t>
             </w:r>
           </w:p>
         </w:tc>
@@ -6219,7 +6250,7 @@
                 <w:sz w:val="18"/>
                 <w:szCs w:val="18"/>
               </w:rPr>
-              <w:t xml:space="preserve">declared only — no call sites</w:t>
+              <w:t xml:space="preserve">all media (images, voice, video, documents) — unchanged</w:t>
             </w:r>
           </w:p>
         </w:tc>
@@ -6254,7 +6285,7 @@
                 <w:sz w:val="18"/>
                 <w:szCs w:val="18"/>
               </w:rPr>
-              <w:t xml:space="preserve">Fallback pro (registered, unused)</w:t>
+              <w:t xml:space="preserve">STT (registered, unused)</w:t>
             </w:r>
           </w:p>
         </w:tc>
@@ -6287,6 +6318,204 @@
                 <w:sz w:val="18"/>
                 <w:szCs w:val="18"/>
               </w:rPr>
+              <w:t xml:space="preserve">@cf/deepgram/nova-3</w:t>
+            </w:r>
+          </w:p>
+        </w:tc>
+        <w:tc>
+          <w:tcPr>
+            <w:tcW w:type="dxa" w:w="6300"/>
+            <w:tcBorders>
+              <w:top w:val="single" w:color="CFCFCF" w:sz="2"/>
+              <w:left w:val="single" w:color="CFCFCF" w:sz="2"/>
+              <w:bottom w:val="single" w:color="CFCFCF" w:sz="2"/>
+              <w:right w:val="single" w:color="CFCFCF" w:sz="2"/>
+            </w:tcBorders>
+            <w:tcMar>
+              <w:top w:type="dxa" w:w="100"/>
+              <w:left w:type="dxa" w:w="140"/>
+              <w:bottom w:type="dxa" w:w="100"/>
+              <w:right w:type="dxa" w:w="140"/>
+            </w:tcMar>
+            <w:vAlign w:val="top"/>
+          </w:tcPr>
+          <w:p>
+            <w:pPr>
+              <w:spacing w:after="60" w:before="0"/>
+            </w:pPr>
+            <w:r>
+              <w:rPr>
+                <w:rFonts w:ascii="Arial" w:cs="Arial" w:eastAsia="Arial" w:hAnsi="Arial"/>
+                <w:sz w:val="18"/>
+                <w:szCs w:val="18"/>
+              </w:rPr>
+              <w:t xml:space="preserve">declared only — no call sites — unchanged</w:t>
+            </w:r>
+          </w:p>
+        </w:tc>
+      </w:tr>
+      <w:tr>
+        <w:tc>
+          <w:tcPr>
+            <w:tcW w:type="dxa" w:w="3200"/>
+            <w:tcBorders>
+              <w:top w:val="single" w:color="CFCFCF" w:sz="2"/>
+              <w:left w:val="single" w:color="CFCFCF" w:sz="2"/>
+              <w:bottom w:val="single" w:color="CFCFCF" w:sz="2"/>
+              <w:right w:val="single" w:color="CFCFCF" w:sz="2"/>
+            </w:tcBorders>
+            <w:tcMar>
+              <w:top w:type="dxa" w:w="100"/>
+              <w:left w:type="dxa" w:w="140"/>
+              <w:bottom w:type="dxa" w:w="100"/>
+              <w:right w:type="dxa" w:w="140"/>
+            </w:tcMar>
+            <w:vAlign w:val="top"/>
+          </w:tcPr>
+          <w:p>
+            <w:pPr>
+              <w:spacing w:after="60" w:before="0"/>
+            </w:pPr>
+            <w:r>
+              <w:rPr>
+                <w:rFonts w:ascii="Arial" w:cs="Arial" w:eastAsia="Arial" w:hAnsi="Arial"/>
+                <w:b/>
+                <w:bCs/>
+                <w:sz w:val="18"/>
+                <w:szCs w:val="18"/>
+              </w:rPr>
+              <w:t xml:space="preserve">Fallback pro</w:t>
+            </w:r>
+          </w:p>
+        </w:tc>
+        <w:tc>
+          <w:tcPr>
+            <w:tcW w:type="dxa" w:w="4900"/>
+            <w:tcBorders>
+              <w:top w:val="single" w:color="CFCFCF" w:sz="2"/>
+              <w:left w:val="single" w:color="CFCFCF" w:sz="2"/>
+              <w:bottom w:val="single" w:color="CFCFCF" w:sz="2"/>
+              <w:right w:val="single" w:color="CFCFCF" w:sz="2"/>
+            </w:tcBorders>
+            <w:tcMar>
+              <w:top w:type="dxa" w:w="100"/>
+              <w:left w:type="dxa" w:w="140"/>
+              <w:bottom w:type="dxa" w:w="100"/>
+              <w:right w:type="dxa" w:w="140"/>
+            </w:tcMar>
+            <w:vAlign w:val="top"/>
+          </w:tcPr>
+          <w:p>
+            <w:pPr>
+              <w:spacing w:after="60" w:before="0"/>
+            </w:pPr>
+            <w:r>
+              <w:rPr>
+                <w:rFonts w:ascii="Arial" w:cs="Arial" w:eastAsia="Arial" w:hAnsi="Arial"/>
+                <w:i/>
+                <w:iCs/>
+                <w:sz w:val="18"/>
+                <w:szCs w:val="18"/>
+              </w:rPr>
+              <w:t xml:space="preserve">@cf/google/gemma-4-26b-a4b-it</w:t>
+            </w:r>
+          </w:p>
+        </w:tc>
+        <w:tc>
+          <w:tcPr>
+            <w:tcW w:type="dxa" w:w="6300"/>
+            <w:tcBorders>
+              <w:top w:val="single" w:color="CFCFCF" w:sz="2"/>
+              <w:left w:val="single" w:color="CFCFCF" w:sz="2"/>
+              <w:bottom w:val="single" w:color="CFCFCF" w:sz="2"/>
+              <w:right w:val="single" w:color="CFCFCF" w:sz="2"/>
+            </w:tcBorders>
+            <w:tcMar>
+              <w:top w:type="dxa" w:w="100"/>
+              <w:left w:type="dxa" w:w="140"/>
+              <w:bottom w:type="dxa" w:w="100"/>
+              <w:right w:type="dxa" w:w="140"/>
+            </w:tcMar>
+            <w:vAlign w:val="top"/>
+          </w:tcPr>
+          <w:p>
+            <w:pPr>
+              <w:spacing w:after="60" w:before="0"/>
+            </w:pPr>
+            <w:r>
+              <w:rPr>
+                <w:rFonts w:ascii="Arial" w:cs="Arial" w:eastAsia="Arial" w:hAnsi="Arial"/>
+                <w:sz w:val="18"/>
+                <w:szCs w:val="18"/>
+              </w:rPr>
+              <w:t xml:space="preserve">no-silence salvage when the primary chat call fails — changed 2026-07-01, was kimi-k2.7-code</w:t>
+            </w:r>
+          </w:p>
+        </w:tc>
+      </w:tr>
+      <w:tr>
+        <w:tc>
+          <w:tcPr>
+            <w:tcW w:type="dxa" w:w="3200"/>
+            <w:tcBorders>
+              <w:top w:val="single" w:color="CFCFCF" w:sz="2"/>
+              <w:left w:val="single" w:color="CFCFCF" w:sz="2"/>
+              <w:bottom w:val="single" w:color="CFCFCF" w:sz="2"/>
+              <w:right w:val="single" w:color="CFCFCF" w:sz="2"/>
+            </w:tcBorders>
+            <w:tcMar>
+              <w:top w:type="dxa" w:w="100"/>
+              <w:left w:type="dxa" w:w="140"/>
+              <w:bottom w:type="dxa" w:w="100"/>
+              <w:right w:type="dxa" w:w="140"/>
+            </w:tcMar>
+            <w:vAlign w:val="top"/>
+          </w:tcPr>
+          <w:p>
+            <w:pPr>
+              <w:spacing w:after="60" w:before="0"/>
+            </w:pPr>
+            <w:r>
+              <w:rPr>
+                <w:rFonts w:ascii="Arial" w:cs="Arial" w:eastAsia="Arial" w:hAnsi="Arial"/>
+                <w:b/>
+                <w:bCs/>
+                <w:sz w:val="18"/>
+                <w:szCs w:val="18"/>
+              </w:rPr>
+              <w:t xml:space="preserve">Orphaned (no slot)</w:t>
+            </w:r>
+          </w:p>
+        </w:tc>
+        <w:tc>
+          <w:tcPr>
+            <w:tcW w:type="dxa" w:w="4900"/>
+            <w:tcBorders>
+              <w:top w:val="single" w:color="CFCFCF" w:sz="2"/>
+              <w:left w:val="single" w:color="CFCFCF" w:sz="2"/>
+              <w:bottom w:val="single" w:color="CFCFCF" w:sz="2"/>
+              <w:right w:val="single" w:color="CFCFCF" w:sz="2"/>
+            </w:tcBorders>
+            <w:tcMar>
+              <w:top w:type="dxa" w:w="100"/>
+              <w:left w:type="dxa" w:w="140"/>
+              <w:bottom w:type="dxa" w:w="100"/>
+              <w:right w:type="dxa" w:w="140"/>
+            </w:tcMar>
+            <w:vAlign w:val="top"/>
+          </w:tcPr>
+          <w:p>
+            <w:pPr>
+              <w:spacing w:after="60" w:before="0"/>
+            </w:pPr>
+            <w:r>
+              <w:rPr>
+                <w:rFonts w:ascii="Arial" w:cs="Arial" w:eastAsia="Arial" w:hAnsi="Arial"/>
+                <w:i/>
+                <w:iCs/>
+                <w:sz w:val="18"/>
+                <w:szCs w:val="18"/>
+              </w:rPr>
               <w:t xml:space="preserve">@cf/moonshotai/kimi-k2.7-code</w:t>
             </w:r>
           </w:p>
@@ -6318,7 +6547,7 @@
                 <w:sz w:val="18"/>
                 <w:szCs w:val="18"/>
               </w:rPr>
-              <w:t xml:space="preserve">defined but never wired into any cascade</w:t>
+              <w:t xml:space="preserve">still listed in cloudflare.ts’s model-compat detection arrays, but as of 2026-07-01 no CF_MODELS slot points to it — dead entry</w:t>
             </w:r>
           </w:p>
         </w:tc>
@@ -6824,6 +7053,62 @@
           <w:sz w:val="20"/>
           <w:szCs w:val="20"/>
         </w:rPr>
+        <w:t xml:space="preserve">NEW (2026-07-01) — Gemini calls likely broken by the gpt-oss migration. </w:t>
+      </w:r>
+      <w:r>
+        <w:rPr>
+          <w:rFonts w:ascii="Arial" w:cs="Arial" w:eastAsia="Arial" w:hAnsi="Arial"/>
+          <w:sz w:val="20"/>
+          <w:szCs w:val="20"/>
+        </w:rPr>
+        <w:t xml:space="preserve">src/workflows/consolidation.ts and src/workflows/architect.ts both call the Gemini SDK with model: CF_MODELS.chat. That constant used to hold a Cloudflare model string already (invalid for Gemini, so this may have been quietly broken since 2026-06-22), but today it changed to “@cf/openai/gpt-oss-120b” — also not a valid Gemini model name. Both the monthly memory-consolidation pass and the /architect proposal step are very likely erroring on every run. Fix: pass a real Gemini model string (or, better, migrate these calls onto CF_MODELS.grounded and drop the Gemini SDK dependency here entirely).</w:t>
+      </w:r>
+    </w:p>
+    <w:p>
+      <w:pPr>
+        <w:pStyle w:val="ListParagraph"/>
+        <w:numPr>
+          <w:ilvl w:val="0"/>
+          <w:numId w:val="2"/>
+        </w:numPr>
+        <w:spacing w:after="80"/>
+      </w:pPr>
+      <w:r>
+        <w:rPr>
+          <w:rFonts w:ascii="Arial" w:cs="Arial" w:eastAsia="Arial" w:hAnsi="Arial"/>
+          <w:b/>
+          <w:bCs/>
+          <w:sz w:val="20"/>
+          <w:szCs w:val="20"/>
+        </w:rPr>
+        <w:t xml:space="preserve">NEW (2026-07-01) — thinkingLevel is now a dead parameter for code. </w:t>
+      </w:r>
+      <w:r>
+        <w:rPr>
+          <w:rFonts w:ascii="Arial" w:cs="Arial" w:eastAsia="Arial" w:hAnsi="Arial"/>
+          <w:sz w:val="20"/>
+          <w:szCs w:val="20"/>
+        </w:rPr>
+        <w:t xml:space="preserve">Router sets thinkingLevel: HIGH/MEDIUM for code, functional, and long-message routes. Now that CF_MODELS.code = gpt-oss-120b, this has no effect: per your own comment in cloudflare.ts, gpt-oss’s env.AI.run() path doesn’t accept reasoning_effort (that only exists on the separate /responses endpoint). Code-intent replies silently lost their reasoning boost when code moved off kimi-k2.7-code.</w:t>
+      </w:r>
+    </w:p>
+    <w:p>
+      <w:pPr>
+        <w:pStyle w:val="ListParagraph"/>
+        <w:numPr>
+          <w:ilvl w:val="0"/>
+          <w:numId w:val="2"/>
+        </w:numPr>
+        <w:spacing w:after="80"/>
+      </w:pPr>
+      <w:r>
+        <w:rPr>
+          <w:rFonts w:ascii="Arial" w:cs="Arial" w:eastAsia="Arial" w:hAnsi="Arial"/>
+          <w:b/>
+          <w:bCs/>
+          <w:sz w:val="20"/>
+          <w:szCs w:val="20"/>
+        </w:rPr>
         <w:t xml:space="preserve">Dead sticky-lane write. </w:t>
       </w:r>
       <w:r>
@@ -6852,7 +7137,7 @@
           <w:sz w:val="20"/>
           <w:szCs w:val="20"/>
         </w:rPr>
-        <w:t xml:space="preserve">Three workflows still depend on Gemini. </w:t>
+        <w:t xml:space="preserve">Two workflows still depend on Gemini by design; a third is unaffected. </w:t>
       </w:r>
       <w:r>
         <w:rPr>
@@ -6860,7 +7145,7 @@
           <w:sz w:val="20"/>
           <w:szCs w:val="20"/>
         </w:rPr>
-        <w:t xml:space="preserve">docs/journal.md records the chat pipeline as fully migrated to Cloudflare Workers AI (2026-06-22), but /architect review, deep research, and the second stage of monthly memory consolidation all still call the Gemini API directly and require GEMINI_API_KEY. Not mentioned anywhere as a known exception.</w:t>
+        <w:t xml:space="preserve">docs/journal.md records the chat pipeline as fully migrated to Cloudflare Workers AI (2026-06-22), but /architect review and monthly memory consolidation still call the Gemini API directly and require GEMINI_API_KEY (and are now likely broken — see above). Deep research also still uses Gemini directly, but via its own hardcoded model string, so it isn’t affected by today’s change. None of this is mentioned anywhere as a known exception.</w:t>
       </w:r>
     </w:p>
     <w:p>
@@ -6880,7 +7165,7 @@
           <w:sz w:val="20"/>
           <w:szCs w:val="20"/>
         </w:rPr>
-        <w:t xml:space="preserve">Grounding is a no-op. </w:t>
+        <w:t xml:space="preserve">Grounding is a no-op on the primary chat lane by design, not by accident. </w:t>
       </w:r>
       <w:r>
         <w:rPr>
@@ -6888,7 +7173,7 @@
           <w:sz w:val="20"/>
           <w:szCs w:val="20"/>
         </w:rPr>
-        <w:t xml:space="preserve">The router still sets enableGrounding: true on most routes, but Cloudflare grounding support is only wired for the old @cf/google/gemma-4-26b-a4b-it model — not the current default chat model (Llama 3.3). curiosity.ts also reads Gemini-only grounding metadata that’s now always undefined, so autonomous discoveries silently lose their source links.</w:t>
+        <w:t xml:space="preserve">gpt-oss (now CF_MODELS.chat/code) has no native web search, so enableGrounding: true on the router’s casual/emotional/code routes does nothing there — this is acknowledged in the code’s own comments. Real grounding only happens via the separate “grounded” lane (Gemma) for weekly reports, curiosity research, and the no-silence salvage fallback, or when the primary call fails and salvage retries on Gemma.</w:t>
       </w:r>
     </w:p>
     <w:p>
@@ -6977,6 +7262,62 @@
     </w:p>
     <w:p>
       <w:pPr>
+        <w:pStyle w:val="ListParagraph"/>
+        <w:numPr>
+          <w:ilvl w:val="0"/>
+          <w:numId w:val="2"/>
+        </w:numPr>
+        <w:spacing w:after="80"/>
+      </w:pPr>
+      <w:r>
+        <w:rPr>
+          <w:rFonts w:ascii="Arial" w:cs="Arial" w:eastAsia="Arial" w:hAnsi="Arial"/>
+          <w:b/>
+          <w:bCs/>
+          <w:sz w:val="20"/>
+          <w:szCs w:val="20"/>
+        </w:rPr>
+        <w:t xml:space="preserve">Stale comments, not functional bugs. </w:t>
+      </w:r>
+      <w:r>
+        <w:rPr>
+          <w:rFonts w:ascii="Arial" w:cs="Arial" w:eastAsia="Arial" w:hAnsi="Arial"/>
+          <w:sz w:val="20"/>
+          <w:szCs w:val="20"/>
+        </w:rPr>
+        <w:t xml:space="preserve">router.ts’s file-header comment still describes the pre-gpt-oss state (llama-3.3-70b for chat, kimi-k2.7-code for code). cloudflare.ts still carries a comment implying kimi-k2.7-code backs fallbackPro, which it no longer does. Worth a documentation pass.</w:t>
+      </w:r>
+    </w:p>
+    <w:p>
+      <w:pPr>
+        <w:pStyle w:val="ListParagraph"/>
+        <w:numPr>
+          <w:ilvl w:val="0"/>
+          <w:numId w:val="2"/>
+        </w:numPr>
+        <w:spacing w:after="80"/>
+      </w:pPr>
+      <w:r>
+        <w:rPr>
+          <w:rFonts w:ascii="Arial" w:cs="Arial" w:eastAsia="Arial" w:hAnsi="Arial"/>
+          <w:b/>
+          <w:bCs/>
+          <w:sz w:val="20"/>
+          <w:szCs w:val="20"/>
+        </w:rPr>
+        <w:t xml:space="preserve">No journal.md entry for today’s change. </w:t>
+      </w:r>
+      <w:r>
+        <w:rPr>
+          <w:rFonts w:ascii="Arial" w:cs="Arial" w:eastAsia="Arial" w:hAnsi="Arial"/>
+          <w:sz w:val="20"/>
+          <w:szCs w:val="20"/>
+        </w:rPr>
+        <w:t xml:space="preserve">docs/journal.md’s last entry is 2026-06-22. The gpt-oss migration, the new grounded lane, and the fallbackPro change are not logged there yet.</w:t>
+      </w:r>
+    </w:p>
+    <w:p>
+      <w:pPr>
         <w:pBdr>
           <w:top w:val="single" w:color="CFCFCF" w:sz="4" w:space="8"/>
         </w:pBdr>
@@ -6990,7 +7331,7 @@
           <w:sz w:val="18"/>
           <w:szCs w:val="18"/>
         </w:rPr>
-        <w:t xml:space="preserve">Note on Gemini migration: </w:t>
+        <w:t xml:space="preserve">Note on the Cloudflare migration: </w:t>
       </w:r>
       <w:r>
         <w:rPr>
@@ -6998,7 +7339,7 @@
           <w:sz w:val="18"/>
           <w:szCs w:val="18"/>
         </w:rPr>
-        <w:t xml:space="preserve">docs/journal.md records a full migration of the chat/routing pipeline from Gemini to Cloudflare Workers AI on 2026-06-22. That migration is real and verified for the primary chat path. It is not complete for /architect, deep research, or monthly memory consolidation, which still call Gemini directly — worth a decision on whether to finish the migration or keep these as deliberate exceptions.</w:t>
+        <w:t xml:space="preserve">docs/journal.md records a full migration of the chat/routing pipeline from Gemini to Cloudflare Workers AI on 2026-06-22, and the codebase moved further on 2026-07-01 by consolidating chat and code onto @cf/openai/gpt-oss-120b (still Cloudflare-hosted — not a call to OpenAI’s API) and adding a dedicated “grounded” lane on Gemma for the paths that need live web search. /architect and monthly memory consolidation still call the Gemini API directly, require GEMINI_API_KEY, and — as of today’s change — are very likely failing outright due to an invalid model string being passed to the Gemini SDK (see Gaps). Deep research also stays on Gemini, unaffected, via its own hardcoded model string. Worth a decision on whether to finish the migration for these workflows or keep them as deliberate exceptions — but the model-string bug needs fixing either way.</w:t>
       </w:r>
     </w:p>
     <w:sectPr>

</xml_diff>